<commit_message>
Trabajando sobre iteracion 3
</commit_message>
<xml_diff>
--- a/docs/calidad/sqa/EC-SQA-PLN_plan_sqa.docx
+++ b/docs/calidad/sqa/EC-SQA-PLN_plan_sqa.docx
@@ -297,8 +297,6 @@
               <w:widowControl w:val="false"/>
               <w:spacing w:before="120" w:after="120"/>
               <w:rPr>
-                <w:b/>
-                <w:bCs/>
                 <w:sz w:val="22"/>
                 <w:szCs w:val="22"/>
               </w:rPr>
@@ -442,6 +440,7 @@
                 <w:sz w:val="22"/>
                 <w:szCs w:val="22"/>
               </w:rPr>
+              <w:t>1.1</w:t>
             </w:r>
           </w:p>
         </w:tc>
@@ -471,6 +470,7 @@
                 <w:sz w:val="22"/>
                 <w:szCs w:val="22"/>
               </w:rPr>
+              <w:t>08/06/2026</w:t>
             </w:r>
           </w:p>
         </w:tc>
@@ -500,6 +500,7 @@
                 <w:sz w:val="22"/>
                 <w:szCs w:val="22"/>
               </w:rPr>
+              <w:t>G. Gargaglione</w:t>
             </w:r>
           </w:p>
         </w:tc>
@@ -534,6 +535,7 @@
                 <w:sz w:val="22"/>
                 <w:szCs w:val="22"/>
               </w:rPr>
+              <w:t>Incorporación del EC-DIS (Modelado de Casos de Uso)</w:t>
             </w:r>
           </w:p>
         </w:tc>
@@ -1059,6 +1061,7 @@
             <w:rPr>
               <w:webHidden/>
               <w:rStyle w:val="Enlacedelndice"/>
+              <w:vanish w:val="false"/>
             </w:rPr>
             <w:instrText xml:space="preserve"> TOC \z \o "1-3" \u \h</w:instrText>
           </w:r>
@@ -1066,6 +1069,7 @@
             <w:rPr>
               <w:webHidden/>
               <w:rStyle w:val="Enlacedelndice"/>
+              <w:vanish w:val="false"/>
             </w:rPr>
             <w:fldChar w:fldCharType="separate"/>
           </w:r>
@@ -1074,6 +1078,7 @@
               <w:rPr>
                 <w:webHidden/>
                 <w:rStyle w:val="Enlacedelndice"/>
+                <w:vanish w:val="false"/>
               </w:rPr>
               <w:t>Control de versiones del documento</w:t>
               <w:tab/>
@@ -1095,6 +1100,7 @@
               <w:rPr>
                 <w:webHidden/>
                 <w:rStyle w:val="Enlacedelndice"/>
+                <w:vanish w:val="false"/>
               </w:rPr>
               <w:t>1. MARCO GENERAL</w:t>
               <w:tab/>
@@ -1116,6 +1122,7 @@
               <w:rPr>
                 <w:webHidden/>
                 <w:rStyle w:val="Enlacedelndice"/>
+                <w:vanish w:val="false"/>
               </w:rPr>
               <w:t>1.1 Propósito</w:t>
               <w:tab/>
@@ -1137,6 +1144,7 @@
               <w:rPr>
                 <w:webHidden/>
                 <w:rStyle w:val="Enlacedelndice"/>
+                <w:vanish w:val="false"/>
               </w:rPr>
               <w:t>1.2 Alcance</w:t>
               <w:tab/>
@@ -1158,6 +1166,7 @@
               <w:rPr>
                 <w:webHidden/>
                 <w:rStyle w:val="Enlacedelndice"/>
+                <w:vanish w:val="false"/>
               </w:rPr>
               <w:t>1.3 Ciclo de vida cubierto</w:t>
               <w:tab/>
@@ -1179,6 +1188,7 @@
               <w:rPr>
                 <w:webHidden/>
                 <w:rStyle w:val="Enlacedelndice"/>
+                <w:vanish w:val="false"/>
               </w:rPr>
               <w:t>2. ORGANIZACIÓN Y ACTIVIDADES</w:t>
               <w:tab/>
@@ -1200,6 +1210,7 @@
               <w:rPr>
                 <w:webHidden/>
                 <w:rStyle w:val="Enlacedelndice"/>
+                <w:vanish w:val="false"/>
               </w:rPr>
               <w:t>2.1 Organización del equipo</w:t>
               <w:tab/>
@@ -1221,6 +1232,7 @@
               <w:rPr>
                 <w:webHidden/>
                 <w:rStyle w:val="Enlacedelndice"/>
+                <w:vanish w:val="false"/>
               </w:rPr>
               <w:t>2.2 Actividades de calidad</w:t>
               <w:tab/>
@@ -1242,6 +1254,7 @@
               <w:rPr>
                 <w:webHidden/>
                 <w:rStyle w:val="Enlacedelndice"/>
+                <w:vanish w:val="false"/>
               </w:rPr>
               <w:t>2.3 Responsables</w:t>
               <w:tab/>
@@ -1263,6 +1276,7 @@
               <w:rPr>
                 <w:webHidden/>
                 <w:rStyle w:val="Enlacedelndice"/>
+                <w:vanish w:val="false"/>
               </w:rPr>
               <w:t>3. DOCUMENTACIÓN</w:t>
               <w:tab/>
@@ -1284,6 +1298,7 @@
               <w:rPr>
                 <w:webHidden/>
                 <w:rStyle w:val="Enlacedelndice"/>
+                <w:vanish w:val="false"/>
               </w:rPr>
               <w:t>3.1 Documentación mínima requerida</w:t>
               <w:tab/>
@@ -1305,6 +1320,7 @@
               <w:rPr>
                 <w:webHidden/>
                 <w:rStyle w:val="Enlacedelndice"/>
+                <w:vanish w:val="false"/>
               </w:rPr>
               <w:t>3.2 Criterios de calidad por documento</w:t>
               <w:tab/>
@@ -1326,6 +1342,7 @@
               <w:rPr>
                 <w:webHidden/>
                 <w:rStyle w:val="Enlacedelndice"/>
+                <w:vanish w:val="false"/>
               </w:rPr>
               <w:t>4. GESTIÓN DE CONFIGURACIÓN</w:t>
               <w:tab/>
@@ -1347,6 +1364,7 @@
               <w:rPr>
                 <w:webHidden/>
                 <w:rStyle w:val="Enlacedelndice"/>
+                <w:vanish w:val="false"/>
               </w:rPr>
               <w:t>4.1 Resumen</w:t>
               <w:tab/>
@@ -1368,6 +1386,7 @@
               <w:rPr>
                 <w:webHidden/>
                 <w:rStyle w:val="Enlacedelndice"/>
+                <w:vanish w:val="false"/>
               </w:rPr>
               <w:t>4.2 Organización y responsabilidades</w:t>
               <w:tab/>
@@ -1389,6 +1408,7 @@
               <w:rPr>
                 <w:webHidden/>
                 <w:rStyle w:val="Enlacedelndice"/>
+                <w:vanish w:val="false"/>
               </w:rPr>
               <w:t>4.3 Auditorías</w:t>
               <w:tab/>
@@ -1410,6 +1430,7 @@
               <w:rPr>
                 <w:webHidden/>
                 <w:rStyle w:val="Enlacedelndice"/>
+                <w:vanish w:val="false"/>
               </w:rPr>
               <w:t>5. ESTÁNDARES, PRÁCTICAS Y MÉTRICAS</w:t>
               <w:tab/>
@@ -1431,6 +1452,7 @@
               <w:rPr>
                 <w:webHidden/>
                 <w:rStyle w:val="Enlacedelndice"/>
+                <w:vanish w:val="false"/>
               </w:rPr>
               <w:t>5.1 Estándares adoptados</w:t>
               <w:tab/>
@@ -1452,6 +1474,7 @@
               <w:rPr>
                 <w:webHidden/>
                 <w:rStyle w:val="Enlacedelndice"/>
+                <w:vanish w:val="false"/>
               </w:rPr>
               <w:t>5.2 Métricas de proceso</w:t>
               <w:tab/>
@@ -1473,6 +1496,7 @@
               <w:rPr>
                 <w:webHidden/>
                 <w:rStyle w:val="Enlacedelndice"/>
+                <w:vanish w:val="false"/>
               </w:rPr>
               <w:t>5.2 Métricas de producto</w:t>
               <w:tab/>
@@ -1494,6 +1518,7 @@
               <w:rPr>
                 <w:webHidden/>
                 <w:rStyle w:val="Enlacedelndice"/>
+                <w:vanish w:val="false"/>
               </w:rPr>
               <w:t>6. VERIFICACIÓN Y CONTROL</w:t>
               <w:tab/>
@@ -1515,6 +1540,7 @@
               <w:rPr>
                 <w:webHidden/>
                 <w:rStyle w:val="Enlacedelndice"/>
+                <w:vanish w:val="false"/>
               </w:rPr>
               <w:t>6.1 Revisión de requerimientos</w:t>
               <w:tab/>
@@ -1536,6 +1562,7 @@
               <w:rPr>
                 <w:webHidden/>
                 <w:rStyle w:val="Enlacedelndice"/>
+                <w:vanish w:val="false"/>
               </w:rPr>
               <w:t>6.2 Revisión Técnica Formal (RTF)</w:t>
               <w:tab/>
@@ -1557,6 +1584,7 @@
               <w:rPr>
                 <w:webHidden/>
                 <w:rStyle w:val="Enlacedelndice"/>
+                <w:vanish w:val="false"/>
               </w:rPr>
               <w:t>6.3 Auditoría Funcional (FCA)</w:t>
               <w:tab/>
@@ -1578,6 +1606,7 @@
               <w:rPr>
                 <w:webHidden/>
                 <w:rStyle w:val="Enlacedelndice"/>
+                <w:vanish w:val="false"/>
               </w:rPr>
               <w:t>6.4 Auditoría Física (PCA)</w:t>
               <w:tab/>
@@ -1599,6 +1628,7 @@
               <w:rPr>
                 <w:webHidden/>
                 <w:rStyle w:val="Enlacedelndice"/>
+                <w:vanish w:val="false"/>
               </w:rPr>
               <w:t>6.5 Informe Final de SQA</w:t>
               <w:tab/>
@@ -1620,6 +1650,7 @@
               <w:rPr>
                 <w:webHidden/>
                 <w:rStyle w:val="Enlacedelndice"/>
+                <w:vanish w:val="false"/>
               </w:rPr>
               <w:t>7. REPORTE DE PROBLEMAS Y ACCIONES CORRECTIVAS</w:t>
               <w:tab/>
@@ -1641,6 +1672,7 @@
               <w:rPr>
                 <w:webHidden/>
                 <w:rStyle w:val="Enlacedelndice"/>
+                <w:vanish w:val="false"/>
               </w:rPr>
               <w:t>8. REPORTE DE PROBLEMAS Y ACCIONES CORRECTIVAS</w:t>
               <w:tab/>
@@ -1662,6 +1694,7 @@
               <w:rPr>
                 <w:webHidden/>
                 <w:rStyle w:val="Enlacedelndice"/>
+                <w:vanish w:val="false"/>
               </w:rPr>
               <w:t>9. GESTIÓN DE RIESGOS</w:t>
               <w:tab/>
@@ -1683,6 +1716,7 @@
               <w:rPr>
                 <w:webHidden/>
                 <w:rStyle w:val="Enlacedelndice"/>
+                <w:vanish w:val="false"/>
               </w:rPr>
               <w:t>10. MATRIZ DE TRAZABILIDAD</w:t>
               <w:tab/>
@@ -1692,6 +1726,7 @@
           <w:r>
             <w:rPr>
               <w:rStyle w:val="Enlacedelndice"/>
+              <w:vanish w:val="false"/>
             </w:rPr>
             <w:fldChar w:fldCharType="end"/>
           </w:r>
@@ -2380,7 +2415,7 @@
       </w:tblPr>
       <w:tblGrid>
         <w:gridCol w:w="3300"/>
-        <w:gridCol w:w="2145"/>
+        <w:gridCol w:w="2144"/>
       </w:tblGrid>
       <w:tr>
         <w:trPr>
@@ -2423,7 +2458,7 @@
         </w:tc>
         <w:tc>
           <w:tcPr>
-            <w:tcW w:w="2145" w:type="dxa"/>
+            <w:tcW w:w="2144" w:type="dxa"/>
             <w:tcBorders>
               <w:top w:val="single" w:sz="6" w:space="0" w:color="7F7F7F"/>
               <w:left w:val="single" w:sz="6" w:space="0" w:color="7F7F7F"/>
@@ -2494,7 +2529,7 @@
         </w:tc>
         <w:tc>
           <w:tcPr>
-            <w:tcW w:w="2145" w:type="dxa"/>
+            <w:tcW w:w="2144" w:type="dxa"/>
             <w:tcBorders>
               <w:top w:val="single" w:sz="6" w:space="0" w:color="7F7F7F"/>
               <w:left w:val="single" w:sz="6" w:space="0" w:color="7F7F7F"/>
@@ -2561,7 +2596,7 @@
         </w:tc>
         <w:tc>
           <w:tcPr>
-            <w:tcW w:w="2145" w:type="dxa"/>
+            <w:tcW w:w="2144" w:type="dxa"/>
             <w:tcBorders>
               <w:top w:val="single" w:sz="6" w:space="0" w:color="7F7F7F"/>
               <w:left w:val="single" w:sz="6" w:space="0" w:color="7F7F7F"/>
@@ -2628,7 +2663,7 @@
         </w:tc>
         <w:tc>
           <w:tcPr>
-            <w:tcW w:w="2145" w:type="dxa"/>
+            <w:tcW w:w="2144" w:type="dxa"/>
             <w:tcBorders>
               <w:top w:val="single" w:sz="6" w:space="0" w:color="7F7F7F"/>
               <w:left w:val="single" w:sz="6" w:space="0" w:color="7F7F7F"/>
@@ -2694,7 +2729,7 @@
         </w:tc>
         <w:tc>
           <w:tcPr>
-            <w:tcW w:w="2145" w:type="dxa"/>
+            <w:tcW w:w="2144" w:type="dxa"/>
             <w:tcBorders>
               <w:left w:val="single" w:sz="6" w:space="0" w:color="7F7F7F"/>
               <w:bottom w:val="single" w:sz="6" w:space="0" w:color="7F7F7F"/>
@@ -2759,7 +2794,7 @@
         </w:tc>
         <w:tc>
           <w:tcPr>
-            <w:tcW w:w="2145" w:type="dxa"/>
+            <w:tcW w:w="2144" w:type="dxa"/>
             <w:tcBorders>
               <w:left w:val="single" w:sz="6" w:space="0" w:color="7F7F7F"/>
               <w:bottom w:val="single" w:sz="6" w:space="0" w:color="7F7F7F"/>
@@ -2800,7 +2835,12 @@
         </w:rPr>
       </w:pPr>
       <w:r>
-        <w:rPr/>
+        <w:rPr>
+          <w:rFonts w:cs="Calibri" w:cstheme="majorHAnsi"/>
+          <w:sz w:val="22"/>
+          <w:szCs w:val="22"/>
+          <w:lang w:val="es-AR"/>
+        </w:rPr>
       </w:r>
     </w:p>
     <w:p>
@@ -2815,7 +2855,12 @@
         </w:rPr>
       </w:pPr>
       <w:r>
-        <w:rPr/>
+        <w:rPr>
+          <w:rFonts w:cs="Calibri" w:cstheme="majorHAnsi"/>
+          <w:sz w:val="22"/>
+          <w:szCs w:val="22"/>
+          <w:lang w:val="es-AR"/>
+        </w:rPr>
       </w:r>
     </w:p>
     <w:p>
@@ -2830,7 +2875,12 @@
         </w:rPr>
       </w:pPr>
       <w:r>
-        <w:rPr/>
+        <w:rPr>
+          <w:rFonts w:cs="Calibri" w:cstheme="majorHAnsi"/>
+          <w:sz w:val="22"/>
+          <w:szCs w:val="22"/>
+          <w:lang w:val="es-AR"/>
+        </w:rPr>
       </w:r>
     </w:p>
     <w:p>
@@ -2845,7 +2895,12 @@
         </w:rPr>
       </w:pPr>
       <w:r>
-        <w:rPr/>
+        <w:rPr>
+          <w:rFonts w:cs="Calibri" w:cstheme="majorHAnsi"/>
+          <w:sz w:val="22"/>
+          <w:szCs w:val="22"/>
+          <w:lang w:val="es-AR"/>
+        </w:rPr>
       </w:r>
     </w:p>
     <w:p>
@@ -2860,7 +2915,12 @@
         </w:rPr>
       </w:pPr>
       <w:r>
-        <w:rPr/>
+        <w:rPr>
+          <w:rFonts w:cs="Calibri" w:cstheme="majorHAnsi"/>
+          <w:sz w:val="22"/>
+          <w:szCs w:val="22"/>
+          <w:lang w:val="es-AR"/>
+        </w:rPr>
       </w:r>
     </w:p>
     <w:p>
@@ -2875,7 +2935,12 @@
         </w:rPr>
       </w:pPr>
       <w:r>
-        <w:rPr/>
+        <w:rPr>
+          <w:rFonts w:cs="Calibri" w:cstheme="majorHAnsi"/>
+          <w:sz w:val="22"/>
+          <w:szCs w:val="22"/>
+          <w:lang w:val="es-AR"/>
+        </w:rPr>
       </w:r>
     </w:p>
     <w:p>
@@ -2890,7 +2955,12 @@
         </w:rPr>
       </w:pPr>
       <w:r>
-        <w:rPr/>
+        <w:rPr>
+          <w:rFonts w:cs="Calibri" w:cstheme="majorHAnsi"/>
+          <w:sz w:val="22"/>
+          <w:szCs w:val="22"/>
+          <w:lang w:val="es-AR"/>
+        </w:rPr>
       </w:r>
     </w:p>
     <w:p>
@@ -2905,7 +2975,52 @@
         </w:rPr>
       </w:pPr>
       <w:r>
-        <w:rPr/>
+        <w:rPr>
+          <w:rFonts w:cs="Calibri" w:cstheme="majorHAnsi"/>
+          <w:sz w:val="22"/>
+          <w:szCs w:val="22"/>
+          <w:lang w:val="es-AR"/>
+        </w:rPr>
+      </w:r>
+    </w:p>
+    <w:p>
+      <w:pPr>
+        <w:pStyle w:val="Normal"/>
+        <w:spacing w:before="360" w:after="120"/>
+        <w:rPr>
+          <w:rFonts w:ascii="Calibri" w:hAnsi="Calibri" w:cs="Calibri" w:asciiTheme="majorHAnsi" w:cstheme="majorHAnsi" w:hAnsiTheme="majorHAnsi"/>
+          <w:sz w:val="22"/>
+          <w:szCs w:val="22"/>
+          <w:lang w:val="es-AR"/>
+        </w:rPr>
+      </w:pPr>
+      <w:r>
+        <w:rPr>
+          <w:rFonts w:cs="Calibri" w:cstheme="majorHAnsi"/>
+          <w:sz w:val="22"/>
+          <w:szCs w:val="22"/>
+          <w:lang w:val="es-AR"/>
+        </w:rPr>
+      </w:r>
+    </w:p>
+    <w:p>
+      <w:pPr>
+        <w:pStyle w:val="Normal"/>
+        <w:spacing w:before="360" w:after="120"/>
+        <w:rPr>
+          <w:rFonts w:ascii="Calibri" w:hAnsi="Calibri" w:cs="Calibri" w:asciiTheme="majorHAnsi" w:cstheme="majorHAnsi" w:hAnsiTheme="majorHAnsi"/>
+          <w:sz w:val="22"/>
+          <w:szCs w:val="22"/>
+          <w:lang w:val="es-AR"/>
+        </w:rPr>
+      </w:pPr>
+      <w:r>
+        <w:rPr>
+          <w:rFonts w:cs="Calibri" w:cstheme="majorHAnsi"/>
+          <w:sz w:val="22"/>
+          <w:szCs w:val="22"/>
+          <w:lang w:val="es-AR"/>
+        </w:rPr>
       </w:r>
     </w:p>
     <w:p>
@@ -2986,9 +3101,9 @@
         <w:tblLook w:firstRow="0" w:noVBand="1" w:lastRow="0" w:firstColumn="0" w:lastColumn="0" w:noHBand="1" w:val="0600"/>
       </w:tblPr>
       <w:tblGrid>
-        <w:gridCol w:w="2367"/>
-        <w:gridCol w:w="1540"/>
-        <w:gridCol w:w="5393"/>
+        <w:gridCol w:w="2365"/>
+        <w:gridCol w:w="1541"/>
+        <w:gridCol w:w="5394"/>
       </w:tblGrid>
       <w:tr>
         <w:trPr>
@@ -2997,7 +3112,7 @@
         </w:trPr>
         <w:tc>
           <w:tcPr>
-            <w:tcW w:w="2367" w:type="dxa"/>
+            <w:tcW w:w="2365" w:type="dxa"/>
             <w:tcBorders>
               <w:top w:val="single" w:sz="6" w:space="0" w:color="7F7F7F"/>
               <w:left w:val="single" w:sz="6" w:space="0" w:color="7F7F7F"/>
@@ -3026,7 +3141,7 @@
         </w:tc>
         <w:tc>
           <w:tcPr>
-            <w:tcW w:w="1540" w:type="dxa"/>
+            <w:tcW w:w="1541" w:type="dxa"/>
             <w:tcBorders>
               <w:top w:val="single" w:sz="6" w:space="0" w:color="7F7F7F"/>
               <w:left w:val="single" w:sz="6" w:space="0" w:color="7F7F7F"/>
@@ -3048,22 +3163,13 @@
                 <w:sz w:val="22"/>
                 <w:szCs w:val="22"/>
               </w:rPr>
-              <w:t>E</w:t>
-            </w:r>
-            <w:r>
-              <w:rPr>
-                <w:b/>
-                <w:bCs/>
-                <w:sz w:val="22"/>
-                <w:szCs w:val="22"/>
-              </w:rPr>
-              <w:t>C</w:t>
-            </w:r>
-          </w:p>
-        </w:tc>
-        <w:tc>
-          <w:tcPr>
-            <w:tcW w:w="5393" w:type="dxa"/>
+              <w:t>EC</w:t>
+            </w:r>
+          </w:p>
+        </w:tc>
+        <w:tc>
+          <w:tcPr>
+            <w:tcW w:w="5394" w:type="dxa"/>
             <w:tcBorders>
               <w:top w:val="single" w:sz="6" w:space="0" w:color="7F7F7F"/>
               <w:left w:val="single" w:sz="6" w:space="0" w:color="7F7F7F"/>
@@ -3100,7 +3206,7 @@
         <w:trPr/>
         <w:tc>
           <w:tcPr>
-            <w:tcW w:w="2367" w:type="dxa"/>
+            <w:tcW w:w="2365" w:type="dxa"/>
             <w:tcBorders>
               <w:top w:val="single" w:sz="6" w:space="0" w:color="7F7F7F"/>
               <w:left w:val="single" w:sz="6" w:space="0" w:color="7F7F7F"/>
@@ -3129,7 +3235,7 @@
         </w:tc>
         <w:tc>
           <w:tcPr>
-            <w:tcW w:w="1540" w:type="dxa"/>
+            <w:tcW w:w="1541" w:type="dxa"/>
             <w:tcBorders>
               <w:top w:val="single" w:sz="6" w:space="0" w:color="7F7F7F"/>
               <w:left w:val="single" w:sz="6" w:space="0" w:color="7F7F7F"/>
@@ -3155,7 +3261,7 @@
         </w:tc>
         <w:tc>
           <w:tcPr>
-            <w:tcW w:w="5393" w:type="dxa"/>
+            <w:tcW w:w="5394" w:type="dxa"/>
             <w:tcBorders>
               <w:top w:val="single" w:sz="6" w:space="0" w:color="7F7F7F"/>
               <w:left w:val="single" w:sz="6" w:space="0" w:color="7F7F7F"/>
@@ -3188,7 +3294,7 @@
         <w:trPr/>
         <w:tc>
           <w:tcPr>
-            <w:tcW w:w="2367" w:type="dxa"/>
+            <w:tcW w:w="2365" w:type="dxa"/>
             <w:tcBorders>
               <w:top w:val="single" w:sz="6" w:space="0" w:color="7F7F7F"/>
               <w:left w:val="single" w:sz="6" w:space="0" w:color="7F7F7F"/>
@@ -3217,7 +3323,7 @@
         </w:tc>
         <w:tc>
           <w:tcPr>
-            <w:tcW w:w="1540" w:type="dxa"/>
+            <w:tcW w:w="1541" w:type="dxa"/>
             <w:tcBorders>
               <w:top w:val="single" w:sz="6" w:space="0" w:color="7F7F7F"/>
               <w:left w:val="single" w:sz="6" w:space="0" w:color="7F7F7F"/>
@@ -3243,7 +3349,7 @@
         </w:tc>
         <w:tc>
           <w:tcPr>
-            <w:tcW w:w="5393" w:type="dxa"/>
+            <w:tcW w:w="5394" w:type="dxa"/>
             <w:tcBorders>
               <w:top w:val="single" w:sz="6" w:space="0" w:color="7F7F7F"/>
               <w:left w:val="single" w:sz="6" w:space="0" w:color="7F7F7F"/>
@@ -3276,7 +3382,7 @@
         <w:trPr/>
         <w:tc>
           <w:tcPr>
-            <w:tcW w:w="2367" w:type="dxa"/>
+            <w:tcW w:w="2365" w:type="dxa"/>
             <w:tcBorders>
               <w:top w:val="single" w:sz="6" w:space="0" w:color="7F7F7F"/>
               <w:left w:val="single" w:sz="6" w:space="0" w:color="7F7F7F"/>
@@ -3305,7 +3411,7 @@
         </w:tc>
         <w:tc>
           <w:tcPr>
-            <w:tcW w:w="1540" w:type="dxa"/>
+            <w:tcW w:w="1541" w:type="dxa"/>
             <w:tcBorders>
               <w:top w:val="single" w:sz="6" w:space="0" w:color="7F7F7F"/>
               <w:left w:val="single" w:sz="6" w:space="0" w:color="7F7F7F"/>
@@ -3331,7 +3437,7 @@
         </w:tc>
         <w:tc>
           <w:tcPr>
-            <w:tcW w:w="5393" w:type="dxa"/>
+            <w:tcW w:w="5394" w:type="dxa"/>
             <w:tcBorders>
               <w:top w:val="single" w:sz="6" w:space="0" w:color="7F7F7F"/>
               <w:left w:val="single" w:sz="6" w:space="0" w:color="7F7F7F"/>
@@ -3364,7 +3470,7 @@
         <w:trPr/>
         <w:tc>
           <w:tcPr>
-            <w:tcW w:w="2367" w:type="dxa"/>
+            <w:tcW w:w="2365" w:type="dxa"/>
             <w:tcBorders>
               <w:left w:val="single" w:sz="6" w:space="0" w:color="7F7F7F"/>
               <w:bottom w:val="single" w:sz="6" w:space="0" w:color="7F7F7F"/>
@@ -3386,13 +3492,13 @@
                 <w:sz w:val="22"/>
                 <w:szCs w:val="22"/>
               </w:rPr>
-              <w:t>Planificación</w:t>
-            </w:r>
-          </w:p>
-        </w:tc>
-        <w:tc>
-          <w:tcPr>
-            <w:tcW w:w="1540" w:type="dxa"/>
+              <w:t>Diseño</w:t>
+            </w:r>
+          </w:p>
+        </w:tc>
+        <w:tc>
+          <w:tcPr>
+            <w:tcW w:w="1541" w:type="dxa"/>
             <w:tcBorders>
               <w:left w:val="single" w:sz="6" w:space="0" w:color="7F7F7F"/>
               <w:bottom w:val="single" w:sz="6" w:space="0" w:color="7F7F7F"/>
@@ -3411,36 +3517,36 @@
                 <w:sz w:val="22"/>
                 <w:szCs w:val="22"/>
               </w:rPr>
-              <w:t>EC-PLN</w:t>
-            </w:r>
-          </w:p>
-        </w:tc>
-        <w:tc>
-          <w:tcPr>
-            <w:tcW w:w="5393" w:type="dxa"/>
-            <w:tcBorders>
-              <w:left w:val="single" w:sz="6" w:space="0" w:color="7F7F7F"/>
-              <w:bottom w:val="single" w:sz="6" w:space="0" w:color="7F7F7F"/>
-              <w:right w:val="single" w:sz="6" w:space="0" w:color="7F7F7F"/>
-            </w:tcBorders>
-            <w:shd w:color="auto" w:fill="auto" w:val="clear"/>
-          </w:tcPr>
-          <w:p>
-            <w:pPr>
-              <w:pStyle w:val="Normal"/>
-              <w:widowControl w:val="false"/>
-              <w:spacing w:lineRule="auto" w:line="264" w:before="63" w:after="63"/>
-              <w:rPr>
-                <w:sz w:val="22"/>
-                <w:szCs w:val="22"/>
-              </w:rPr>
-            </w:pPr>
-            <w:r>
-              <w:rPr>
-                <w:sz w:val="22"/>
-                <w:szCs w:val="22"/>
-              </w:rPr>
-              <w:t>Plan de Proyecto</w:t>
+              <w:t>EC-DIS</w:t>
+            </w:r>
+          </w:p>
+        </w:tc>
+        <w:tc>
+          <w:tcPr>
+            <w:tcW w:w="5394" w:type="dxa"/>
+            <w:tcBorders>
+              <w:left w:val="single" w:sz="6" w:space="0" w:color="7F7F7F"/>
+              <w:bottom w:val="single" w:sz="6" w:space="0" w:color="7F7F7F"/>
+              <w:right w:val="single" w:sz="6" w:space="0" w:color="7F7F7F"/>
+            </w:tcBorders>
+            <w:shd w:color="auto" w:fill="auto" w:val="clear"/>
+          </w:tcPr>
+          <w:p>
+            <w:pPr>
+              <w:pStyle w:val="Normal"/>
+              <w:widowControl w:val="false"/>
+              <w:spacing w:lineRule="auto" w:line="264" w:before="63" w:after="63"/>
+              <w:rPr>
+                <w:sz w:val="22"/>
+                <w:szCs w:val="22"/>
+              </w:rPr>
+            </w:pPr>
+            <w:r>
+              <w:rPr>
+                <w:sz w:val="22"/>
+                <w:szCs w:val="22"/>
+              </w:rPr>
+              <w:t>Documento de Diseño (Arquitectura del Sistema)</w:t>
             </w:r>
           </w:p>
         </w:tc>
@@ -3449,28 +3555,27 @@
         <w:trPr/>
         <w:tc>
           <w:tcPr>
-            <w:tcW w:w="2367" w:type="dxa"/>
-            <w:tcBorders>
-              <w:left w:val="single" w:sz="6" w:space="0" w:color="7F7F7F"/>
-              <w:bottom w:val="single" w:sz="6" w:space="0" w:color="7F7F7F"/>
-              <w:right w:val="single" w:sz="6" w:space="0" w:color="7F7F7F"/>
-            </w:tcBorders>
-            <w:shd w:color="auto" w:fill="auto" w:val="clear"/>
-          </w:tcPr>
-          <w:p>
-            <w:pPr>
-              <w:pStyle w:val="Normal"/>
-              <w:widowControl w:val="false"/>
-              <w:spacing w:lineRule="auto" w:line="264" w:before="63" w:after="63"/>
+            <w:tcW w:w="2365" w:type="dxa"/>
+            <w:tcBorders>
+              <w:left w:val="single" w:sz="6" w:space="0" w:color="7F7F7F"/>
+              <w:bottom w:val="single" w:sz="6" w:space="0" w:color="7F7F7F"/>
+              <w:right w:val="single" w:sz="6" w:space="0" w:color="7F7F7F"/>
+            </w:tcBorders>
+            <w:shd w:color="auto" w:fill="auto" w:val="clear"/>
+          </w:tcPr>
+          <w:p>
+            <w:pPr>
+              <w:pStyle w:val="Normal"/>
+              <w:widowControl w:val="false"/>
+              <w:spacing w:lineRule="auto" w:line="264" w:before="63" w:after="63"/>
+              <w:rPr/>
+            </w:pPr>
+            <w:r>
               <w:rPr>
                 <w:b/>
                 <w:bCs/>
-              </w:rPr>
-            </w:pPr>
-            <w:r>
-              <w:rPr>
-                <w:b/>
-                <w:bCs/>
+                <w:sz w:val="22"/>
+                <w:szCs w:val="22"/>
               </w:rPr>
               <w:t>Planificación</w:t>
             </w:r>
@@ -3478,58 +3583,55 @@
         </w:tc>
         <w:tc>
           <w:tcPr>
-            <w:tcW w:w="1540" w:type="dxa"/>
-            <w:tcBorders>
-              <w:left w:val="single" w:sz="6" w:space="0" w:color="7F7F7F"/>
-              <w:bottom w:val="single" w:sz="6" w:space="0" w:color="7F7F7F"/>
-            </w:tcBorders>
-            <w:shd w:color="auto" w:fill="auto" w:val="clear"/>
-          </w:tcPr>
-          <w:p>
-            <w:pPr>
-              <w:pStyle w:val="Normal"/>
-              <w:widowControl w:val="false"/>
-              <w:spacing w:lineRule="auto" w:line="264" w:before="63" w:after="63"/>
-              <w:rPr>
-                <w:sz w:val="22"/>
-                <w:szCs w:val="22"/>
-              </w:rPr>
-            </w:pPr>
-            <w:r>
-              <w:rPr>
-                <w:sz w:val="22"/>
-                <w:szCs w:val="22"/>
-              </w:rPr>
-              <w:t>EC-SCM</w:t>
-            </w:r>
-          </w:p>
-        </w:tc>
-        <w:tc>
-          <w:tcPr>
-            <w:tcW w:w="5393" w:type="dxa"/>
-            <w:tcBorders>
-              <w:left w:val="single" w:sz="6" w:space="0" w:color="7F7F7F"/>
-              <w:bottom w:val="single" w:sz="6" w:space="0" w:color="7F7F7F"/>
-              <w:right w:val="single" w:sz="6" w:space="0" w:color="7F7F7F"/>
-            </w:tcBorders>
-            <w:shd w:color="auto" w:fill="auto" w:val="clear"/>
-          </w:tcPr>
-          <w:p>
-            <w:pPr>
-              <w:pStyle w:val="Normal"/>
-              <w:widowControl w:val="false"/>
-              <w:spacing w:lineRule="auto" w:line="264" w:before="63" w:after="63"/>
-              <w:rPr>
-                <w:sz w:val="22"/>
-                <w:szCs w:val="22"/>
-              </w:rPr>
-            </w:pPr>
-            <w:r>
-              <w:rPr>
-                <w:sz w:val="22"/>
-                <w:szCs w:val="22"/>
-              </w:rPr>
-              <w:t>Plan de Gestión de Configuración</w:t>
+            <w:tcW w:w="1541" w:type="dxa"/>
+            <w:tcBorders>
+              <w:left w:val="single" w:sz="6" w:space="0" w:color="7F7F7F"/>
+              <w:bottom w:val="single" w:sz="6" w:space="0" w:color="7F7F7F"/>
+            </w:tcBorders>
+            <w:shd w:color="auto" w:fill="auto" w:val="clear"/>
+          </w:tcPr>
+          <w:p>
+            <w:pPr>
+              <w:pStyle w:val="Normal"/>
+              <w:widowControl w:val="false"/>
+              <w:spacing w:lineRule="auto" w:line="264" w:before="63" w:after="63"/>
+              <w:rPr/>
+            </w:pPr>
+            <w:r>
+              <w:rPr>
+                <w:sz w:val="22"/>
+                <w:szCs w:val="22"/>
+              </w:rPr>
+              <w:t>EC-PLN</w:t>
+            </w:r>
+          </w:p>
+        </w:tc>
+        <w:tc>
+          <w:tcPr>
+            <w:tcW w:w="5394" w:type="dxa"/>
+            <w:tcBorders>
+              <w:left w:val="single" w:sz="6" w:space="0" w:color="7F7F7F"/>
+              <w:bottom w:val="single" w:sz="6" w:space="0" w:color="7F7F7F"/>
+              <w:right w:val="single" w:sz="6" w:space="0" w:color="7F7F7F"/>
+            </w:tcBorders>
+            <w:shd w:color="auto" w:fill="auto" w:val="clear"/>
+          </w:tcPr>
+          <w:p>
+            <w:pPr>
+              <w:pStyle w:val="Normal"/>
+              <w:widowControl w:val="false"/>
+              <w:spacing w:lineRule="auto" w:line="264" w:before="63" w:after="63"/>
+              <w:rPr>
+                <w:sz w:val="22"/>
+                <w:szCs w:val="22"/>
+              </w:rPr>
+            </w:pPr>
+            <w:r>
+              <w:rPr>
+                <w:sz w:val="22"/>
+                <w:szCs w:val="22"/>
+              </w:rPr>
+              <w:t>Plan de Proyecto</w:t>
             </w:r>
           </w:p>
         </w:tc>
@@ -3538,7 +3640,7 @@
         <w:trPr/>
         <w:tc>
           <w:tcPr>
-            <w:tcW w:w="2367" w:type="dxa"/>
+            <w:tcW w:w="2365" w:type="dxa"/>
             <w:tcBorders>
               <w:left w:val="single" w:sz="6" w:space="0" w:color="7F7F7F"/>
               <w:bottom w:val="single" w:sz="6" w:space="0" w:color="7F7F7F"/>
@@ -3567,58 +3669,58 @@
         </w:tc>
         <w:tc>
           <w:tcPr>
-            <w:tcW w:w="1540" w:type="dxa"/>
-            <w:tcBorders>
-              <w:left w:val="single" w:sz="6" w:space="0" w:color="7F7F7F"/>
-              <w:bottom w:val="single" w:sz="6" w:space="0" w:color="7F7F7F"/>
-            </w:tcBorders>
-            <w:shd w:color="auto" w:fill="auto" w:val="clear"/>
-          </w:tcPr>
-          <w:p>
-            <w:pPr>
-              <w:pStyle w:val="Normal"/>
-              <w:widowControl w:val="false"/>
-              <w:spacing w:lineRule="auto" w:line="264" w:before="63" w:after="63"/>
-              <w:rPr>
-                <w:sz w:val="22"/>
-                <w:szCs w:val="22"/>
-              </w:rPr>
-            </w:pPr>
-            <w:r>
-              <w:rPr>
-                <w:sz w:val="22"/>
-                <w:szCs w:val="22"/>
-              </w:rPr>
-              <w:t>EC-RSG</w:t>
-            </w:r>
-          </w:p>
-        </w:tc>
-        <w:tc>
-          <w:tcPr>
-            <w:tcW w:w="5393" w:type="dxa"/>
-            <w:tcBorders>
-              <w:left w:val="single" w:sz="6" w:space="0" w:color="7F7F7F"/>
-              <w:bottom w:val="single" w:sz="6" w:space="0" w:color="7F7F7F"/>
-              <w:right w:val="single" w:sz="6" w:space="0" w:color="7F7F7F"/>
-            </w:tcBorders>
-            <w:shd w:color="auto" w:fill="auto" w:val="clear"/>
-          </w:tcPr>
-          <w:p>
-            <w:pPr>
-              <w:pStyle w:val="Normal"/>
-              <w:widowControl w:val="false"/>
-              <w:spacing w:lineRule="auto" w:line="264" w:before="63" w:after="63"/>
-              <w:rPr>
-                <w:sz w:val="22"/>
-                <w:szCs w:val="22"/>
-              </w:rPr>
-            </w:pPr>
-            <w:r>
-              <w:rPr>
-                <w:sz w:val="22"/>
-                <w:szCs w:val="22"/>
-              </w:rPr>
-              <w:t>Plan de Gestión de Riesgos</w:t>
+            <w:tcW w:w="1541" w:type="dxa"/>
+            <w:tcBorders>
+              <w:left w:val="single" w:sz="6" w:space="0" w:color="7F7F7F"/>
+              <w:bottom w:val="single" w:sz="6" w:space="0" w:color="7F7F7F"/>
+            </w:tcBorders>
+            <w:shd w:color="auto" w:fill="auto" w:val="clear"/>
+          </w:tcPr>
+          <w:p>
+            <w:pPr>
+              <w:pStyle w:val="Normal"/>
+              <w:widowControl w:val="false"/>
+              <w:spacing w:lineRule="auto" w:line="264" w:before="63" w:after="63"/>
+              <w:rPr>
+                <w:sz w:val="22"/>
+                <w:szCs w:val="22"/>
+              </w:rPr>
+            </w:pPr>
+            <w:r>
+              <w:rPr>
+                <w:sz w:val="22"/>
+                <w:szCs w:val="22"/>
+              </w:rPr>
+              <w:t>EC-SCM</w:t>
+            </w:r>
+          </w:p>
+        </w:tc>
+        <w:tc>
+          <w:tcPr>
+            <w:tcW w:w="5394" w:type="dxa"/>
+            <w:tcBorders>
+              <w:left w:val="single" w:sz="6" w:space="0" w:color="7F7F7F"/>
+              <w:bottom w:val="single" w:sz="6" w:space="0" w:color="7F7F7F"/>
+              <w:right w:val="single" w:sz="6" w:space="0" w:color="7F7F7F"/>
+            </w:tcBorders>
+            <w:shd w:color="auto" w:fill="auto" w:val="clear"/>
+          </w:tcPr>
+          <w:p>
+            <w:pPr>
+              <w:pStyle w:val="Normal"/>
+              <w:widowControl w:val="false"/>
+              <w:spacing w:lineRule="auto" w:line="264" w:before="63" w:after="63"/>
+              <w:rPr>
+                <w:sz w:val="22"/>
+                <w:szCs w:val="22"/>
+              </w:rPr>
+            </w:pPr>
+            <w:r>
+              <w:rPr>
+                <w:sz w:val="22"/>
+                <w:szCs w:val="22"/>
+              </w:rPr>
+              <w:t>Plan de Gestión de Configuración</w:t>
             </w:r>
           </w:p>
         </w:tc>
@@ -3627,7 +3729,7 @@
         <w:trPr/>
         <w:tc>
           <w:tcPr>
-            <w:tcW w:w="2367" w:type="dxa"/>
+            <w:tcW w:w="2365" w:type="dxa"/>
             <w:tcBorders>
               <w:left w:val="single" w:sz="6" w:space="0" w:color="7F7F7F"/>
               <w:bottom w:val="single" w:sz="6" w:space="0" w:color="7F7F7F"/>
@@ -3643,75 +3745,71 @@
               <w:rPr>
                 <w:b/>
                 <w:bCs/>
-                <w:sz w:val="22"/>
-                <w:szCs w:val="22"/>
               </w:rPr>
             </w:pPr>
             <w:r>
               <w:rPr>
                 <w:b/>
                 <w:bCs/>
-                <w:sz w:val="22"/>
-                <w:szCs w:val="22"/>
-              </w:rPr>
-              <w:t>Estándares</w:t>
-            </w:r>
-          </w:p>
-        </w:tc>
-        <w:tc>
-          <w:tcPr>
-            <w:tcW w:w="1540" w:type="dxa"/>
-            <w:tcBorders>
-              <w:left w:val="single" w:sz="6" w:space="0" w:color="7F7F7F"/>
-              <w:bottom w:val="single" w:sz="6" w:space="0" w:color="7F7F7F"/>
-            </w:tcBorders>
-            <w:shd w:color="auto" w:fill="auto" w:val="clear"/>
-          </w:tcPr>
-          <w:p>
-            <w:pPr>
-              <w:pStyle w:val="Normal"/>
-              <w:widowControl w:val="false"/>
-              <w:spacing w:lineRule="auto" w:line="264" w:before="63" w:after="63"/>
-              <w:rPr>
-                <w:sz w:val="22"/>
-                <w:szCs w:val="22"/>
-              </w:rPr>
-            </w:pPr>
-            <w:r>
-              <w:rPr>
-                <w:sz w:val="22"/>
-                <w:szCs w:val="22"/>
-              </w:rPr>
-              <w:t>EC-STD-DOC</w:t>
-            </w:r>
-          </w:p>
-        </w:tc>
-        <w:tc>
-          <w:tcPr>
-            <w:tcW w:w="5393" w:type="dxa"/>
-            <w:tcBorders>
-              <w:left w:val="single" w:sz="6" w:space="0" w:color="7F7F7F"/>
-              <w:bottom w:val="single" w:sz="6" w:space="0" w:color="7F7F7F"/>
-              <w:right w:val="single" w:sz="6" w:space="0" w:color="7F7F7F"/>
-            </w:tcBorders>
-            <w:shd w:color="auto" w:fill="auto" w:val="clear"/>
-          </w:tcPr>
-          <w:p>
-            <w:pPr>
-              <w:pStyle w:val="Normal"/>
-              <w:widowControl w:val="false"/>
-              <w:spacing w:lineRule="auto" w:line="264" w:before="63" w:after="63"/>
-              <w:rPr>
-                <w:sz w:val="22"/>
-                <w:szCs w:val="22"/>
-              </w:rPr>
-            </w:pPr>
-            <w:r>
-              <w:rPr>
-                <w:sz w:val="22"/>
-                <w:szCs w:val="22"/>
-              </w:rPr>
-              <w:t>Estándar de Documentación</w:t>
+              </w:rPr>
+              <w:t>Planificación</w:t>
+            </w:r>
+          </w:p>
+        </w:tc>
+        <w:tc>
+          <w:tcPr>
+            <w:tcW w:w="1541" w:type="dxa"/>
+            <w:tcBorders>
+              <w:left w:val="single" w:sz="6" w:space="0" w:color="7F7F7F"/>
+              <w:bottom w:val="single" w:sz="6" w:space="0" w:color="7F7F7F"/>
+            </w:tcBorders>
+            <w:shd w:color="auto" w:fill="auto" w:val="clear"/>
+          </w:tcPr>
+          <w:p>
+            <w:pPr>
+              <w:pStyle w:val="Normal"/>
+              <w:widowControl w:val="false"/>
+              <w:spacing w:lineRule="auto" w:line="264" w:before="63" w:after="63"/>
+              <w:rPr>
+                <w:sz w:val="22"/>
+                <w:szCs w:val="22"/>
+              </w:rPr>
+            </w:pPr>
+            <w:r>
+              <w:rPr>
+                <w:sz w:val="22"/>
+                <w:szCs w:val="22"/>
+              </w:rPr>
+              <w:t>EC-RSG</w:t>
+            </w:r>
+          </w:p>
+        </w:tc>
+        <w:tc>
+          <w:tcPr>
+            <w:tcW w:w="5394" w:type="dxa"/>
+            <w:tcBorders>
+              <w:left w:val="single" w:sz="6" w:space="0" w:color="7F7F7F"/>
+              <w:bottom w:val="single" w:sz="6" w:space="0" w:color="7F7F7F"/>
+              <w:right w:val="single" w:sz="6" w:space="0" w:color="7F7F7F"/>
+            </w:tcBorders>
+            <w:shd w:color="auto" w:fill="auto" w:val="clear"/>
+          </w:tcPr>
+          <w:p>
+            <w:pPr>
+              <w:pStyle w:val="Normal"/>
+              <w:widowControl w:val="false"/>
+              <w:spacing w:lineRule="auto" w:line="264" w:before="63" w:after="63"/>
+              <w:rPr>
+                <w:sz w:val="22"/>
+                <w:szCs w:val="22"/>
+              </w:rPr>
+            </w:pPr>
+            <w:r>
+              <w:rPr>
+                <w:sz w:val="22"/>
+                <w:szCs w:val="22"/>
+              </w:rPr>
+              <w:t>Plan de Gestión de Riesgos</w:t>
             </w:r>
           </w:p>
         </w:tc>
@@ -3720,7 +3818,7 @@
         <w:trPr/>
         <w:tc>
           <w:tcPr>
-            <w:tcW w:w="2367" w:type="dxa"/>
+            <w:tcW w:w="2365" w:type="dxa"/>
             <w:tcBorders>
               <w:left w:val="single" w:sz="6" w:space="0" w:color="7F7F7F"/>
               <w:bottom w:val="single" w:sz="6" w:space="0" w:color="7F7F7F"/>
@@ -3736,75 +3834,68 @@
               <w:rPr>
                 <w:b/>
                 <w:bCs/>
-                <w:sz w:val="22"/>
-                <w:szCs w:val="22"/>
               </w:rPr>
             </w:pPr>
             <w:r>
               <w:rPr>
                 <w:b/>
                 <w:bCs/>
-                <w:sz w:val="22"/>
-                <w:szCs w:val="22"/>
-              </w:rPr>
-              <w:t>Estándares</w:t>
-            </w:r>
-          </w:p>
-        </w:tc>
-        <w:tc>
-          <w:tcPr>
-            <w:tcW w:w="1540" w:type="dxa"/>
-            <w:tcBorders>
-              <w:left w:val="single" w:sz="6" w:space="0" w:color="7F7F7F"/>
-              <w:bottom w:val="single" w:sz="6" w:space="0" w:color="7F7F7F"/>
-            </w:tcBorders>
-            <w:shd w:color="auto" w:fill="auto" w:val="clear"/>
-          </w:tcPr>
-          <w:p>
-            <w:pPr>
-              <w:pStyle w:val="Normal"/>
-              <w:widowControl w:val="false"/>
-              <w:spacing w:lineRule="auto" w:line="264" w:before="63" w:after="63"/>
-              <w:rPr>
-                <w:sz w:val="22"/>
-                <w:szCs w:val="22"/>
-              </w:rPr>
-            </w:pPr>
-            <w:r>
-              <w:rPr>
-                <w:sz w:val="22"/>
-                <w:szCs w:val="22"/>
-              </w:rPr>
-              <w:t>EC-STD-PHP</w:t>
-            </w:r>
-          </w:p>
-        </w:tc>
-        <w:tc>
-          <w:tcPr>
-            <w:tcW w:w="5393" w:type="dxa"/>
-            <w:tcBorders>
-              <w:left w:val="single" w:sz="6" w:space="0" w:color="7F7F7F"/>
-              <w:bottom w:val="single" w:sz="6" w:space="0" w:color="7F7F7F"/>
-              <w:right w:val="single" w:sz="6" w:space="0" w:color="7F7F7F"/>
-            </w:tcBorders>
-            <w:shd w:color="auto" w:fill="auto" w:val="clear"/>
-          </w:tcPr>
-          <w:p>
-            <w:pPr>
-              <w:pStyle w:val="Normal"/>
-              <w:widowControl w:val="false"/>
-              <w:spacing w:lineRule="auto" w:line="264" w:before="63" w:after="63"/>
-              <w:rPr>
-                <w:sz w:val="22"/>
-                <w:szCs w:val="22"/>
-              </w:rPr>
-            </w:pPr>
-            <w:r>
-              <w:rPr>
-                <w:sz w:val="22"/>
-                <w:szCs w:val="22"/>
-              </w:rPr>
-              <w:t>Estándar de Programación PHP</w:t>
+              </w:rPr>
+              <w:t>Planificación</w:t>
+            </w:r>
+          </w:p>
+        </w:tc>
+        <w:tc>
+          <w:tcPr>
+            <w:tcW w:w="1541" w:type="dxa"/>
+            <w:tcBorders>
+              <w:left w:val="single" w:sz="6" w:space="0" w:color="7F7F7F"/>
+              <w:bottom w:val="single" w:sz="6" w:space="0" w:color="7F7F7F"/>
+            </w:tcBorders>
+            <w:shd w:color="auto" w:fill="auto" w:val="clear"/>
+          </w:tcPr>
+          <w:p>
+            <w:pPr>
+              <w:pStyle w:val="Normal"/>
+              <w:widowControl w:val="false"/>
+              <w:spacing w:lineRule="auto" w:line="264" w:before="63" w:after="63"/>
+              <w:rPr>
+                <w:sz w:val="22"/>
+                <w:szCs w:val="22"/>
+              </w:rPr>
+            </w:pPr>
+            <w:r>
+              <w:rPr/>
+              <w:t>EC-RSG-ANL</w:t>
+            </w:r>
+          </w:p>
+        </w:tc>
+        <w:tc>
+          <w:tcPr>
+            <w:tcW w:w="5394" w:type="dxa"/>
+            <w:tcBorders>
+              <w:left w:val="single" w:sz="6" w:space="0" w:color="7F7F7F"/>
+              <w:bottom w:val="single" w:sz="6" w:space="0" w:color="7F7F7F"/>
+              <w:right w:val="single" w:sz="6" w:space="0" w:color="7F7F7F"/>
+            </w:tcBorders>
+            <w:shd w:color="auto" w:fill="auto" w:val="clear"/>
+          </w:tcPr>
+          <w:p>
+            <w:pPr>
+              <w:pStyle w:val="Normal"/>
+              <w:widowControl w:val="false"/>
+              <w:spacing w:lineRule="auto" w:line="264" w:before="63" w:after="63"/>
+              <w:rPr>
+                <w:sz w:val="22"/>
+                <w:szCs w:val="22"/>
+              </w:rPr>
+            </w:pPr>
+            <w:r>
+              <w:rPr>
+                <w:sz w:val="22"/>
+                <w:szCs w:val="22"/>
+              </w:rPr>
+              <w:t>Identificación y Análisis de Riesgos</w:t>
             </w:r>
           </w:p>
         </w:tc>
@@ -3813,91 +3904,89 @@
         <w:trPr/>
         <w:tc>
           <w:tcPr>
-            <w:tcW w:w="2367" w:type="dxa"/>
-            <w:tcBorders>
-              <w:left w:val="single" w:sz="6" w:space="0" w:color="7F7F7F"/>
-              <w:bottom w:val="single" w:sz="6" w:space="0" w:color="7F7F7F"/>
-              <w:right w:val="single" w:sz="6" w:space="0" w:color="7F7F7F"/>
-            </w:tcBorders>
-            <w:shd w:color="auto" w:fill="auto" w:val="clear"/>
-          </w:tcPr>
-          <w:p>
-            <w:pPr>
-              <w:pStyle w:val="Normal"/>
-              <w:widowControl w:val="false"/>
-              <w:spacing w:lineRule="auto" w:line="264" w:before="63" w:after="63"/>
+            <w:tcW w:w="2365" w:type="dxa"/>
+            <w:tcBorders>
+              <w:left w:val="single" w:sz="6" w:space="0" w:color="7F7F7F"/>
+              <w:bottom w:val="single" w:sz="6" w:space="0" w:color="7F7F7F"/>
+              <w:right w:val="single" w:sz="6" w:space="0" w:color="7F7F7F"/>
+            </w:tcBorders>
+            <w:shd w:color="auto" w:fill="auto" w:val="clear"/>
+          </w:tcPr>
+          <w:p>
+            <w:pPr>
+              <w:pStyle w:val="Normal"/>
+              <w:widowControl w:val="false"/>
+              <w:spacing w:lineRule="auto" w:line="264" w:before="63" w:after="63"/>
+              <w:rPr>
+                <w:sz w:val="24"/>
+                <w:szCs w:val="24"/>
+              </w:rPr>
+            </w:pPr>
+            <w:r>
               <w:rPr>
                 <w:b/>
                 <w:bCs/>
-                <w:sz w:val="22"/>
-                <w:szCs w:val="22"/>
-              </w:rPr>
-            </w:pPr>
-            <w:r>
-              <w:rPr>
-                <w:b/>
-                <w:bCs/>
-                <w:sz w:val="22"/>
-                <w:szCs w:val="22"/>
-              </w:rPr>
-              <w:t>Calidad</w:t>
-            </w:r>
-          </w:p>
-        </w:tc>
-        <w:tc>
-          <w:tcPr>
-            <w:tcW w:w="1540" w:type="dxa"/>
-            <w:tcBorders>
-              <w:left w:val="single" w:sz="6" w:space="0" w:color="7F7F7F"/>
-              <w:bottom w:val="single" w:sz="6" w:space="0" w:color="7F7F7F"/>
-            </w:tcBorders>
-            <w:shd w:color="auto" w:fill="auto" w:val="clear"/>
-          </w:tcPr>
-          <w:p>
-            <w:pPr>
-              <w:pStyle w:val="Normal"/>
-              <w:widowControl w:val="false"/>
-              <w:spacing w:lineRule="auto" w:line="264" w:before="63" w:after="63"/>
-              <w:rPr>
-                <w:sz w:val="22"/>
-                <w:szCs w:val="22"/>
-              </w:rPr>
-            </w:pPr>
-            <w:r>
-              <w:rPr>
-                <w:sz w:val="22"/>
-                <w:szCs w:val="22"/>
-              </w:rPr>
-              <w:t>EC-SQA-PLN</w:t>
-            </w:r>
-          </w:p>
-        </w:tc>
-        <w:tc>
-          <w:tcPr>
-            <w:tcW w:w="5393" w:type="dxa"/>
-            <w:tcBorders>
-              <w:left w:val="single" w:sz="6" w:space="0" w:color="7F7F7F"/>
-              <w:bottom w:val="single" w:sz="6" w:space="0" w:color="7F7F7F"/>
-              <w:right w:val="single" w:sz="6" w:space="0" w:color="7F7F7F"/>
-            </w:tcBorders>
-            <w:shd w:color="auto" w:fill="auto" w:val="clear"/>
-          </w:tcPr>
-          <w:p>
-            <w:pPr>
-              <w:pStyle w:val="Normal"/>
-              <w:widowControl w:val="false"/>
-              <w:spacing w:lineRule="auto" w:line="264" w:before="63" w:after="63"/>
-              <w:rPr>
-                <w:sz w:val="22"/>
-                <w:szCs w:val="22"/>
-              </w:rPr>
-            </w:pPr>
-            <w:r>
-              <w:rPr>
-                <w:sz w:val="22"/>
-                <w:szCs w:val="22"/>
-              </w:rPr>
-              <w:t>Plan de SQA</w:t>
+                <w:sz w:val="24"/>
+                <w:szCs w:val="24"/>
+              </w:rPr>
+              <w:t>Estándares</w:t>
+            </w:r>
+          </w:p>
+        </w:tc>
+        <w:tc>
+          <w:tcPr>
+            <w:tcW w:w="1541" w:type="dxa"/>
+            <w:tcBorders>
+              <w:left w:val="single" w:sz="6" w:space="0" w:color="7F7F7F"/>
+              <w:bottom w:val="single" w:sz="6" w:space="0" w:color="7F7F7F"/>
+            </w:tcBorders>
+            <w:shd w:color="auto" w:fill="auto" w:val="clear"/>
+          </w:tcPr>
+          <w:p>
+            <w:pPr>
+              <w:pStyle w:val="Normal"/>
+              <w:widowControl w:val="false"/>
+              <w:spacing w:lineRule="auto" w:line="264" w:before="63" w:after="63"/>
+              <w:rPr>
+                <w:sz w:val="22"/>
+                <w:szCs w:val="22"/>
+              </w:rPr>
+            </w:pPr>
+            <w:r>
+              <w:rPr>
+                <w:sz w:val="22"/>
+                <w:szCs w:val="22"/>
+              </w:rPr>
+              <w:t>EC-STD-DOC</w:t>
+            </w:r>
+          </w:p>
+        </w:tc>
+        <w:tc>
+          <w:tcPr>
+            <w:tcW w:w="5394" w:type="dxa"/>
+            <w:tcBorders>
+              <w:left w:val="single" w:sz="6" w:space="0" w:color="7F7F7F"/>
+              <w:bottom w:val="single" w:sz="6" w:space="0" w:color="7F7F7F"/>
+              <w:right w:val="single" w:sz="6" w:space="0" w:color="7F7F7F"/>
+            </w:tcBorders>
+            <w:shd w:color="auto" w:fill="auto" w:val="clear"/>
+          </w:tcPr>
+          <w:p>
+            <w:pPr>
+              <w:pStyle w:val="Normal"/>
+              <w:widowControl w:val="false"/>
+              <w:spacing w:lineRule="auto" w:line="264" w:before="63" w:after="63"/>
+              <w:rPr>
+                <w:sz w:val="22"/>
+                <w:szCs w:val="22"/>
+              </w:rPr>
+            </w:pPr>
+            <w:r>
+              <w:rPr>
+                <w:sz w:val="22"/>
+                <w:szCs w:val="22"/>
+              </w:rPr>
+              <w:t>Estándar de Documentación</w:t>
             </w:r>
           </w:p>
         </w:tc>
@@ -3906,91 +3995,89 @@
         <w:trPr/>
         <w:tc>
           <w:tcPr>
-            <w:tcW w:w="2367" w:type="dxa"/>
-            <w:tcBorders>
-              <w:left w:val="single" w:sz="6" w:space="0" w:color="7F7F7F"/>
-              <w:bottom w:val="single" w:sz="6" w:space="0" w:color="7F7F7F"/>
-              <w:right w:val="single" w:sz="6" w:space="0" w:color="7F7F7F"/>
-            </w:tcBorders>
-            <w:shd w:color="auto" w:fill="auto" w:val="clear"/>
-          </w:tcPr>
-          <w:p>
-            <w:pPr>
-              <w:pStyle w:val="Normal"/>
-              <w:widowControl w:val="false"/>
-              <w:spacing w:lineRule="auto" w:line="264" w:before="63" w:after="63"/>
+            <w:tcW w:w="2365" w:type="dxa"/>
+            <w:tcBorders>
+              <w:left w:val="single" w:sz="6" w:space="0" w:color="7F7F7F"/>
+              <w:bottom w:val="single" w:sz="6" w:space="0" w:color="7F7F7F"/>
+              <w:right w:val="single" w:sz="6" w:space="0" w:color="7F7F7F"/>
+            </w:tcBorders>
+            <w:shd w:color="auto" w:fill="auto" w:val="clear"/>
+          </w:tcPr>
+          <w:p>
+            <w:pPr>
+              <w:pStyle w:val="Normal"/>
+              <w:widowControl w:val="false"/>
+              <w:spacing w:lineRule="auto" w:line="264" w:before="63" w:after="63"/>
+              <w:rPr>
+                <w:sz w:val="24"/>
+                <w:szCs w:val="24"/>
+              </w:rPr>
+            </w:pPr>
+            <w:r>
               <w:rPr>
                 <w:b/>
                 <w:bCs/>
-                <w:sz w:val="22"/>
-                <w:szCs w:val="22"/>
-              </w:rPr>
-            </w:pPr>
-            <w:r>
-              <w:rPr>
-                <w:b/>
-                <w:bCs/>
-                <w:sz w:val="22"/>
-                <w:szCs w:val="22"/>
-              </w:rPr>
-              <w:t>Calidad</w:t>
-            </w:r>
-          </w:p>
-        </w:tc>
-        <w:tc>
-          <w:tcPr>
-            <w:tcW w:w="1540" w:type="dxa"/>
-            <w:tcBorders>
-              <w:left w:val="single" w:sz="6" w:space="0" w:color="7F7F7F"/>
-              <w:bottom w:val="single" w:sz="6" w:space="0" w:color="7F7F7F"/>
-            </w:tcBorders>
-            <w:shd w:color="auto" w:fill="auto" w:val="clear"/>
-          </w:tcPr>
-          <w:p>
-            <w:pPr>
-              <w:pStyle w:val="Normal"/>
-              <w:widowControl w:val="false"/>
-              <w:spacing w:lineRule="auto" w:line="264" w:before="63" w:after="63"/>
-              <w:rPr>
-                <w:sz w:val="22"/>
-                <w:szCs w:val="22"/>
-              </w:rPr>
-            </w:pPr>
-            <w:r>
-              <w:rPr>
-                <w:sz w:val="22"/>
-                <w:szCs w:val="22"/>
-              </w:rPr>
-              <w:t>EC-SQA-REV</w:t>
-            </w:r>
-          </w:p>
-        </w:tc>
-        <w:tc>
-          <w:tcPr>
-            <w:tcW w:w="5393" w:type="dxa"/>
-            <w:tcBorders>
-              <w:left w:val="single" w:sz="6" w:space="0" w:color="7F7F7F"/>
-              <w:bottom w:val="single" w:sz="6" w:space="0" w:color="7F7F7F"/>
-              <w:right w:val="single" w:sz="6" w:space="0" w:color="7F7F7F"/>
-            </w:tcBorders>
-            <w:shd w:color="auto" w:fill="auto" w:val="clear"/>
-          </w:tcPr>
-          <w:p>
-            <w:pPr>
-              <w:pStyle w:val="Normal"/>
-              <w:widowControl w:val="false"/>
-              <w:spacing w:lineRule="auto" w:line="264" w:before="63" w:after="63"/>
-              <w:rPr>
-                <w:sz w:val="22"/>
-                <w:szCs w:val="22"/>
-              </w:rPr>
-            </w:pPr>
-            <w:r>
-              <w:rPr>
-                <w:sz w:val="22"/>
-                <w:szCs w:val="22"/>
-              </w:rPr>
-              <w:t>Revisión de SQA</w:t>
+                <w:sz w:val="24"/>
+                <w:szCs w:val="24"/>
+              </w:rPr>
+              <w:t>Estándares</w:t>
+            </w:r>
+          </w:p>
+        </w:tc>
+        <w:tc>
+          <w:tcPr>
+            <w:tcW w:w="1541" w:type="dxa"/>
+            <w:tcBorders>
+              <w:left w:val="single" w:sz="6" w:space="0" w:color="7F7F7F"/>
+              <w:bottom w:val="single" w:sz="6" w:space="0" w:color="7F7F7F"/>
+            </w:tcBorders>
+            <w:shd w:color="auto" w:fill="auto" w:val="clear"/>
+          </w:tcPr>
+          <w:p>
+            <w:pPr>
+              <w:pStyle w:val="Normal"/>
+              <w:widowControl w:val="false"/>
+              <w:spacing w:lineRule="auto" w:line="264" w:before="63" w:after="63"/>
+              <w:rPr>
+                <w:sz w:val="22"/>
+                <w:szCs w:val="22"/>
+              </w:rPr>
+            </w:pPr>
+            <w:r>
+              <w:rPr>
+                <w:sz w:val="22"/>
+                <w:szCs w:val="22"/>
+              </w:rPr>
+              <w:t>EC-STD-PHP</w:t>
+            </w:r>
+          </w:p>
+        </w:tc>
+        <w:tc>
+          <w:tcPr>
+            <w:tcW w:w="5394" w:type="dxa"/>
+            <w:tcBorders>
+              <w:left w:val="single" w:sz="6" w:space="0" w:color="7F7F7F"/>
+              <w:bottom w:val="single" w:sz="6" w:space="0" w:color="7F7F7F"/>
+              <w:right w:val="single" w:sz="6" w:space="0" w:color="7F7F7F"/>
+            </w:tcBorders>
+            <w:shd w:color="auto" w:fill="auto" w:val="clear"/>
+          </w:tcPr>
+          <w:p>
+            <w:pPr>
+              <w:pStyle w:val="Normal"/>
+              <w:widowControl w:val="false"/>
+              <w:spacing w:lineRule="auto" w:line="264" w:before="63" w:after="63"/>
+              <w:rPr>
+                <w:sz w:val="22"/>
+                <w:szCs w:val="22"/>
+              </w:rPr>
+            </w:pPr>
+            <w:r>
+              <w:rPr>
+                <w:sz w:val="22"/>
+                <w:szCs w:val="22"/>
+              </w:rPr>
+              <w:t>Estándar de Programación PHP</w:t>
             </w:r>
           </w:p>
         </w:tc>
@@ -3999,32 +4086,30 @@
         <w:trPr/>
         <w:tc>
           <w:tcPr>
-            <w:tcW w:w="2367" w:type="dxa"/>
-            <w:tcBorders>
-              <w:left w:val="single" w:sz="6" w:space="0" w:color="7F7F7F"/>
-              <w:bottom w:val="single" w:sz="6" w:space="0" w:color="7F7F7F"/>
-              <w:right w:val="single" w:sz="6" w:space="0" w:color="7F7F7F"/>
-            </w:tcBorders>
-            <w:shd w:color="auto" w:fill="auto" w:val="clear"/>
-          </w:tcPr>
-          <w:p>
-            <w:pPr>
-              <w:pStyle w:val="Normal"/>
-              <w:widowControl w:val="false"/>
-              <w:spacing w:lineRule="auto" w:line="264" w:before="63" w:after="63"/>
+            <w:tcW w:w="2365" w:type="dxa"/>
+            <w:tcBorders>
+              <w:left w:val="single" w:sz="6" w:space="0" w:color="7F7F7F"/>
+              <w:bottom w:val="single" w:sz="6" w:space="0" w:color="7F7F7F"/>
+              <w:right w:val="single" w:sz="6" w:space="0" w:color="7F7F7F"/>
+            </w:tcBorders>
+            <w:shd w:color="auto" w:fill="auto" w:val="clear"/>
+          </w:tcPr>
+          <w:p>
+            <w:pPr>
+              <w:pStyle w:val="Normal"/>
+              <w:widowControl w:val="false"/>
+              <w:spacing w:lineRule="auto" w:line="264" w:before="63" w:after="63"/>
+              <w:rPr>
+                <w:sz w:val="24"/>
+                <w:szCs w:val="24"/>
+              </w:rPr>
+            </w:pPr>
+            <w:r>
               <w:rPr>
                 <w:b/>
                 <w:bCs/>
-                <w:sz w:val="22"/>
-                <w:szCs w:val="22"/>
-              </w:rPr>
-            </w:pPr>
-            <w:r>
-              <w:rPr>
-                <w:b/>
-                <w:bCs/>
-                <w:sz w:val="22"/>
-                <w:szCs w:val="22"/>
+                <w:sz w:val="24"/>
+                <w:szCs w:val="24"/>
               </w:rPr>
               <w:t>Calidad</w:t>
             </w:r>
@@ -4032,58 +4117,58 @@
         </w:tc>
         <w:tc>
           <w:tcPr>
-            <w:tcW w:w="1540" w:type="dxa"/>
-            <w:tcBorders>
-              <w:left w:val="single" w:sz="6" w:space="0" w:color="7F7F7F"/>
-              <w:bottom w:val="single" w:sz="6" w:space="0" w:color="7F7F7F"/>
-            </w:tcBorders>
-            <w:shd w:color="auto" w:fill="auto" w:val="clear"/>
-          </w:tcPr>
-          <w:p>
-            <w:pPr>
-              <w:pStyle w:val="Normal"/>
-              <w:widowControl w:val="false"/>
-              <w:spacing w:lineRule="auto" w:line="264" w:before="63" w:after="63"/>
-              <w:rPr>
-                <w:sz w:val="22"/>
-                <w:szCs w:val="22"/>
-              </w:rPr>
-            </w:pPr>
-            <w:r>
-              <w:rPr>
-                <w:sz w:val="22"/>
-                <w:szCs w:val="22"/>
-              </w:rPr>
-              <w:t>EC-SQA-INF</w:t>
-            </w:r>
-          </w:p>
-        </w:tc>
-        <w:tc>
-          <w:tcPr>
-            <w:tcW w:w="5393" w:type="dxa"/>
-            <w:tcBorders>
-              <w:left w:val="single" w:sz="6" w:space="0" w:color="7F7F7F"/>
-              <w:bottom w:val="single" w:sz="6" w:space="0" w:color="7F7F7F"/>
-              <w:right w:val="single" w:sz="6" w:space="0" w:color="7F7F7F"/>
-            </w:tcBorders>
-            <w:shd w:color="auto" w:fill="auto" w:val="clear"/>
-          </w:tcPr>
-          <w:p>
-            <w:pPr>
-              <w:pStyle w:val="Normal"/>
-              <w:widowControl w:val="false"/>
-              <w:spacing w:lineRule="auto" w:line="264" w:before="63" w:after="63"/>
-              <w:rPr>
-                <w:sz w:val="22"/>
-                <w:szCs w:val="22"/>
-              </w:rPr>
-            </w:pPr>
-            <w:r>
-              <w:rPr>
-                <w:sz w:val="22"/>
-                <w:szCs w:val="22"/>
-              </w:rPr>
-              <w:t>Informe Final de SQA</w:t>
+            <w:tcW w:w="1541" w:type="dxa"/>
+            <w:tcBorders>
+              <w:left w:val="single" w:sz="6" w:space="0" w:color="7F7F7F"/>
+              <w:bottom w:val="single" w:sz="6" w:space="0" w:color="7F7F7F"/>
+            </w:tcBorders>
+            <w:shd w:color="auto" w:fill="auto" w:val="clear"/>
+          </w:tcPr>
+          <w:p>
+            <w:pPr>
+              <w:pStyle w:val="Normal"/>
+              <w:widowControl w:val="false"/>
+              <w:spacing w:lineRule="auto" w:line="264" w:before="63" w:after="63"/>
+              <w:rPr>
+                <w:sz w:val="22"/>
+                <w:szCs w:val="22"/>
+              </w:rPr>
+            </w:pPr>
+            <w:r>
+              <w:rPr>
+                <w:sz w:val="22"/>
+                <w:szCs w:val="22"/>
+              </w:rPr>
+              <w:t>EC-SQA-PLN</w:t>
+            </w:r>
+          </w:p>
+        </w:tc>
+        <w:tc>
+          <w:tcPr>
+            <w:tcW w:w="5394" w:type="dxa"/>
+            <w:tcBorders>
+              <w:left w:val="single" w:sz="6" w:space="0" w:color="7F7F7F"/>
+              <w:bottom w:val="single" w:sz="6" w:space="0" w:color="7F7F7F"/>
+              <w:right w:val="single" w:sz="6" w:space="0" w:color="7F7F7F"/>
+            </w:tcBorders>
+            <w:shd w:color="auto" w:fill="auto" w:val="clear"/>
+          </w:tcPr>
+          <w:p>
+            <w:pPr>
+              <w:pStyle w:val="Normal"/>
+              <w:widowControl w:val="false"/>
+              <w:spacing w:lineRule="auto" w:line="264" w:before="63" w:after="63"/>
+              <w:rPr>
+                <w:sz w:val="22"/>
+                <w:szCs w:val="22"/>
+              </w:rPr>
+            </w:pPr>
+            <w:r>
+              <w:rPr>
+                <w:sz w:val="22"/>
+                <w:szCs w:val="22"/>
+              </w:rPr>
+              <w:t>Plan de SQA</w:t>
             </w:r>
           </w:p>
         </w:tc>
@@ -4092,91 +4177,89 @@
         <w:trPr/>
         <w:tc>
           <w:tcPr>
-            <w:tcW w:w="2367" w:type="dxa"/>
-            <w:tcBorders>
-              <w:left w:val="single" w:sz="6" w:space="0" w:color="7F7F7F"/>
-              <w:bottom w:val="single" w:sz="6" w:space="0" w:color="7F7F7F"/>
-              <w:right w:val="single" w:sz="6" w:space="0" w:color="7F7F7F"/>
-            </w:tcBorders>
-            <w:shd w:color="auto" w:fill="auto" w:val="clear"/>
-          </w:tcPr>
-          <w:p>
-            <w:pPr>
-              <w:pStyle w:val="Normal"/>
-              <w:widowControl w:val="false"/>
-              <w:spacing w:lineRule="auto" w:line="264" w:before="63" w:after="63"/>
+            <w:tcW w:w="2365" w:type="dxa"/>
+            <w:tcBorders>
+              <w:left w:val="single" w:sz="6" w:space="0" w:color="7F7F7F"/>
+              <w:bottom w:val="single" w:sz="6" w:space="0" w:color="7F7F7F"/>
+              <w:right w:val="single" w:sz="6" w:space="0" w:color="7F7F7F"/>
+            </w:tcBorders>
+            <w:shd w:color="auto" w:fill="auto" w:val="clear"/>
+          </w:tcPr>
+          <w:p>
+            <w:pPr>
+              <w:pStyle w:val="Normal"/>
+              <w:widowControl w:val="false"/>
+              <w:spacing w:lineRule="auto" w:line="264" w:before="63" w:after="63"/>
+              <w:rPr>
+                <w:sz w:val="24"/>
+                <w:szCs w:val="24"/>
+              </w:rPr>
+            </w:pPr>
+            <w:r>
               <w:rPr>
                 <w:b/>
                 <w:bCs/>
-                <w:sz w:val="22"/>
-                <w:szCs w:val="22"/>
-              </w:rPr>
-            </w:pPr>
-            <w:r>
-              <w:rPr>
-                <w:b/>
-                <w:bCs/>
-                <w:sz w:val="22"/>
-                <w:szCs w:val="22"/>
-              </w:rPr>
-              <w:t>Implementación</w:t>
-            </w:r>
-          </w:p>
-        </w:tc>
-        <w:tc>
-          <w:tcPr>
-            <w:tcW w:w="1540" w:type="dxa"/>
-            <w:tcBorders>
-              <w:left w:val="single" w:sz="6" w:space="0" w:color="7F7F7F"/>
-              <w:bottom w:val="single" w:sz="6" w:space="0" w:color="7F7F7F"/>
-            </w:tcBorders>
-            <w:shd w:color="auto" w:fill="auto" w:val="clear"/>
-          </w:tcPr>
-          <w:p>
-            <w:pPr>
-              <w:pStyle w:val="Normal"/>
-              <w:widowControl w:val="false"/>
-              <w:spacing w:lineRule="auto" w:line="264" w:before="63" w:after="63"/>
-              <w:rPr>
-                <w:sz w:val="22"/>
-                <w:szCs w:val="22"/>
-              </w:rPr>
-            </w:pPr>
-            <w:r>
-              <w:rPr>
-                <w:sz w:val="22"/>
-                <w:szCs w:val="22"/>
-              </w:rPr>
-              <w:t>EC-SRC-SQL</w:t>
-            </w:r>
-          </w:p>
-        </w:tc>
-        <w:tc>
-          <w:tcPr>
-            <w:tcW w:w="5393" w:type="dxa"/>
-            <w:tcBorders>
-              <w:left w:val="single" w:sz="6" w:space="0" w:color="7F7F7F"/>
-              <w:bottom w:val="single" w:sz="6" w:space="0" w:color="7F7F7F"/>
-              <w:right w:val="single" w:sz="6" w:space="0" w:color="7F7F7F"/>
-            </w:tcBorders>
-            <w:shd w:color="auto" w:fill="auto" w:val="clear"/>
-          </w:tcPr>
-          <w:p>
-            <w:pPr>
-              <w:pStyle w:val="Normal"/>
-              <w:widowControl w:val="false"/>
-              <w:spacing w:lineRule="auto" w:line="264" w:before="63" w:after="63"/>
-              <w:rPr>
-                <w:sz w:val="22"/>
-                <w:szCs w:val="22"/>
-              </w:rPr>
-            </w:pPr>
-            <w:r>
-              <w:rPr>
-                <w:sz w:val="22"/>
-                <w:szCs w:val="22"/>
-              </w:rPr>
-              <w:t>Script de base de datos</w:t>
+                <w:sz w:val="24"/>
+                <w:szCs w:val="24"/>
+              </w:rPr>
+              <w:t>Calidad</w:t>
+            </w:r>
+          </w:p>
+        </w:tc>
+        <w:tc>
+          <w:tcPr>
+            <w:tcW w:w="1541" w:type="dxa"/>
+            <w:tcBorders>
+              <w:left w:val="single" w:sz="6" w:space="0" w:color="7F7F7F"/>
+              <w:bottom w:val="single" w:sz="6" w:space="0" w:color="7F7F7F"/>
+            </w:tcBorders>
+            <w:shd w:color="auto" w:fill="auto" w:val="clear"/>
+          </w:tcPr>
+          <w:p>
+            <w:pPr>
+              <w:pStyle w:val="Normal"/>
+              <w:widowControl w:val="false"/>
+              <w:spacing w:lineRule="auto" w:line="264" w:before="63" w:after="63"/>
+              <w:rPr>
+                <w:sz w:val="22"/>
+                <w:szCs w:val="22"/>
+              </w:rPr>
+            </w:pPr>
+            <w:r>
+              <w:rPr>
+                <w:sz w:val="22"/>
+                <w:szCs w:val="22"/>
+              </w:rPr>
+              <w:t>EC-SQA-REV</w:t>
+            </w:r>
+          </w:p>
+        </w:tc>
+        <w:tc>
+          <w:tcPr>
+            <w:tcW w:w="5394" w:type="dxa"/>
+            <w:tcBorders>
+              <w:left w:val="single" w:sz="6" w:space="0" w:color="7F7F7F"/>
+              <w:bottom w:val="single" w:sz="6" w:space="0" w:color="7F7F7F"/>
+              <w:right w:val="single" w:sz="6" w:space="0" w:color="7F7F7F"/>
+            </w:tcBorders>
+            <w:shd w:color="auto" w:fill="auto" w:val="clear"/>
+          </w:tcPr>
+          <w:p>
+            <w:pPr>
+              <w:pStyle w:val="Normal"/>
+              <w:widowControl w:val="false"/>
+              <w:spacing w:lineRule="auto" w:line="264" w:before="63" w:after="63"/>
+              <w:rPr>
+                <w:sz w:val="22"/>
+                <w:szCs w:val="22"/>
+              </w:rPr>
+            </w:pPr>
+            <w:r>
+              <w:rPr>
+                <w:sz w:val="22"/>
+                <w:szCs w:val="22"/>
+              </w:rPr>
+              <w:t>Revisión de SQA</w:t>
             </w:r>
           </w:p>
         </w:tc>
@@ -4185,32 +4268,121 @@
         <w:trPr/>
         <w:tc>
           <w:tcPr>
-            <w:tcW w:w="2367" w:type="dxa"/>
-            <w:tcBorders>
-              <w:left w:val="single" w:sz="6" w:space="0" w:color="7F7F7F"/>
-              <w:bottom w:val="single" w:sz="6" w:space="0" w:color="7F7F7F"/>
-              <w:right w:val="single" w:sz="6" w:space="0" w:color="7F7F7F"/>
-            </w:tcBorders>
-            <w:shd w:color="auto" w:fill="auto" w:val="clear"/>
-          </w:tcPr>
-          <w:p>
-            <w:pPr>
-              <w:pStyle w:val="Normal"/>
-              <w:widowControl w:val="false"/>
-              <w:spacing w:lineRule="auto" w:line="264" w:before="63" w:after="63"/>
+            <w:tcW w:w="2365" w:type="dxa"/>
+            <w:tcBorders>
+              <w:left w:val="single" w:sz="6" w:space="0" w:color="7F7F7F"/>
+              <w:bottom w:val="single" w:sz="6" w:space="0" w:color="7F7F7F"/>
+              <w:right w:val="single" w:sz="6" w:space="0" w:color="7F7F7F"/>
+            </w:tcBorders>
+            <w:shd w:color="auto" w:fill="auto" w:val="clear"/>
+          </w:tcPr>
+          <w:p>
+            <w:pPr>
+              <w:pStyle w:val="Normal"/>
+              <w:widowControl w:val="false"/>
+              <w:spacing w:lineRule="auto" w:line="264" w:before="63" w:after="63"/>
+              <w:rPr>
+                <w:sz w:val="24"/>
+                <w:szCs w:val="24"/>
+              </w:rPr>
+            </w:pPr>
+            <w:r>
               <w:rPr>
                 <w:b/>
                 <w:bCs/>
-                <w:sz w:val="22"/>
-                <w:szCs w:val="22"/>
+                <w:sz w:val="24"/>
+                <w:szCs w:val="24"/>
+              </w:rPr>
+              <w:t>Calidad</w:t>
+            </w:r>
+          </w:p>
+        </w:tc>
+        <w:tc>
+          <w:tcPr>
+            <w:tcW w:w="1541" w:type="dxa"/>
+            <w:tcBorders>
+              <w:left w:val="single" w:sz="6" w:space="0" w:color="7F7F7F"/>
+              <w:bottom w:val="single" w:sz="6" w:space="0" w:color="7F7F7F"/>
+            </w:tcBorders>
+            <w:shd w:color="auto" w:fill="auto" w:val="clear"/>
+          </w:tcPr>
+          <w:p>
+            <w:pPr>
+              <w:pStyle w:val="Normal"/>
+              <w:widowControl w:val="false"/>
+              <w:spacing w:lineRule="auto" w:line="264" w:before="63" w:after="63"/>
+              <w:rPr>
+                <w:sz w:val="22"/>
+                <w:szCs w:val="22"/>
+              </w:rPr>
+            </w:pPr>
+            <w:r>
+              <w:rPr>
+                <w:sz w:val="22"/>
+                <w:szCs w:val="22"/>
+              </w:rPr>
+              <w:t>EC-SQA-INF</w:t>
+            </w:r>
+          </w:p>
+        </w:tc>
+        <w:tc>
+          <w:tcPr>
+            <w:tcW w:w="5394" w:type="dxa"/>
+            <w:tcBorders>
+              <w:left w:val="single" w:sz="6" w:space="0" w:color="7F7F7F"/>
+              <w:bottom w:val="single" w:sz="6" w:space="0" w:color="7F7F7F"/>
+              <w:right w:val="single" w:sz="6" w:space="0" w:color="7F7F7F"/>
+            </w:tcBorders>
+            <w:shd w:color="auto" w:fill="auto" w:val="clear"/>
+          </w:tcPr>
+          <w:p>
+            <w:pPr>
+              <w:pStyle w:val="Normal"/>
+              <w:widowControl w:val="false"/>
+              <w:spacing w:lineRule="auto" w:line="264" w:before="63" w:after="63"/>
+              <w:rPr>
+                <w:sz w:val="22"/>
+                <w:szCs w:val="22"/>
+              </w:rPr>
+            </w:pPr>
+            <w:r>
+              <w:rPr>
+                <w:sz w:val="22"/>
+                <w:szCs w:val="22"/>
+              </w:rPr>
+              <w:t>Informe Final de SQA</w:t>
+            </w:r>
+          </w:p>
+        </w:tc>
+      </w:tr>
+      <w:tr>
+        <w:trPr/>
+        <w:tc>
+          <w:tcPr>
+            <w:tcW w:w="2365" w:type="dxa"/>
+            <w:tcBorders>
+              <w:left w:val="single" w:sz="6" w:space="0" w:color="7F7F7F"/>
+              <w:bottom w:val="single" w:sz="6" w:space="0" w:color="7F7F7F"/>
+              <w:right w:val="single" w:sz="6" w:space="0" w:color="7F7F7F"/>
+            </w:tcBorders>
+            <w:shd w:color="auto" w:fill="auto" w:val="clear"/>
+          </w:tcPr>
+          <w:p>
+            <w:pPr>
+              <w:pStyle w:val="Normal"/>
+              <w:widowControl w:val="false"/>
+              <w:spacing w:lineRule="auto" w:line="264" w:before="63" w:after="63"/>
+              <w:rPr>
+                <w:sz w:val="24"/>
+                <w:szCs w:val="24"/>
               </w:rPr>
             </w:pPr>
             <w:r>
               <w:rPr>
                 <w:b/>
                 <w:bCs/>
-                <w:sz w:val="22"/>
-                <w:szCs w:val="22"/>
+                <w:sz w:val="24"/>
+                <w:szCs w:val="24"/>
               </w:rPr>
               <w:t>Implementación</w:t>
             </w:r>
@@ -4218,7 +4390,98 @@
         </w:tc>
         <w:tc>
           <w:tcPr>
-            <w:tcW w:w="1540" w:type="dxa"/>
+            <w:tcW w:w="1541" w:type="dxa"/>
+            <w:tcBorders>
+              <w:left w:val="single" w:sz="6" w:space="0" w:color="7F7F7F"/>
+              <w:bottom w:val="single" w:sz="6" w:space="0" w:color="7F7F7F"/>
+            </w:tcBorders>
+            <w:shd w:color="auto" w:fill="auto" w:val="clear"/>
+          </w:tcPr>
+          <w:p>
+            <w:pPr>
+              <w:pStyle w:val="Normal"/>
+              <w:widowControl w:val="false"/>
+              <w:spacing w:lineRule="auto" w:line="264" w:before="63" w:after="63"/>
+              <w:rPr>
+                <w:sz w:val="22"/>
+                <w:szCs w:val="22"/>
+              </w:rPr>
+            </w:pPr>
+            <w:r>
+              <w:rPr>
+                <w:sz w:val="22"/>
+                <w:szCs w:val="22"/>
+              </w:rPr>
+              <w:t>EC-SRC-SQL</w:t>
+            </w:r>
+          </w:p>
+        </w:tc>
+        <w:tc>
+          <w:tcPr>
+            <w:tcW w:w="5394" w:type="dxa"/>
+            <w:tcBorders>
+              <w:left w:val="single" w:sz="6" w:space="0" w:color="7F7F7F"/>
+              <w:bottom w:val="single" w:sz="6" w:space="0" w:color="7F7F7F"/>
+              <w:right w:val="single" w:sz="6" w:space="0" w:color="7F7F7F"/>
+            </w:tcBorders>
+            <w:shd w:color="auto" w:fill="auto" w:val="clear"/>
+          </w:tcPr>
+          <w:p>
+            <w:pPr>
+              <w:pStyle w:val="Normal"/>
+              <w:widowControl w:val="false"/>
+              <w:spacing w:lineRule="auto" w:line="264" w:before="63" w:after="63"/>
+              <w:rPr>
+                <w:sz w:val="22"/>
+                <w:szCs w:val="22"/>
+              </w:rPr>
+            </w:pPr>
+            <w:r>
+              <w:rPr>
+                <w:sz w:val="22"/>
+                <w:szCs w:val="22"/>
+              </w:rPr>
+              <w:t>Script de base de datos</w:t>
+            </w:r>
+          </w:p>
+        </w:tc>
+      </w:tr>
+      <w:tr>
+        <w:trPr/>
+        <w:tc>
+          <w:tcPr>
+            <w:tcW w:w="2365" w:type="dxa"/>
+            <w:tcBorders>
+              <w:left w:val="single" w:sz="6" w:space="0" w:color="7F7F7F"/>
+              <w:bottom w:val="single" w:sz="6" w:space="0" w:color="7F7F7F"/>
+              <w:right w:val="single" w:sz="6" w:space="0" w:color="7F7F7F"/>
+            </w:tcBorders>
+            <w:shd w:color="auto" w:fill="auto" w:val="clear"/>
+          </w:tcPr>
+          <w:p>
+            <w:pPr>
+              <w:pStyle w:val="Normal"/>
+              <w:widowControl w:val="false"/>
+              <w:spacing w:lineRule="auto" w:line="264" w:before="63" w:after="63"/>
+              <w:rPr>
+                <w:sz w:val="24"/>
+                <w:szCs w:val="24"/>
+              </w:rPr>
+            </w:pPr>
+            <w:r>
+              <w:rPr>
+                <w:b/>
+                <w:bCs/>
+                <w:sz w:val="24"/>
+                <w:szCs w:val="24"/>
+              </w:rPr>
+              <w:t>Implementación</w:t>
+            </w:r>
+          </w:p>
+        </w:tc>
+        <w:tc>
+          <w:tcPr>
+            <w:tcW w:w="1541" w:type="dxa"/>
             <w:tcBorders>
               <w:left w:val="single" w:sz="6" w:space="0" w:color="7F7F7F"/>
               <w:bottom w:val="single" w:sz="6" w:space="0" w:color="7F7F7F"/>
@@ -4246,7 +4509,7 @@
         </w:tc>
         <w:tc>
           <w:tcPr>
-            <w:tcW w:w="5393" w:type="dxa"/>
+            <w:tcW w:w="5394" w:type="dxa"/>
             <w:tcBorders>
               <w:left w:val="single" w:sz="6" w:space="0" w:color="7F7F7F"/>
               <w:bottom w:val="single" w:sz="6" w:space="0" w:color="7F7F7F"/>
@@ -4270,6 +4533,99 @@
                 <w:szCs w:val="22"/>
               </w:rPr>
               <w:t>Código fuente PHP</w:t>
+            </w:r>
+          </w:p>
+        </w:tc>
+      </w:tr>
+      <w:tr>
+        <w:trPr/>
+        <w:tc>
+          <w:tcPr>
+            <w:tcW w:w="2365" w:type="dxa"/>
+            <w:tcBorders>
+              <w:left w:val="single" w:sz="6" w:space="0" w:color="7F7F7F"/>
+              <w:bottom w:val="single" w:sz="6" w:space="0" w:color="7F7F7F"/>
+              <w:right w:val="single" w:sz="6" w:space="0" w:color="7F7F7F"/>
+            </w:tcBorders>
+            <w:shd w:color="auto" w:fill="auto" w:val="clear"/>
+          </w:tcPr>
+          <w:p>
+            <w:pPr>
+              <w:pStyle w:val="Normal"/>
+              <w:widowControl w:val="false"/>
+              <w:spacing w:lineRule="auto" w:line="264" w:before="63" w:after="63"/>
+              <w:rPr>
+                <w:b/>
+                <w:bCs/>
+                <w:sz w:val="24"/>
+                <w:szCs w:val="24"/>
+              </w:rPr>
+            </w:pPr>
+            <w:r>
+              <w:rPr>
+                <w:b/>
+                <w:bCs/>
+                <w:sz w:val="24"/>
+                <w:szCs w:val="24"/>
+              </w:rPr>
+              <w:t>Repositorio Git</w:t>
+            </w:r>
+          </w:p>
+        </w:tc>
+        <w:tc>
+          <w:tcPr>
+            <w:tcW w:w="1541" w:type="dxa"/>
+            <w:tcBorders>
+              <w:left w:val="single" w:sz="6" w:space="0" w:color="7F7F7F"/>
+              <w:bottom w:val="single" w:sz="6" w:space="0" w:color="7F7F7F"/>
+            </w:tcBorders>
+            <w:shd w:color="auto" w:fill="auto" w:val="clear"/>
+          </w:tcPr>
+          <w:p>
+            <w:pPr>
+              <w:pStyle w:val="Normal"/>
+              <w:widowControl w:val="false"/>
+              <w:spacing w:lineRule="auto" w:line="264" w:before="63" w:after="63"/>
+              <w:rPr>
+                <w:sz w:val="22"/>
+                <w:szCs w:val="22"/>
+              </w:rPr>
+            </w:pPr>
+            <w:r>
+              <w:rPr>
+                <w:sz w:val="22"/>
+                <w:szCs w:val="22"/>
+              </w:rPr>
+              <w:t>EC-GIT</w:t>
+            </w:r>
+          </w:p>
+        </w:tc>
+        <w:tc>
+          <w:tcPr>
+            <w:tcW w:w="5394" w:type="dxa"/>
+            <w:tcBorders>
+              <w:left w:val="single" w:sz="6" w:space="0" w:color="7F7F7F"/>
+              <w:bottom w:val="single" w:sz="6" w:space="0" w:color="7F7F7F"/>
+              <w:right w:val="single" w:sz="6" w:space="0" w:color="7F7F7F"/>
+            </w:tcBorders>
+            <w:shd w:color="auto" w:fill="auto" w:val="clear"/>
+          </w:tcPr>
+          <w:p>
+            <w:pPr>
+              <w:pStyle w:val="Normal"/>
+              <w:widowControl w:val="false"/>
+              <w:spacing w:lineRule="auto" w:line="264" w:before="63" w:after="63"/>
+              <w:rPr>
+                <w:sz w:val="22"/>
+                <w:szCs w:val="22"/>
+              </w:rPr>
+            </w:pPr>
+            <w:r>
+              <w:rPr>
+                <w:sz w:val="22"/>
+                <w:szCs w:val="22"/>
+              </w:rPr>
+              <w:t>Metadatos de versión (Git)</w:t>
             </w:r>
           </w:p>
         </w:tc>
@@ -4512,45 +4868,7 @@
       </w:pPr>
       <w:r>
         <w:rPr/>
-        <w:t xml:space="preserve">Al tratarse de un equipo de dos personas, la gestión de configuración se realiza de forma cooperativa. Gargaglione actúa como Configuration Manager, responsable de la integridad del repositorio, el versionado y el etiquetado de líneas base. Zapata es responsable de </w:t>
-      </w:r>
-      <w:r>
-        <w:rPr/>
-        <w:t>las revisiones del código</w:t>
-      </w:r>
-      <w:r>
-        <w:rPr/>
-        <w:t>. Las decisiones que afectan líneas base se toman en conjunto como CCB, documentándose en el canal de planificación de Discord y en el Issue correspondiente.</w:t>
-      </w:r>
-    </w:p>
-    <w:p>
-      <w:pPr>
-        <w:pStyle w:val="Ttulo2"/>
-        <w:jc w:val="left"/>
-        <w:rPr/>
-      </w:pPr>
-      <w:r>
-        <w:rPr/>
-      </w:r>
-    </w:p>
-    <w:p>
-      <w:pPr>
-        <w:pStyle w:val="Ttulo2"/>
-        <w:jc w:val="left"/>
-        <w:rPr/>
-      </w:pPr>
-      <w:r>
-        <w:rPr/>
-      </w:r>
-    </w:p>
-    <w:p>
-      <w:pPr>
-        <w:pStyle w:val="Ttulo2"/>
-        <w:jc w:val="left"/>
-        <w:rPr/>
-      </w:pPr>
-      <w:r>
-        <w:rPr/>
+        <w:t>Al tratarse de un equipo de dos personas, la gestión de configuración se realiza de forma cooperativa. Gargaglione actúa como Configuration Manager, responsable de la integridad del repositorio, el versionado y el etiquetado de líneas base. Zapata es responsable de las revisiones del código. Las decisiones que afectan líneas base se toman en conjunto como CCB, documentándose en el canal de planificación de Discord y en el Issue correspondiente.</w:t>
       </w:r>
     </w:p>
     <w:p>
@@ -4702,9 +5020,9 @@
         <w:tblLook w:firstRow="0" w:noVBand="1" w:lastRow="0" w:firstColumn="0" w:lastColumn="0" w:noHBand="1" w:val="0600"/>
       </w:tblPr>
       <w:tblGrid>
-        <w:gridCol w:w="2367"/>
-        <w:gridCol w:w="1540"/>
-        <w:gridCol w:w="5393"/>
+        <w:gridCol w:w="2365"/>
+        <w:gridCol w:w="1541"/>
+        <w:gridCol w:w="5394"/>
       </w:tblGrid>
       <w:tr>
         <w:trPr>
@@ -4713,7 +5031,7 @@
         </w:trPr>
         <w:tc>
           <w:tcPr>
-            <w:tcW w:w="2367" w:type="dxa"/>
+            <w:tcW w:w="2365" w:type="dxa"/>
             <w:tcBorders>
               <w:top w:val="single" w:sz="6" w:space="0" w:color="7F7F7F"/>
               <w:left w:val="single" w:sz="6" w:space="0" w:color="7F7F7F"/>
@@ -4742,7 +5060,7 @@
         </w:tc>
         <w:tc>
           <w:tcPr>
-            <w:tcW w:w="1540" w:type="dxa"/>
+            <w:tcW w:w="1541" w:type="dxa"/>
             <w:tcBorders>
               <w:top w:val="single" w:sz="6" w:space="0" w:color="7F7F7F"/>
               <w:left w:val="single" w:sz="6" w:space="0" w:color="7F7F7F"/>
@@ -4770,7 +5088,7 @@
         </w:tc>
         <w:tc>
           <w:tcPr>
-            <w:tcW w:w="5393" w:type="dxa"/>
+            <w:tcW w:w="5394" w:type="dxa"/>
             <w:tcBorders>
               <w:top w:val="single" w:sz="6" w:space="0" w:color="7F7F7F"/>
               <w:left w:val="single" w:sz="6" w:space="0" w:color="7F7F7F"/>
@@ -4807,7 +5125,7 @@
         <w:trPr/>
         <w:tc>
           <w:tcPr>
-            <w:tcW w:w="2367" w:type="dxa"/>
+            <w:tcW w:w="2365" w:type="dxa"/>
             <w:tcBorders>
               <w:top w:val="single" w:sz="6" w:space="0" w:color="7F7F7F"/>
               <w:left w:val="single" w:sz="6" w:space="0" w:color="7F7F7F"/>
@@ -4836,7 +5154,7 @@
         </w:tc>
         <w:tc>
           <w:tcPr>
-            <w:tcW w:w="1540" w:type="dxa"/>
+            <w:tcW w:w="1541" w:type="dxa"/>
             <w:tcBorders>
               <w:top w:val="single" w:sz="6" w:space="0" w:color="7F7F7F"/>
               <w:left w:val="single" w:sz="6" w:space="0" w:color="7F7F7F"/>
@@ -4862,7 +5180,7 @@
         </w:tc>
         <w:tc>
           <w:tcPr>
-            <w:tcW w:w="5393" w:type="dxa"/>
+            <w:tcW w:w="5394" w:type="dxa"/>
             <w:tcBorders>
               <w:top w:val="single" w:sz="6" w:space="0" w:color="7F7F7F"/>
               <w:left w:val="single" w:sz="6" w:space="0" w:color="7F7F7F"/>
@@ -4895,7 +5213,7 @@
         <w:trPr/>
         <w:tc>
           <w:tcPr>
-            <w:tcW w:w="2367" w:type="dxa"/>
+            <w:tcW w:w="2365" w:type="dxa"/>
             <w:tcBorders>
               <w:top w:val="single" w:sz="6" w:space="0" w:color="7F7F7F"/>
               <w:left w:val="single" w:sz="6" w:space="0" w:color="7F7F7F"/>
@@ -4924,7 +5242,7 @@
         </w:tc>
         <w:tc>
           <w:tcPr>
-            <w:tcW w:w="1540" w:type="dxa"/>
+            <w:tcW w:w="1541" w:type="dxa"/>
             <w:tcBorders>
               <w:top w:val="single" w:sz="6" w:space="0" w:color="7F7F7F"/>
               <w:left w:val="single" w:sz="6" w:space="0" w:color="7F7F7F"/>
@@ -4950,7 +5268,7 @@
         </w:tc>
         <w:tc>
           <w:tcPr>
-            <w:tcW w:w="5393" w:type="dxa"/>
+            <w:tcW w:w="5394" w:type="dxa"/>
             <w:tcBorders>
               <w:top w:val="single" w:sz="6" w:space="0" w:color="7F7F7F"/>
               <w:left w:val="single" w:sz="6" w:space="0" w:color="7F7F7F"/>
@@ -4983,7 +5301,7 @@
         <w:trPr/>
         <w:tc>
           <w:tcPr>
-            <w:tcW w:w="2367" w:type="dxa"/>
+            <w:tcW w:w="2365" w:type="dxa"/>
             <w:tcBorders>
               <w:left w:val="single" w:sz="6" w:space="0" w:color="7F7F7F"/>
               <w:bottom w:val="single" w:sz="6" w:space="0" w:color="7F7F7F"/>
@@ -5011,7 +5329,7 @@
         </w:tc>
         <w:tc>
           <w:tcPr>
-            <w:tcW w:w="1540" w:type="dxa"/>
+            <w:tcW w:w="1541" w:type="dxa"/>
             <w:tcBorders>
               <w:left w:val="single" w:sz="6" w:space="0" w:color="7F7F7F"/>
               <w:bottom w:val="single" w:sz="6" w:space="0" w:color="7F7F7F"/>
@@ -5036,7 +5354,7 @@
         </w:tc>
         <w:tc>
           <w:tcPr>
-            <w:tcW w:w="5393" w:type="dxa"/>
+            <w:tcW w:w="5394" w:type="dxa"/>
             <w:tcBorders>
               <w:left w:val="single" w:sz="6" w:space="0" w:color="7F7F7F"/>
               <w:bottom w:val="single" w:sz="6" w:space="0" w:color="7F7F7F"/>
@@ -5068,7 +5386,7 @@
         <w:trPr/>
         <w:tc>
           <w:tcPr>
-            <w:tcW w:w="2367" w:type="dxa"/>
+            <w:tcW w:w="2365" w:type="dxa"/>
             <w:tcBorders>
               <w:left w:val="single" w:sz="6" w:space="0" w:color="7F7F7F"/>
               <w:bottom w:val="single" w:sz="6" w:space="0" w:color="7F7F7F"/>
@@ -5097,7 +5415,7 @@
         </w:tc>
         <w:tc>
           <w:tcPr>
-            <w:tcW w:w="1540" w:type="dxa"/>
+            <w:tcW w:w="1541" w:type="dxa"/>
             <w:tcBorders>
               <w:left w:val="single" w:sz="6" w:space="0" w:color="7F7F7F"/>
               <w:bottom w:val="single" w:sz="6" w:space="0" w:color="7F7F7F"/>
@@ -5125,7 +5443,7 @@
         </w:tc>
         <w:tc>
           <w:tcPr>
-            <w:tcW w:w="5393" w:type="dxa"/>
+            <w:tcW w:w="5394" w:type="dxa"/>
             <w:tcBorders>
               <w:left w:val="single" w:sz="6" w:space="0" w:color="7F7F7F"/>
               <w:bottom w:val="single" w:sz="6" w:space="0" w:color="7F7F7F"/>
@@ -5157,7 +5475,7 @@
         <w:trPr/>
         <w:tc>
           <w:tcPr>
-            <w:tcW w:w="2367" w:type="dxa"/>
+            <w:tcW w:w="2365" w:type="dxa"/>
             <w:tcBorders>
               <w:left w:val="single" w:sz="6" w:space="0" w:color="7F7F7F"/>
               <w:bottom w:val="single" w:sz="6" w:space="0" w:color="7F7F7F"/>
@@ -5186,7 +5504,7 @@
         </w:tc>
         <w:tc>
           <w:tcPr>
-            <w:tcW w:w="1540" w:type="dxa"/>
+            <w:tcW w:w="1541" w:type="dxa"/>
             <w:tcBorders>
               <w:left w:val="single" w:sz="6" w:space="0" w:color="7F7F7F"/>
               <w:bottom w:val="single" w:sz="6" w:space="0" w:color="7F7F7F"/>
@@ -5214,7 +5532,7 @@
         </w:tc>
         <w:tc>
           <w:tcPr>
-            <w:tcW w:w="5393" w:type="dxa"/>
+            <w:tcW w:w="5394" w:type="dxa"/>
             <w:tcBorders>
               <w:left w:val="single" w:sz="6" w:space="0" w:color="7F7F7F"/>
               <w:bottom w:val="single" w:sz="6" w:space="0" w:color="7F7F7F"/>
@@ -5243,24 +5561,6 @@
         </w:tc>
       </w:tr>
     </w:tbl>
-    <w:p>
-      <w:pPr>
-        <w:pStyle w:val="Normal"/>
-        <w:rPr/>
-      </w:pPr>
-      <w:r>
-        <w:rPr/>
-      </w:r>
-    </w:p>
-    <w:p>
-      <w:pPr>
-        <w:pStyle w:val="Normal"/>
-        <w:rPr/>
-      </w:pPr>
-      <w:r>
-        <w:rPr/>
-      </w:r>
-    </w:p>
     <w:p>
       <w:pPr>
         <w:pStyle w:val="Ttulo2"/>
@@ -5714,7 +6014,7 @@
       </w:tblPr>
       <w:tblGrid>
         <w:gridCol w:w="2550"/>
-        <w:gridCol w:w="6750"/>
+        <w:gridCol w:w="6749"/>
       </w:tblGrid>
       <w:tr>
         <w:trPr>
@@ -5752,7 +6052,7 @@
         </w:tc>
         <w:tc>
           <w:tcPr>
-            <w:tcW w:w="6750" w:type="dxa"/>
+            <w:tcW w:w="6749" w:type="dxa"/>
             <w:tcBorders>
               <w:top w:val="single" w:sz="6" w:space="0" w:color="7F7F7F"/>
               <w:left w:val="single" w:sz="6" w:space="0" w:color="7F7F7F"/>
@@ -5813,7 +6113,7 @@
         </w:tc>
         <w:tc>
           <w:tcPr>
-            <w:tcW w:w="6750" w:type="dxa"/>
+            <w:tcW w:w="6749" w:type="dxa"/>
             <w:tcBorders>
               <w:top w:val="single" w:sz="6" w:space="0" w:color="7F7F7F"/>
               <w:left w:val="single" w:sz="6" w:space="0" w:color="7F7F7F"/>
@@ -5875,7 +6175,7 @@
         </w:tc>
         <w:tc>
           <w:tcPr>
-            <w:tcW w:w="6750" w:type="dxa"/>
+            <w:tcW w:w="6749" w:type="dxa"/>
             <w:tcBorders>
               <w:top w:val="single" w:sz="6" w:space="0" w:color="7F7F7F"/>
               <w:left w:val="single" w:sz="6" w:space="0" w:color="7F7F7F"/>
@@ -5936,7 +6236,7 @@
         </w:tc>
         <w:tc>
           <w:tcPr>
-            <w:tcW w:w="6750" w:type="dxa"/>
+            <w:tcW w:w="6749" w:type="dxa"/>
             <w:tcBorders>
               <w:left w:val="single" w:sz="6" w:space="0" w:color="7F7F7F"/>
               <w:bottom w:val="single" w:sz="6" w:space="0" w:color="7F7F7F"/>
@@ -5996,7 +6296,7 @@
         </w:tc>
         <w:tc>
           <w:tcPr>
-            <w:tcW w:w="6750" w:type="dxa"/>
+            <w:tcW w:w="6749" w:type="dxa"/>
             <w:tcBorders>
               <w:left w:val="single" w:sz="6" w:space="0" w:color="7F7F7F"/>
               <w:bottom w:val="single" w:sz="6" w:space="0" w:color="7F7F7F"/>
@@ -6246,15 +6546,7 @@
       </w:pPr>
       <w:r>
         <w:rPr/>
-        <w:t xml:space="preserve">Se realiza al concluir el proyecto. Su objetivo es identificar qué salió bien, qué puede mejorarse y qué lecciones pueden aplicarse a proyectos futuros. Los resultados se incorporan al </w:t>
-      </w:r>
-      <w:r>
-        <w:rPr/>
-        <w:t>documento</w:t>
-      </w:r>
-      <w:r>
-        <w:rPr/>
-        <w:t xml:space="preserve"> Informe Final de SQA (EC-SQA-INF) como recomendaciones.</w:t>
+        <w:t>Se realiza al concluir el proyecto. Su objetivo es identificar qué salió bien, qué puede mejorarse y qué lecciones pueden aplicarse a proyectos futuros. Los resultados se incorporan al documento Informe Final de SQA (EC-SQA-INF) como recomendaciones.</w:t>
       </w:r>
     </w:p>
     <w:p>
@@ -6318,81 +6610,6 @@
         <w:rPr/>
         <w:br/>
         <w:t>Los responsables de cada EC deben actualizar sus documentos cada vez que una corrección aprobada implique un cambio en el contenido. Ninguna corrección puede darse por cerrada sin que la documentación afectada esté actualizada.</w:t>
-      </w:r>
-    </w:p>
-    <w:p>
-      <w:pPr>
-        <w:pStyle w:val="Ttulo1"/>
-        <w:spacing w:before="360" w:after="120"/>
-        <w:rPr>
-          <w:rFonts w:ascii="Calibri" w:hAnsi="Calibri" w:cs="Calibri" w:asciiTheme="majorHAnsi" w:cstheme="majorHAnsi" w:hAnsiTheme="majorHAnsi"/>
-          <w:sz w:val="22"/>
-          <w:szCs w:val="22"/>
-          <w:lang w:val="es-AR"/>
-        </w:rPr>
-      </w:pPr>
-      <w:r>
-        <w:rPr/>
-      </w:r>
-    </w:p>
-    <w:p>
-      <w:pPr>
-        <w:pStyle w:val="Ttulo1"/>
-        <w:spacing w:before="360" w:after="120"/>
-        <w:rPr>
-          <w:rFonts w:ascii="Calibri" w:hAnsi="Calibri" w:cs="Calibri" w:asciiTheme="majorHAnsi" w:cstheme="majorHAnsi" w:hAnsiTheme="majorHAnsi"/>
-          <w:sz w:val="22"/>
-          <w:szCs w:val="22"/>
-          <w:lang w:val="es-AR"/>
-        </w:rPr>
-      </w:pPr>
-      <w:r>
-        <w:rPr/>
-      </w:r>
-    </w:p>
-    <w:p>
-      <w:pPr>
-        <w:pStyle w:val="Ttulo1"/>
-        <w:spacing w:before="360" w:after="120"/>
-        <w:rPr>
-          <w:rFonts w:ascii="Calibri" w:hAnsi="Calibri" w:cs="Calibri" w:asciiTheme="majorHAnsi" w:cstheme="majorHAnsi" w:hAnsiTheme="majorHAnsi"/>
-          <w:sz w:val="22"/>
-          <w:szCs w:val="22"/>
-          <w:lang w:val="es-AR"/>
-        </w:rPr>
-      </w:pPr>
-      <w:r>
-        <w:rPr/>
-      </w:r>
-    </w:p>
-    <w:p>
-      <w:pPr>
-        <w:pStyle w:val="Ttulo1"/>
-        <w:spacing w:before="360" w:after="120"/>
-        <w:rPr>
-          <w:rFonts w:ascii="Calibri" w:hAnsi="Calibri" w:cs="Calibri" w:asciiTheme="majorHAnsi" w:cstheme="majorHAnsi" w:hAnsiTheme="majorHAnsi"/>
-          <w:sz w:val="22"/>
-          <w:szCs w:val="22"/>
-          <w:lang w:val="es-AR"/>
-        </w:rPr>
-      </w:pPr>
-      <w:r>
-        <w:rPr/>
-      </w:r>
-    </w:p>
-    <w:p>
-      <w:pPr>
-        <w:pStyle w:val="Ttulo1"/>
-        <w:spacing w:before="360" w:after="120"/>
-        <w:rPr>
-          <w:rFonts w:ascii="Calibri" w:hAnsi="Calibri" w:cs="Calibri" w:asciiTheme="majorHAnsi" w:cstheme="majorHAnsi" w:hAnsiTheme="majorHAnsi"/>
-          <w:sz w:val="22"/>
-          <w:szCs w:val="22"/>
-          <w:lang w:val="es-AR"/>
-        </w:rPr>
-      </w:pPr>
-      <w:r>
-        <w:rPr/>
       </w:r>
     </w:p>
     <w:p>
@@ -6460,7 +6677,7 @@
         <w:tblLook w:firstRow="0" w:noVBand="1" w:lastRow="0" w:firstColumn="0" w:lastColumn="0" w:noHBand="1" w:val="0600"/>
       </w:tblPr>
       <w:tblGrid>
-        <w:gridCol w:w="2383"/>
+        <w:gridCol w:w="2382"/>
         <w:gridCol w:w="6917"/>
       </w:tblGrid>
       <w:tr>
@@ -6470,7 +6687,7 @@
         </w:trPr>
         <w:tc>
           <w:tcPr>
-            <w:tcW w:w="2383" w:type="dxa"/>
+            <w:tcW w:w="2382" w:type="dxa"/>
             <w:tcBorders>
               <w:top w:val="single" w:sz="6" w:space="0" w:color="7F7F7F"/>
               <w:left w:val="single" w:sz="6" w:space="0" w:color="7F7F7F"/>
@@ -6530,7 +6747,7 @@
         <w:trPr/>
         <w:tc>
           <w:tcPr>
-            <w:tcW w:w="2383" w:type="dxa"/>
+            <w:tcW w:w="2382" w:type="dxa"/>
             <w:tcBorders>
               <w:top w:val="single" w:sz="6" w:space="0" w:color="7F7F7F"/>
               <w:left w:val="single" w:sz="6" w:space="0" w:color="7F7F7F"/>
@@ -6588,7 +6805,7 @@
         <w:trPr/>
         <w:tc>
           <w:tcPr>
-            <w:tcW w:w="2383" w:type="dxa"/>
+            <w:tcW w:w="2382" w:type="dxa"/>
             <w:tcBorders>
               <w:top w:val="single" w:sz="6" w:space="0" w:color="7F7F7F"/>
               <w:left w:val="single" w:sz="6" w:space="0" w:color="7F7F7F"/>
@@ -6602,14 +6819,17 @@
               <w:pStyle w:val="Normal"/>
               <w:widowControl w:val="false"/>
               <w:spacing w:lineRule="auto" w:line="264" w:before="63" w:after="63"/>
-              <w:rPr/>
+              <w:rPr>
+                <w:sz w:val="24"/>
+                <w:szCs w:val="24"/>
+              </w:rPr>
             </w:pPr>
             <w:r>
               <w:rPr>
                 <w:b/>
                 <w:bCs/>
-                <w:sz w:val="22"/>
-                <w:szCs w:val="22"/>
+                <w:sz w:val="24"/>
+                <w:szCs w:val="24"/>
               </w:rPr>
               <w:t>GitHub Projects</w:t>
             </w:r>
@@ -6630,12 +6850,15 @@
               <w:pStyle w:val="Normal"/>
               <w:widowControl w:val="false"/>
               <w:spacing w:lineRule="auto" w:line="264" w:before="63" w:after="63"/>
-              <w:rPr/>
-            </w:pPr>
-            <w:r>
-              <w:rPr>
-                <w:sz w:val="22"/>
-                <w:szCs w:val="22"/>
+              <w:rPr>
+                <w:sz w:val="24"/>
+                <w:szCs w:val="24"/>
+              </w:rPr>
+            </w:pPr>
+            <w:r>
+              <w:rPr>
+                <w:sz w:val="24"/>
+                <w:szCs w:val="24"/>
               </w:rPr>
               <w:t>Visualización del estado de los ECs y seguimiento del avance del proyecto.</w:t>
             </w:r>
@@ -6646,27 +6869,30 @@
         <w:trPr/>
         <w:tc>
           <w:tcPr>
-            <w:tcW w:w="2383" w:type="dxa"/>
-            <w:tcBorders>
-              <w:left w:val="single" w:sz="6" w:space="0" w:color="7F7F7F"/>
-              <w:bottom w:val="single" w:sz="6" w:space="0" w:color="7F7F7F"/>
-              <w:right w:val="single" w:sz="6" w:space="0" w:color="7F7F7F"/>
-            </w:tcBorders>
-            <w:shd w:color="auto" w:fill="auto" w:val="clear"/>
-          </w:tcPr>
-          <w:p>
-            <w:pPr>
-              <w:pStyle w:val="Normal"/>
-              <w:widowControl w:val="false"/>
-              <w:spacing w:lineRule="auto" w:line="264" w:before="63" w:after="63"/>
-              <w:rPr/>
+            <w:tcW w:w="2382" w:type="dxa"/>
+            <w:tcBorders>
+              <w:left w:val="single" w:sz="6" w:space="0" w:color="7F7F7F"/>
+              <w:bottom w:val="single" w:sz="6" w:space="0" w:color="7F7F7F"/>
+              <w:right w:val="single" w:sz="6" w:space="0" w:color="7F7F7F"/>
+            </w:tcBorders>
+            <w:shd w:color="auto" w:fill="auto" w:val="clear"/>
+          </w:tcPr>
+          <w:p>
+            <w:pPr>
+              <w:pStyle w:val="Normal"/>
+              <w:widowControl w:val="false"/>
+              <w:spacing w:lineRule="auto" w:line="264" w:before="63" w:after="63"/>
+              <w:rPr>
+                <w:sz w:val="24"/>
+                <w:szCs w:val="24"/>
+              </w:rPr>
             </w:pPr>
             <w:r>
               <w:rPr>
                 <w:b/>
                 <w:bCs/>
-                <w:sz w:val="22"/>
-                <w:szCs w:val="22"/>
+                <w:sz w:val="24"/>
+                <w:szCs w:val="24"/>
               </w:rPr>
               <w:t>Git + GitHub</w:t>
             </w:r>
@@ -6686,12 +6912,15 @@
               <w:pStyle w:val="Normal"/>
               <w:widowControl w:val="false"/>
               <w:spacing w:lineRule="auto" w:line="264" w:before="63" w:after="63"/>
-              <w:rPr/>
-            </w:pPr>
-            <w:r>
-              <w:rPr>
-                <w:sz w:val="22"/>
-                <w:szCs w:val="22"/>
+              <w:rPr>
+                <w:sz w:val="24"/>
+                <w:szCs w:val="24"/>
+              </w:rPr>
+            </w:pPr>
+            <w:r>
+              <w:rPr>
+                <w:sz w:val="24"/>
+                <w:szCs w:val="24"/>
               </w:rPr>
               <w:t>Control de versiones, líneas base etiquetadas y trazabilidad de cambios.</w:t>
             </w:r>
@@ -6702,28 +6931,30 @@
         <w:trPr/>
         <w:tc>
           <w:tcPr>
-            <w:tcW w:w="2383" w:type="dxa"/>
-            <w:tcBorders>
-              <w:left w:val="single" w:sz="6" w:space="0" w:color="7F7F7F"/>
-              <w:bottom w:val="single" w:sz="6" w:space="0" w:color="7F7F7F"/>
-              <w:right w:val="single" w:sz="6" w:space="0" w:color="7F7F7F"/>
-            </w:tcBorders>
-            <w:shd w:color="auto" w:fill="auto" w:val="clear"/>
-          </w:tcPr>
-          <w:p>
-            <w:pPr>
-              <w:pStyle w:val="Normal"/>
-              <w:widowControl w:val="false"/>
-              <w:spacing w:lineRule="auto" w:line="264" w:before="63" w:after="63"/>
+            <w:tcW w:w="2382" w:type="dxa"/>
+            <w:tcBorders>
+              <w:left w:val="single" w:sz="6" w:space="0" w:color="7F7F7F"/>
+              <w:bottom w:val="single" w:sz="6" w:space="0" w:color="7F7F7F"/>
+              <w:right w:val="single" w:sz="6" w:space="0" w:color="7F7F7F"/>
+            </w:tcBorders>
+            <w:shd w:color="auto" w:fill="auto" w:val="clear"/>
+          </w:tcPr>
+          <w:p>
+            <w:pPr>
+              <w:pStyle w:val="Normal"/>
+              <w:widowControl w:val="false"/>
+              <w:spacing w:lineRule="auto" w:line="264" w:before="63" w:after="63"/>
+              <w:rPr>
+                <w:sz w:val="24"/>
+                <w:szCs w:val="24"/>
+              </w:rPr>
+            </w:pPr>
+            <w:r>
               <w:rPr>
                 <w:b/>
                 <w:bCs/>
-              </w:rPr>
-            </w:pPr>
-            <w:r>
-              <w:rPr>
-                <w:b/>
-                <w:bCs/>
+                <w:sz w:val="24"/>
+                <w:szCs w:val="24"/>
               </w:rPr>
               <w:t>PHP Code Sniffer</w:t>
             </w:r>
@@ -6744,14 +6975,14 @@
               <w:widowControl w:val="false"/>
               <w:spacing w:lineRule="auto" w:line="264" w:before="63" w:after="63"/>
               <w:rPr>
-                <w:sz w:val="22"/>
-                <w:szCs w:val="22"/>
-              </w:rPr>
-            </w:pPr>
-            <w:r>
-              <w:rPr>
-                <w:sz w:val="22"/>
-                <w:szCs w:val="22"/>
+                <w:sz w:val="24"/>
+                <w:szCs w:val="24"/>
+              </w:rPr>
+            </w:pPr>
+            <w:r>
+              <w:rPr>
+                <w:sz w:val="24"/>
+                <w:szCs w:val="24"/>
               </w:rPr>
               <w:t>Verificación automática del cumplimiento del estándar de codificación PHP (PSR-1, PSR-12).</w:t>
             </w:r>
@@ -6762,28 +6993,30 @@
         <w:trPr/>
         <w:tc>
           <w:tcPr>
-            <w:tcW w:w="2383" w:type="dxa"/>
-            <w:tcBorders>
-              <w:left w:val="single" w:sz="6" w:space="0" w:color="7F7F7F"/>
-              <w:bottom w:val="single" w:sz="6" w:space="0" w:color="7F7F7F"/>
-              <w:right w:val="single" w:sz="6" w:space="0" w:color="7F7F7F"/>
-            </w:tcBorders>
-            <w:shd w:color="auto" w:fill="auto" w:val="clear"/>
-          </w:tcPr>
-          <w:p>
-            <w:pPr>
-              <w:pStyle w:val="Normal"/>
-              <w:widowControl w:val="false"/>
-              <w:spacing w:lineRule="auto" w:line="264" w:before="63" w:after="63"/>
+            <w:tcW w:w="2382" w:type="dxa"/>
+            <w:tcBorders>
+              <w:left w:val="single" w:sz="6" w:space="0" w:color="7F7F7F"/>
+              <w:bottom w:val="single" w:sz="6" w:space="0" w:color="7F7F7F"/>
+              <w:right w:val="single" w:sz="6" w:space="0" w:color="7F7F7F"/>
+            </w:tcBorders>
+            <w:shd w:color="auto" w:fill="auto" w:val="clear"/>
+          </w:tcPr>
+          <w:p>
+            <w:pPr>
+              <w:pStyle w:val="Normal"/>
+              <w:widowControl w:val="false"/>
+              <w:spacing w:lineRule="auto" w:line="264" w:before="63" w:after="63"/>
+              <w:rPr>
+                <w:sz w:val="24"/>
+                <w:szCs w:val="24"/>
+              </w:rPr>
+            </w:pPr>
+            <w:r>
               <w:rPr>
                 <w:b/>
                 <w:bCs/>
-              </w:rPr>
-            </w:pPr>
-            <w:r>
-              <w:rPr>
-                <w:b/>
-                <w:bCs/>
+                <w:sz w:val="24"/>
+                <w:szCs w:val="24"/>
               </w:rPr>
               <w:t>PHP Mess Detector</w:t>
             </w:r>
@@ -6804,14 +7037,14 @@
               <w:widowControl w:val="false"/>
               <w:spacing w:lineRule="auto" w:line="264" w:before="63" w:after="63"/>
               <w:rPr>
-                <w:sz w:val="22"/>
-                <w:szCs w:val="22"/>
-              </w:rPr>
-            </w:pPr>
-            <w:r>
-              <w:rPr>
-                <w:sz w:val="22"/>
-                <w:szCs w:val="22"/>
+                <w:sz w:val="24"/>
+                <w:szCs w:val="24"/>
+              </w:rPr>
+            </w:pPr>
+            <w:r>
+              <w:rPr>
+                <w:sz w:val="24"/>
+                <w:szCs w:val="24"/>
               </w:rPr>
               <w:t>Detección de problemas de diseño y complejidad en el código fuente PHP.</w:t>
             </w:r>
@@ -6822,28 +7055,30 @@
         <w:trPr/>
         <w:tc>
           <w:tcPr>
-            <w:tcW w:w="2383" w:type="dxa"/>
-            <w:tcBorders>
-              <w:left w:val="single" w:sz="6" w:space="0" w:color="7F7F7F"/>
-              <w:bottom w:val="single" w:sz="6" w:space="0" w:color="7F7F7F"/>
-              <w:right w:val="single" w:sz="6" w:space="0" w:color="7F7F7F"/>
-            </w:tcBorders>
-            <w:shd w:color="auto" w:fill="auto" w:val="clear"/>
-          </w:tcPr>
-          <w:p>
-            <w:pPr>
-              <w:pStyle w:val="Normal"/>
-              <w:widowControl w:val="false"/>
-              <w:spacing w:lineRule="auto" w:line="264" w:before="63" w:after="63"/>
+            <w:tcW w:w="2382" w:type="dxa"/>
+            <w:tcBorders>
+              <w:left w:val="single" w:sz="6" w:space="0" w:color="7F7F7F"/>
+              <w:bottom w:val="single" w:sz="6" w:space="0" w:color="7F7F7F"/>
+              <w:right w:val="single" w:sz="6" w:space="0" w:color="7F7F7F"/>
+            </w:tcBorders>
+            <w:shd w:color="auto" w:fill="auto" w:val="clear"/>
+          </w:tcPr>
+          <w:p>
+            <w:pPr>
+              <w:pStyle w:val="Normal"/>
+              <w:widowControl w:val="false"/>
+              <w:spacing w:lineRule="auto" w:line="264" w:before="63" w:after="63"/>
+              <w:rPr>
+                <w:sz w:val="24"/>
+                <w:szCs w:val="24"/>
+              </w:rPr>
+            </w:pPr>
+            <w:r>
               <w:rPr>
                 <w:b/>
                 <w:bCs/>
-              </w:rPr>
-            </w:pPr>
-            <w:r>
-              <w:rPr>
-                <w:b/>
-                <w:bCs/>
+                <w:sz w:val="24"/>
+                <w:szCs w:val="24"/>
               </w:rPr>
               <w:t>Discord</w:t>
             </w:r>
@@ -6864,14 +7099,14 @@
               <w:widowControl w:val="false"/>
               <w:spacing w:lineRule="auto" w:line="264" w:before="63" w:after="63"/>
               <w:rPr>
-                <w:sz w:val="22"/>
-                <w:szCs w:val="22"/>
-              </w:rPr>
-            </w:pPr>
-            <w:r>
-              <w:rPr>
-                <w:sz w:val="22"/>
-                <w:szCs w:val="22"/>
+                <w:sz w:val="24"/>
+                <w:szCs w:val="24"/>
+              </w:rPr>
+            </w:pPr>
+            <w:r>
+              <w:rPr>
+                <w:sz w:val="24"/>
+                <w:szCs w:val="24"/>
               </w:rPr>
               <w:t>Canal formal para RTF, decisiones del CCB y registro de acuerdos del equipo.</w:t>
             </w:r>
@@ -6898,97 +7133,6 @@
       <w:r>
         <w:rPr/>
         <w:t>La metodología de referencia para la documentación es la Metodología PSI, adaptada al contexto académico de UNPA-UARG. El marco de referencia para los atributos de calidad es ISO/IEC 25010.</w:t>
-      </w:r>
-    </w:p>
-    <w:p>
-      <w:pPr>
-        <w:pStyle w:val="Normal"/>
-        <w:jc w:val="both"/>
-        <w:rPr/>
-      </w:pPr>
-      <w:r>
-        <w:rPr/>
-        <w:br/>
-      </w:r>
-    </w:p>
-    <w:p>
-      <w:pPr>
-        <w:pStyle w:val="Normal"/>
-        <w:jc w:val="both"/>
-        <w:rPr/>
-      </w:pPr>
-      <w:r>
-        <w:rPr/>
-      </w:r>
-    </w:p>
-    <w:p>
-      <w:pPr>
-        <w:pStyle w:val="Normal"/>
-        <w:jc w:val="both"/>
-        <w:rPr/>
-      </w:pPr>
-      <w:r>
-        <w:rPr/>
-      </w:r>
-    </w:p>
-    <w:p>
-      <w:pPr>
-        <w:pStyle w:val="Normal"/>
-        <w:jc w:val="both"/>
-        <w:rPr/>
-      </w:pPr>
-      <w:r>
-        <w:rPr/>
-      </w:r>
-    </w:p>
-    <w:p>
-      <w:pPr>
-        <w:pStyle w:val="Normal"/>
-        <w:jc w:val="both"/>
-        <w:rPr/>
-      </w:pPr>
-      <w:r>
-        <w:rPr/>
-      </w:r>
-    </w:p>
-    <w:p>
-      <w:pPr>
-        <w:pStyle w:val="Normal"/>
-        <w:jc w:val="both"/>
-        <w:rPr/>
-      </w:pPr>
-      <w:r>
-        <w:rPr/>
-      </w:r>
-    </w:p>
-    <w:p>
-      <w:pPr>
-        <w:pStyle w:val="Normal"/>
-        <w:jc w:val="both"/>
-        <w:rPr/>
-      </w:pPr>
-      <w:r>
-        <w:rPr/>
-      </w:r>
-    </w:p>
-    <w:p>
-      <w:pPr>
-        <w:pStyle w:val="Normal"/>
-        <w:jc w:val="both"/>
-        <w:rPr/>
-      </w:pPr>
-      <w:r>
-        <w:rPr/>
-      </w:r>
-    </w:p>
-    <w:p>
-      <w:pPr>
-        <w:pStyle w:val="Normal"/>
-        <w:jc w:val="both"/>
-        <w:rPr/>
-      </w:pPr>
-      <w:r>
-        <w:rPr/>
       </w:r>
     </w:p>
     <w:p>
@@ -7137,137 +7281,7 @@
       <w:r>
         <w:rPr/>
         <w:br/>
-        <w:t>El detalle completo de los riesgos identificados, su análisis y los planes asociados se encuentra en el Plan de Gestión de Riesgos (EC-RSG) y su Anexo (EC-RSG-ANX).</w:t>
-      </w:r>
-    </w:p>
-    <w:p>
-      <w:pPr>
-        <w:pStyle w:val="Normal"/>
-        <w:jc w:val="both"/>
-        <w:rPr/>
-      </w:pPr>
-      <w:r>
-        <w:rPr/>
-      </w:r>
-    </w:p>
-    <w:p>
-      <w:pPr>
-        <w:pStyle w:val="Normal"/>
-        <w:jc w:val="both"/>
-        <w:rPr/>
-      </w:pPr>
-      <w:r>
-        <w:rPr/>
-      </w:r>
-    </w:p>
-    <w:p>
-      <w:pPr>
-        <w:pStyle w:val="Normal"/>
-        <w:jc w:val="both"/>
-        <w:rPr/>
-      </w:pPr>
-      <w:r>
-        <w:rPr/>
-      </w:r>
-    </w:p>
-    <w:p>
-      <w:pPr>
-        <w:pStyle w:val="Normal"/>
-        <w:jc w:val="both"/>
-        <w:rPr/>
-      </w:pPr>
-      <w:r>
-        <w:rPr/>
-      </w:r>
-    </w:p>
-    <w:p>
-      <w:pPr>
-        <w:pStyle w:val="Normal"/>
-        <w:jc w:val="both"/>
-        <w:rPr/>
-      </w:pPr>
-      <w:r>
-        <w:rPr/>
-      </w:r>
-    </w:p>
-    <w:p>
-      <w:pPr>
-        <w:pStyle w:val="Normal"/>
-        <w:jc w:val="both"/>
-        <w:rPr/>
-      </w:pPr>
-      <w:r>
-        <w:rPr/>
-      </w:r>
-    </w:p>
-    <w:p>
-      <w:pPr>
-        <w:pStyle w:val="Normal"/>
-        <w:jc w:val="both"/>
-        <w:rPr/>
-      </w:pPr>
-      <w:r>
-        <w:rPr/>
-      </w:r>
-    </w:p>
-    <w:p>
-      <w:pPr>
-        <w:pStyle w:val="Normal"/>
-        <w:jc w:val="both"/>
-        <w:rPr/>
-      </w:pPr>
-      <w:r>
-        <w:rPr/>
-      </w:r>
-    </w:p>
-    <w:p>
-      <w:pPr>
-        <w:pStyle w:val="Normal"/>
-        <w:jc w:val="both"/>
-        <w:rPr/>
-      </w:pPr>
-      <w:r>
-        <w:rPr/>
-      </w:r>
-    </w:p>
-    <w:p>
-      <w:pPr>
-        <w:pStyle w:val="Normal"/>
-        <w:jc w:val="both"/>
-        <w:rPr/>
-      </w:pPr>
-      <w:r>
-        <w:rPr/>
-      </w:r>
-    </w:p>
-    <w:p>
-      <w:pPr>
-        <w:pStyle w:val="Normal"/>
-        <w:jc w:val="both"/>
-        <w:rPr/>
-      </w:pPr>
-      <w:r>
-        <w:rPr/>
-      </w:r>
-    </w:p>
-    <w:p>
-      <w:pPr>
-        <w:pStyle w:val="Normal"/>
-        <w:jc w:val="both"/>
-        <w:rPr/>
-      </w:pPr>
-      <w:r>
-        <w:rPr/>
-      </w:r>
-    </w:p>
-    <w:p>
-      <w:pPr>
-        <w:pStyle w:val="Normal"/>
-        <w:jc w:val="both"/>
-        <w:rPr/>
-      </w:pPr>
-      <w:r>
-        <w:rPr/>
+        <w:t>El detalle completo de los riesgos identificados, su análisis y los planes asociados se encuentra en el Plan de Gestión de Riesgos (EC-RSG) y su planilla de Identificación y Análisis (EC-RSG-ANL).</w:t>
       </w:r>
     </w:p>
     <w:p>
@@ -7295,11 +7309,7 @@
       <w:bookmarkEnd w:id="46"/>
       <w:r>
         <w:rPr/>
-        <w:t xml:space="preserve"> </w:t>
-      </w:r>
-      <w:r>
-        <w:rPr/>
-        <w:t>MATRIZ DE TRAZABILIDAD</w:t>
+        <w:t xml:space="preserve"> MATRIZ DE TRAZABILIDAD</w:t>
       </w:r>
     </w:p>
     <w:p>
@@ -7340,7 +7350,7 @@
       </w:tblPr>
       <w:tblGrid>
         <w:gridCol w:w="2383"/>
-        <w:gridCol w:w="4134"/>
+        <w:gridCol w:w="4133"/>
       </w:tblGrid>
       <w:tr>
         <w:trPr>
@@ -7378,7 +7388,7 @@
         </w:tc>
         <w:tc>
           <w:tcPr>
-            <w:tcW w:w="4134" w:type="dxa"/>
+            <w:tcW w:w="4133" w:type="dxa"/>
             <w:tcBorders>
               <w:top w:val="single" w:sz="6" w:space="0" w:color="7F7F7F"/>
               <w:left w:val="single" w:sz="6" w:space="0" w:color="7F7F7F"/>
@@ -7438,7 +7448,7 @@
         </w:tc>
         <w:tc>
           <w:tcPr>
-            <w:tcW w:w="4134" w:type="dxa"/>
+            <w:tcW w:w="4133" w:type="dxa"/>
             <w:tcBorders>
               <w:top w:val="single" w:sz="6" w:space="0" w:color="7F7F7F"/>
               <w:left w:val="single" w:sz="6" w:space="0" w:color="7F7F7F"/>
@@ -7496,7 +7506,7 @@
         </w:tc>
         <w:tc>
           <w:tcPr>
-            <w:tcW w:w="4134" w:type="dxa"/>
+            <w:tcW w:w="4133" w:type="dxa"/>
             <w:tcBorders>
               <w:top w:val="single" w:sz="6" w:space="0" w:color="7F7F7F"/>
               <w:left w:val="single" w:sz="6" w:space="0" w:color="7F7F7F"/>
@@ -7553,7 +7563,7 @@
         </w:tc>
         <w:tc>
           <w:tcPr>
-            <w:tcW w:w="4134" w:type="dxa"/>
+            <w:tcW w:w="4133" w:type="dxa"/>
             <w:tcBorders>
               <w:left w:val="single" w:sz="6" w:space="0" w:color="7F7F7F"/>
               <w:bottom w:val="single" w:sz="6" w:space="0" w:color="7F7F7F"/>
@@ -7610,7 +7620,7 @@
         </w:tc>
         <w:tc>
           <w:tcPr>
-            <w:tcW w:w="4134" w:type="dxa"/>
+            <w:tcW w:w="4133" w:type="dxa"/>
             <w:tcBorders>
               <w:left w:val="single" w:sz="6" w:space="0" w:color="7F7F7F"/>
               <w:bottom w:val="single" w:sz="6" w:space="0" w:color="7F7F7F"/>
@@ -7670,7 +7680,7 @@
         </w:tc>
         <w:tc>
           <w:tcPr>
-            <w:tcW w:w="4134" w:type="dxa"/>
+            <w:tcW w:w="4133" w:type="dxa"/>
             <w:tcBorders>
               <w:left w:val="single" w:sz="6" w:space="0" w:color="7F7F7F"/>
               <w:bottom w:val="single" w:sz="6" w:space="0" w:color="7F7F7F"/>
@@ -7730,7 +7740,7 @@
         </w:tc>
         <w:tc>
           <w:tcPr>
-            <w:tcW w:w="4134" w:type="dxa"/>
+            <w:tcW w:w="4133" w:type="dxa"/>
             <w:tcBorders>
               <w:left w:val="single" w:sz="6" w:space="0" w:color="7F7F7F"/>
               <w:bottom w:val="single" w:sz="6" w:space="0" w:color="7F7F7F"/>
@@ -7790,7 +7800,7 @@
         </w:tc>
         <w:tc>
           <w:tcPr>
-            <w:tcW w:w="4134" w:type="dxa"/>
+            <w:tcW w:w="4133" w:type="dxa"/>
             <w:tcBorders>
               <w:left w:val="single" w:sz="6" w:space="0" w:color="7F7F7F"/>
               <w:bottom w:val="single" w:sz="6" w:space="0" w:color="7F7F7F"/>
@@ -7813,6 +7823,66 @@
                 <w:szCs w:val="22"/>
               </w:rPr>
               <w:t xml:space="preserve">EC-SRC-PHP, EC-DAT </w:t>
+            </w:r>
+          </w:p>
+        </w:tc>
+      </w:tr>
+      <w:tr>
+        <w:trPr/>
+        <w:tc>
+          <w:tcPr>
+            <w:tcW w:w="2383" w:type="dxa"/>
+            <w:tcBorders>
+              <w:left w:val="single" w:sz="6" w:space="0" w:color="7F7F7F"/>
+              <w:bottom w:val="single" w:sz="6" w:space="0" w:color="7F7F7F"/>
+              <w:right w:val="single" w:sz="6" w:space="0" w:color="7F7F7F"/>
+            </w:tcBorders>
+            <w:shd w:color="auto" w:fill="auto" w:val="clear"/>
+          </w:tcPr>
+          <w:p>
+            <w:pPr>
+              <w:pStyle w:val="Normal"/>
+              <w:widowControl w:val="false"/>
+              <w:spacing w:lineRule="auto" w:line="264" w:before="63" w:after="63"/>
+              <w:rPr>
+                <w:b/>
+                <w:bCs/>
+              </w:rPr>
+            </w:pPr>
+            <w:r>
+              <w:rPr>
+                <w:b/>
+                <w:bCs/>
+              </w:rPr>
+              <w:t>EC-DIS</w:t>
+            </w:r>
+          </w:p>
+        </w:tc>
+        <w:tc>
+          <w:tcPr>
+            <w:tcW w:w="4133" w:type="dxa"/>
+            <w:tcBorders>
+              <w:left w:val="single" w:sz="6" w:space="0" w:color="7F7F7F"/>
+              <w:bottom w:val="single" w:sz="6" w:space="0" w:color="7F7F7F"/>
+            </w:tcBorders>
+            <w:shd w:color="auto" w:fill="auto" w:val="clear"/>
+          </w:tcPr>
+          <w:p>
+            <w:pPr>
+              <w:pStyle w:val="Normal"/>
+              <w:widowControl w:val="false"/>
+              <w:spacing w:lineRule="auto" w:line="264" w:before="63" w:after="63"/>
+              <w:rPr>
+                <w:sz w:val="22"/>
+                <w:szCs w:val="22"/>
+              </w:rPr>
+            </w:pPr>
+            <w:r>
+              <w:rPr>
+                <w:sz w:val="22"/>
+                <w:szCs w:val="22"/>
+              </w:rPr>
+              <w:t>EC-REQ, EC-DAT, EC-STD-PHP, EC-SCM</w:t>
             </w:r>
           </w:p>
         </w:tc>
@@ -8123,7 +8193,7 @@
     <w:r>
       <w:rPr/>
       <w:drawing>
-        <wp:anchor behindDoc="0" distT="0" distB="0" distL="0" distR="0" simplePos="0" locked="0" layoutInCell="0" allowOverlap="1" relativeHeight="5">
+        <wp:anchor behindDoc="0" distT="0" distB="0" distL="0" distR="0" simplePos="0" locked="0" layoutInCell="0" allowOverlap="1" relativeHeight="6">
           <wp:simplePos x="0" y="0"/>
           <wp:positionH relativeFrom="column">
             <wp:posOffset>-918845</wp:posOffset>

</xml_diff>

<commit_message>
Trabajando en iteracion 3
</commit_message>
<xml_diff>
--- a/docs/calidad/sqa/EC-SQA-PLN_plan_sqa.docx
+++ b/docs/calidad/sqa/EC-SQA-PLN_plan_sqa.docx
@@ -3101,8 +3101,8 @@
         <w:tblLook w:firstRow="0" w:noVBand="1" w:lastRow="0" w:firstColumn="0" w:lastColumn="0" w:noHBand="1" w:val="0600"/>
       </w:tblPr>
       <w:tblGrid>
-        <w:gridCol w:w="2365"/>
-        <w:gridCol w:w="1541"/>
+        <w:gridCol w:w="2364"/>
+        <w:gridCol w:w="1542"/>
         <w:gridCol w:w="5394"/>
       </w:tblGrid>
       <w:tr>
@@ -3112,7 +3112,7 @@
         </w:trPr>
         <w:tc>
           <w:tcPr>
-            <w:tcW w:w="2365" w:type="dxa"/>
+            <w:tcW w:w="2364" w:type="dxa"/>
             <w:tcBorders>
               <w:top w:val="single" w:sz="6" w:space="0" w:color="7F7F7F"/>
               <w:left w:val="single" w:sz="6" w:space="0" w:color="7F7F7F"/>
@@ -3141,7 +3141,7 @@
         </w:tc>
         <w:tc>
           <w:tcPr>
-            <w:tcW w:w="1541" w:type="dxa"/>
+            <w:tcW w:w="1542" w:type="dxa"/>
             <w:tcBorders>
               <w:top w:val="single" w:sz="6" w:space="0" w:color="7F7F7F"/>
               <w:left w:val="single" w:sz="6" w:space="0" w:color="7F7F7F"/>
@@ -3206,7 +3206,7 @@
         <w:trPr/>
         <w:tc>
           <w:tcPr>
-            <w:tcW w:w="2365" w:type="dxa"/>
+            <w:tcW w:w="2364" w:type="dxa"/>
             <w:tcBorders>
               <w:top w:val="single" w:sz="6" w:space="0" w:color="7F7F7F"/>
               <w:left w:val="single" w:sz="6" w:space="0" w:color="7F7F7F"/>
@@ -3235,7 +3235,7 @@
         </w:tc>
         <w:tc>
           <w:tcPr>
-            <w:tcW w:w="1541" w:type="dxa"/>
+            <w:tcW w:w="1542" w:type="dxa"/>
             <w:tcBorders>
               <w:top w:val="single" w:sz="6" w:space="0" w:color="7F7F7F"/>
               <w:left w:val="single" w:sz="6" w:space="0" w:color="7F7F7F"/>
@@ -3294,7 +3294,7 @@
         <w:trPr/>
         <w:tc>
           <w:tcPr>
-            <w:tcW w:w="2365" w:type="dxa"/>
+            <w:tcW w:w="2364" w:type="dxa"/>
             <w:tcBorders>
               <w:top w:val="single" w:sz="6" w:space="0" w:color="7F7F7F"/>
               <w:left w:val="single" w:sz="6" w:space="0" w:color="7F7F7F"/>
@@ -3323,7 +3323,7 @@
         </w:tc>
         <w:tc>
           <w:tcPr>
-            <w:tcW w:w="1541" w:type="dxa"/>
+            <w:tcW w:w="1542" w:type="dxa"/>
             <w:tcBorders>
               <w:top w:val="single" w:sz="6" w:space="0" w:color="7F7F7F"/>
               <w:left w:val="single" w:sz="6" w:space="0" w:color="7F7F7F"/>
@@ -3382,7 +3382,7 @@
         <w:trPr/>
         <w:tc>
           <w:tcPr>
-            <w:tcW w:w="2365" w:type="dxa"/>
+            <w:tcW w:w="2364" w:type="dxa"/>
             <w:tcBorders>
               <w:top w:val="single" w:sz="6" w:space="0" w:color="7F7F7F"/>
               <w:left w:val="single" w:sz="6" w:space="0" w:color="7F7F7F"/>
@@ -3411,7 +3411,7 @@
         </w:tc>
         <w:tc>
           <w:tcPr>
-            <w:tcW w:w="1541" w:type="dxa"/>
+            <w:tcW w:w="1542" w:type="dxa"/>
             <w:tcBorders>
               <w:top w:val="single" w:sz="6" w:space="0" w:color="7F7F7F"/>
               <w:left w:val="single" w:sz="6" w:space="0" w:color="7F7F7F"/>
@@ -3470,7 +3470,7 @@
         <w:trPr/>
         <w:tc>
           <w:tcPr>
-            <w:tcW w:w="2365" w:type="dxa"/>
+            <w:tcW w:w="2364" w:type="dxa"/>
             <w:tcBorders>
               <w:left w:val="single" w:sz="6" w:space="0" w:color="7F7F7F"/>
               <w:bottom w:val="single" w:sz="6" w:space="0" w:color="7F7F7F"/>
@@ -3498,7 +3498,7 @@
         </w:tc>
         <w:tc>
           <w:tcPr>
-            <w:tcW w:w="1541" w:type="dxa"/>
+            <w:tcW w:w="1542" w:type="dxa"/>
             <w:tcBorders>
               <w:left w:val="single" w:sz="6" w:space="0" w:color="7F7F7F"/>
               <w:bottom w:val="single" w:sz="6" w:space="0" w:color="7F7F7F"/>
@@ -3555,7 +3555,7 @@
         <w:trPr/>
         <w:tc>
           <w:tcPr>
-            <w:tcW w:w="2365" w:type="dxa"/>
+            <w:tcW w:w="2364" w:type="dxa"/>
             <w:tcBorders>
               <w:left w:val="single" w:sz="6" w:space="0" w:color="7F7F7F"/>
               <w:bottom w:val="single" w:sz="6" w:space="0" w:color="7F7F7F"/>
@@ -3583,7 +3583,7 @@
         </w:tc>
         <w:tc>
           <w:tcPr>
-            <w:tcW w:w="1541" w:type="dxa"/>
+            <w:tcW w:w="1542" w:type="dxa"/>
             <w:tcBorders>
               <w:left w:val="single" w:sz="6" w:space="0" w:color="7F7F7F"/>
               <w:bottom w:val="single" w:sz="6" w:space="0" w:color="7F7F7F"/>
@@ -3640,7 +3640,7 @@
         <w:trPr/>
         <w:tc>
           <w:tcPr>
-            <w:tcW w:w="2365" w:type="dxa"/>
+            <w:tcW w:w="2364" w:type="dxa"/>
             <w:tcBorders>
               <w:left w:val="single" w:sz="6" w:space="0" w:color="7F7F7F"/>
               <w:bottom w:val="single" w:sz="6" w:space="0" w:color="7F7F7F"/>
@@ -3669,7 +3669,7 @@
         </w:tc>
         <w:tc>
           <w:tcPr>
-            <w:tcW w:w="1541" w:type="dxa"/>
+            <w:tcW w:w="1542" w:type="dxa"/>
             <w:tcBorders>
               <w:left w:val="single" w:sz="6" w:space="0" w:color="7F7F7F"/>
               <w:bottom w:val="single" w:sz="6" w:space="0" w:color="7F7F7F"/>
@@ -3729,7 +3729,7 @@
         <w:trPr/>
         <w:tc>
           <w:tcPr>
-            <w:tcW w:w="2365" w:type="dxa"/>
+            <w:tcW w:w="2364" w:type="dxa"/>
             <w:tcBorders>
               <w:left w:val="single" w:sz="6" w:space="0" w:color="7F7F7F"/>
               <w:bottom w:val="single" w:sz="6" w:space="0" w:color="7F7F7F"/>
@@ -3758,7 +3758,7 @@
         </w:tc>
         <w:tc>
           <w:tcPr>
-            <w:tcW w:w="1541" w:type="dxa"/>
+            <w:tcW w:w="1542" w:type="dxa"/>
             <w:tcBorders>
               <w:left w:val="single" w:sz="6" w:space="0" w:color="7F7F7F"/>
               <w:bottom w:val="single" w:sz="6" w:space="0" w:color="7F7F7F"/>
@@ -3818,7 +3818,7 @@
         <w:trPr/>
         <w:tc>
           <w:tcPr>
-            <w:tcW w:w="2365" w:type="dxa"/>
+            <w:tcW w:w="2364" w:type="dxa"/>
             <w:tcBorders>
               <w:left w:val="single" w:sz="6" w:space="0" w:color="7F7F7F"/>
               <w:bottom w:val="single" w:sz="6" w:space="0" w:color="7F7F7F"/>
@@ -3847,7 +3847,7 @@
         </w:tc>
         <w:tc>
           <w:tcPr>
-            <w:tcW w:w="1541" w:type="dxa"/>
+            <w:tcW w:w="1542" w:type="dxa"/>
             <w:tcBorders>
               <w:left w:val="single" w:sz="6" w:space="0" w:color="7F7F7F"/>
               <w:bottom w:val="single" w:sz="6" w:space="0" w:color="7F7F7F"/>
@@ -3904,7 +3904,7 @@
         <w:trPr/>
         <w:tc>
           <w:tcPr>
-            <w:tcW w:w="2365" w:type="dxa"/>
+            <w:tcW w:w="2364" w:type="dxa"/>
             <w:tcBorders>
               <w:left w:val="single" w:sz="6" w:space="0" w:color="7F7F7F"/>
               <w:bottom w:val="single" w:sz="6" w:space="0" w:color="7F7F7F"/>
@@ -3935,7 +3935,7 @@
         </w:tc>
         <w:tc>
           <w:tcPr>
-            <w:tcW w:w="1541" w:type="dxa"/>
+            <w:tcW w:w="1542" w:type="dxa"/>
             <w:tcBorders>
               <w:left w:val="single" w:sz="6" w:space="0" w:color="7F7F7F"/>
               <w:bottom w:val="single" w:sz="6" w:space="0" w:color="7F7F7F"/>
@@ -3995,7 +3995,7 @@
         <w:trPr/>
         <w:tc>
           <w:tcPr>
-            <w:tcW w:w="2365" w:type="dxa"/>
+            <w:tcW w:w="2364" w:type="dxa"/>
             <w:tcBorders>
               <w:left w:val="single" w:sz="6" w:space="0" w:color="7F7F7F"/>
               <w:bottom w:val="single" w:sz="6" w:space="0" w:color="7F7F7F"/>
@@ -4026,7 +4026,7 @@
         </w:tc>
         <w:tc>
           <w:tcPr>
-            <w:tcW w:w="1541" w:type="dxa"/>
+            <w:tcW w:w="1542" w:type="dxa"/>
             <w:tcBorders>
               <w:left w:val="single" w:sz="6" w:space="0" w:color="7F7F7F"/>
               <w:bottom w:val="single" w:sz="6" w:space="0" w:color="7F7F7F"/>
@@ -4086,7 +4086,7 @@
         <w:trPr/>
         <w:tc>
           <w:tcPr>
-            <w:tcW w:w="2365" w:type="dxa"/>
+            <w:tcW w:w="2364" w:type="dxa"/>
             <w:tcBorders>
               <w:left w:val="single" w:sz="6" w:space="0" w:color="7F7F7F"/>
               <w:bottom w:val="single" w:sz="6" w:space="0" w:color="7F7F7F"/>
@@ -4117,7 +4117,7 @@
         </w:tc>
         <w:tc>
           <w:tcPr>
-            <w:tcW w:w="1541" w:type="dxa"/>
+            <w:tcW w:w="1542" w:type="dxa"/>
             <w:tcBorders>
               <w:left w:val="single" w:sz="6" w:space="0" w:color="7F7F7F"/>
               <w:bottom w:val="single" w:sz="6" w:space="0" w:color="7F7F7F"/>
@@ -4177,7 +4177,7 @@
         <w:trPr/>
         <w:tc>
           <w:tcPr>
-            <w:tcW w:w="2365" w:type="dxa"/>
+            <w:tcW w:w="2364" w:type="dxa"/>
             <w:tcBorders>
               <w:left w:val="single" w:sz="6" w:space="0" w:color="7F7F7F"/>
               <w:bottom w:val="single" w:sz="6" w:space="0" w:color="7F7F7F"/>
@@ -4208,7 +4208,7 @@
         </w:tc>
         <w:tc>
           <w:tcPr>
-            <w:tcW w:w="1541" w:type="dxa"/>
+            <w:tcW w:w="1542" w:type="dxa"/>
             <w:tcBorders>
               <w:left w:val="single" w:sz="6" w:space="0" w:color="7F7F7F"/>
               <w:bottom w:val="single" w:sz="6" w:space="0" w:color="7F7F7F"/>
@@ -4268,7 +4268,7 @@
         <w:trPr/>
         <w:tc>
           <w:tcPr>
-            <w:tcW w:w="2365" w:type="dxa"/>
+            <w:tcW w:w="2364" w:type="dxa"/>
             <w:tcBorders>
               <w:left w:val="single" w:sz="6" w:space="0" w:color="7F7F7F"/>
               <w:bottom w:val="single" w:sz="6" w:space="0" w:color="7F7F7F"/>
@@ -4299,7 +4299,7 @@
         </w:tc>
         <w:tc>
           <w:tcPr>
-            <w:tcW w:w="1541" w:type="dxa"/>
+            <w:tcW w:w="1542" w:type="dxa"/>
             <w:tcBorders>
               <w:left w:val="single" w:sz="6" w:space="0" w:color="7F7F7F"/>
               <w:bottom w:val="single" w:sz="6" w:space="0" w:color="7F7F7F"/>
@@ -4359,7 +4359,7 @@
         <w:trPr/>
         <w:tc>
           <w:tcPr>
-            <w:tcW w:w="2365" w:type="dxa"/>
+            <w:tcW w:w="2364" w:type="dxa"/>
             <w:tcBorders>
               <w:left w:val="single" w:sz="6" w:space="0" w:color="7F7F7F"/>
               <w:bottom w:val="single" w:sz="6" w:space="0" w:color="7F7F7F"/>
@@ -4390,7 +4390,7 @@
         </w:tc>
         <w:tc>
           <w:tcPr>
-            <w:tcW w:w="1541" w:type="dxa"/>
+            <w:tcW w:w="1542" w:type="dxa"/>
             <w:tcBorders>
               <w:left w:val="single" w:sz="6" w:space="0" w:color="7F7F7F"/>
               <w:bottom w:val="single" w:sz="6" w:space="0" w:color="7F7F7F"/>
@@ -4450,7 +4450,7 @@
         <w:trPr/>
         <w:tc>
           <w:tcPr>
-            <w:tcW w:w="2365" w:type="dxa"/>
+            <w:tcW w:w="2364" w:type="dxa"/>
             <w:tcBorders>
               <w:left w:val="single" w:sz="6" w:space="0" w:color="7F7F7F"/>
               <w:bottom w:val="single" w:sz="6" w:space="0" w:color="7F7F7F"/>
@@ -4481,7 +4481,7 @@
         </w:tc>
         <w:tc>
           <w:tcPr>
-            <w:tcW w:w="1541" w:type="dxa"/>
+            <w:tcW w:w="1542" w:type="dxa"/>
             <w:tcBorders>
               <w:left w:val="single" w:sz="6" w:space="0" w:color="7F7F7F"/>
               <w:bottom w:val="single" w:sz="6" w:space="0" w:color="7F7F7F"/>
@@ -4541,7 +4541,7 @@
         <w:trPr/>
         <w:tc>
           <w:tcPr>
-            <w:tcW w:w="2365" w:type="dxa"/>
+            <w:tcW w:w="2364" w:type="dxa"/>
             <w:tcBorders>
               <w:left w:val="single" w:sz="6" w:space="0" w:color="7F7F7F"/>
               <w:bottom w:val="single" w:sz="6" w:space="0" w:color="7F7F7F"/>
@@ -4574,7 +4574,7 @@
         </w:tc>
         <w:tc>
           <w:tcPr>
-            <w:tcW w:w="1541" w:type="dxa"/>
+            <w:tcW w:w="1542" w:type="dxa"/>
             <w:tcBorders>
               <w:left w:val="single" w:sz="6" w:space="0" w:color="7F7F7F"/>
               <w:bottom w:val="single" w:sz="6" w:space="0" w:color="7F7F7F"/>
@@ -5020,8 +5020,8 @@
         <w:tblLook w:firstRow="0" w:noVBand="1" w:lastRow="0" w:firstColumn="0" w:lastColumn="0" w:noHBand="1" w:val="0600"/>
       </w:tblPr>
       <w:tblGrid>
-        <w:gridCol w:w="2365"/>
-        <w:gridCol w:w="1541"/>
+        <w:gridCol w:w="2364"/>
+        <w:gridCol w:w="1542"/>
         <w:gridCol w:w="5394"/>
       </w:tblGrid>
       <w:tr>
@@ -5031,7 +5031,7 @@
         </w:trPr>
         <w:tc>
           <w:tcPr>
-            <w:tcW w:w="2365" w:type="dxa"/>
+            <w:tcW w:w="2364" w:type="dxa"/>
             <w:tcBorders>
               <w:top w:val="single" w:sz="6" w:space="0" w:color="7F7F7F"/>
               <w:left w:val="single" w:sz="6" w:space="0" w:color="7F7F7F"/>
@@ -5060,7 +5060,7 @@
         </w:tc>
         <w:tc>
           <w:tcPr>
-            <w:tcW w:w="1541" w:type="dxa"/>
+            <w:tcW w:w="1542" w:type="dxa"/>
             <w:tcBorders>
               <w:top w:val="single" w:sz="6" w:space="0" w:color="7F7F7F"/>
               <w:left w:val="single" w:sz="6" w:space="0" w:color="7F7F7F"/>
@@ -5125,7 +5125,7 @@
         <w:trPr/>
         <w:tc>
           <w:tcPr>
-            <w:tcW w:w="2365" w:type="dxa"/>
+            <w:tcW w:w="2364" w:type="dxa"/>
             <w:tcBorders>
               <w:top w:val="single" w:sz="6" w:space="0" w:color="7F7F7F"/>
               <w:left w:val="single" w:sz="6" w:space="0" w:color="7F7F7F"/>
@@ -5154,7 +5154,7 @@
         </w:tc>
         <w:tc>
           <w:tcPr>
-            <w:tcW w:w="1541" w:type="dxa"/>
+            <w:tcW w:w="1542" w:type="dxa"/>
             <w:tcBorders>
               <w:top w:val="single" w:sz="6" w:space="0" w:color="7F7F7F"/>
               <w:left w:val="single" w:sz="6" w:space="0" w:color="7F7F7F"/>
@@ -5213,7 +5213,7 @@
         <w:trPr/>
         <w:tc>
           <w:tcPr>
-            <w:tcW w:w="2365" w:type="dxa"/>
+            <w:tcW w:w="2364" w:type="dxa"/>
             <w:tcBorders>
               <w:top w:val="single" w:sz="6" w:space="0" w:color="7F7F7F"/>
               <w:left w:val="single" w:sz="6" w:space="0" w:color="7F7F7F"/>
@@ -5242,7 +5242,7 @@
         </w:tc>
         <w:tc>
           <w:tcPr>
-            <w:tcW w:w="1541" w:type="dxa"/>
+            <w:tcW w:w="1542" w:type="dxa"/>
             <w:tcBorders>
               <w:top w:val="single" w:sz="6" w:space="0" w:color="7F7F7F"/>
               <w:left w:val="single" w:sz="6" w:space="0" w:color="7F7F7F"/>
@@ -5301,7 +5301,7 @@
         <w:trPr/>
         <w:tc>
           <w:tcPr>
-            <w:tcW w:w="2365" w:type="dxa"/>
+            <w:tcW w:w="2364" w:type="dxa"/>
             <w:tcBorders>
               <w:left w:val="single" w:sz="6" w:space="0" w:color="7F7F7F"/>
               <w:bottom w:val="single" w:sz="6" w:space="0" w:color="7F7F7F"/>
@@ -5329,7 +5329,7 @@
         </w:tc>
         <w:tc>
           <w:tcPr>
-            <w:tcW w:w="1541" w:type="dxa"/>
+            <w:tcW w:w="1542" w:type="dxa"/>
             <w:tcBorders>
               <w:left w:val="single" w:sz="6" w:space="0" w:color="7F7F7F"/>
               <w:bottom w:val="single" w:sz="6" w:space="0" w:color="7F7F7F"/>
@@ -5386,7 +5386,7 @@
         <w:trPr/>
         <w:tc>
           <w:tcPr>
-            <w:tcW w:w="2365" w:type="dxa"/>
+            <w:tcW w:w="2364" w:type="dxa"/>
             <w:tcBorders>
               <w:left w:val="single" w:sz="6" w:space="0" w:color="7F7F7F"/>
               <w:bottom w:val="single" w:sz="6" w:space="0" w:color="7F7F7F"/>
@@ -5415,7 +5415,7 @@
         </w:tc>
         <w:tc>
           <w:tcPr>
-            <w:tcW w:w="1541" w:type="dxa"/>
+            <w:tcW w:w="1542" w:type="dxa"/>
             <w:tcBorders>
               <w:left w:val="single" w:sz="6" w:space="0" w:color="7F7F7F"/>
               <w:bottom w:val="single" w:sz="6" w:space="0" w:color="7F7F7F"/>
@@ -5475,7 +5475,7 @@
         <w:trPr/>
         <w:tc>
           <w:tcPr>
-            <w:tcW w:w="2365" w:type="dxa"/>
+            <w:tcW w:w="2364" w:type="dxa"/>
             <w:tcBorders>
               <w:left w:val="single" w:sz="6" w:space="0" w:color="7F7F7F"/>
               <w:bottom w:val="single" w:sz="6" w:space="0" w:color="7F7F7F"/>
@@ -5504,7 +5504,7 @@
         </w:tc>
         <w:tc>
           <w:tcPr>
-            <w:tcW w:w="1541" w:type="dxa"/>
+            <w:tcW w:w="1542" w:type="dxa"/>
             <w:tcBorders>
               <w:left w:val="single" w:sz="6" w:space="0" w:color="7F7F7F"/>
               <w:bottom w:val="single" w:sz="6" w:space="0" w:color="7F7F7F"/>
@@ -7908,6 +7908,2501 @@
         <w:rPr/>
       </w:r>
     </w:p>
+    <w:p>
+      <w:pPr>
+        <w:pStyle w:val="Ttulo1"/>
+        <w:spacing w:before="360" w:after="120"/>
+        <w:rPr>
+          <w:rFonts w:ascii="Calibri" w:hAnsi="Calibri" w:cs="Calibri" w:asciiTheme="majorHAnsi" w:cstheme="majorHAnsi" w:hAnsiTheme="majorHAnsi"/>
+          <w:sz w:val="22"/>
+          <w:szCs w:val="22"/>
+          <w:lang w:val="es-AR"/>
+        </w:rPr>
+      </w:pPr>
+      <w:bookmarkStart w:id="47" w:name="__RefHeading___Toc440_765352244_Copy_1"/>
+      <w:bookmarkEnd w:id="47"/>
+      <w:r>
+        <w:rPr/>
+        <w:t>1</w:t>
+      </w:r>
+      <w:r>
+        <w:rPr/>
+        <w:t>1</w:t>
+      </w:r>
+      <w:bookmarkStart w:id="48" w:name="_Toc230396131_Copy_2_Copy_1_Copy_1_Copy_"/>
+      <w:r>
+        <w:rPr/>
+        <w:t>.</w:t>
+      </w:r>
+      <w:bookmarkEnd w:id="48"/>
+      <w:r>
+        <w:rPr/>
+        <w:t xml:space="preserve"> </w:t>
+      </w:r>
+      <w:r>
+        <w:rPr/>
+        <w:t>LÍNEAS BASE</w:t>
+      </w:r>
+    </w:p>
+    <w:p>
+      <w:pPr>
+        <w:pStyle w:val="Normal"/>
+        <w:jc w:val="both"/>
+        <w:rPr/>
+      </w:pPr>
+      <w:r>
+        <w:rPr/>
+        <w:t xml:space="preserve">Esta sección describe los hitos formales del proyecto en los que un conjunto de Elementos de Configuración fue revisado, aprobado y establecido como referencia estable. </w:t>
+      </w:r>
+    </w:p>
+    <w:p>
+      <w:pPr>
+        <w:pStyle w:val="Normal"/>
+        <w:jc w:val="both"/>
+        <w:rPr/>
+      </w:pPr>
+      <w:r>
+        <w:rPr/>
+      </w:r>
+    </w:p>
+    <w:p>
+      <w:pPr>
+        <w:pStyle w:val="Normal"/>
+        <w:jc w:val="both"/>
+        <w:rPr/>
+      </w:pPr>
+      <w:r>
+        <w:rPr/>
+        <w:t>A partir de cada línea base, cualquier modificación sobre los ECs incluidos debe seguir el proceso de control de cambios definido en el SCM (EC-SCM), registrándose como Issue en GitHub y siendo aprobada por ambos integrantes antes de su implementación.</w:t>
+      </w:r>
+    </w:p>
+    <w:p>
+      <w:pPr>
+        <w:pStyle w:val="Normal"/>
+        <w:jc w:val="both"/>
+        <w:rPr/>
+      </w:pPr>
+      <w:r>
+        <w:rPr/>
+        <w:br/>
+        <w:t>El proyecto define cuatro líneas base, de las cuales las tres primeras corresponden a iteraciones ya completadas o en curso. La tabla de la sección siguiente detalla qué ECs fueron entregados en cada hito.</w:t>
+      </w:r>
+    </w:p>
+    <w:p>
+      <w:pPr>
+        <w:pStyle w:val="Normal"/>
+        <w:jc w:val="both"/>
+        <w:rPr/>
+      </w:pPr>
+      <w:r>
+        <w:rPr/>
+        <w:br/>
+        <w:t>BL-DOC-01 (v0.1) corresponde a la primera entrega formal de documentación. Incluye los documentos de análisis, diseño y planificación básica: visión y alcance, requerimientos, modelo de datos, plan de proyecto y plan de gestión de configuración. Establece el alcance del sistema y las bases del proceso de desarrollo.</w:t>
+      </w:r>
+    </w:p>
+    <w:p>
+      <w:pPr>
+        <w:pStyle w:val="Normal"/>
+        <w:jc w:val="both"/>
+        <w:rPr/>
+      </w:pPr>
+      <w:r>
+        <w:rPr/>
+        <w:br/>
+        <w:t>BL-DOC-02 (v0.2) incorpora la documentación completa del proyecto. Agrega los estándares de documentación y programación, el plan de gestión de riesgos con su anexo, y el plan de SQA. A partir de esta línea base el alcance del proyecto está completamente definido y cualquier cambio sobre los requerimientos o el diseño debe pasar por control de cambios.</w:t>
+      </w:r>
+    </w:p>
+    <w:p>
+      <w:pPr>
+        <w:pStyle w:val="Normal"/>
+        <w:jc w:val="both"/>
+        <w:rPr/>
+      </w:pPr>
+      <w:r>
+        <w:rPr/>
+        <w:br/>
+        <w:t>BL-CODE (v1.0) corresponde al primer prototipo funcional del sistema. Incluye el script de base de datos y el código fuente PHP con el CU-01 (catálogo público) implementado. Es la primera línea base que incorpora elementos de código bajo control de configuración.</w:t>
+      </w:r>
+    </w:p>
+    <w:p>
+      <w:pPr>
+        <w:pStyle w:val="Normal"/>
+        <w:jc w:val="both"/>
+        <w:rPr/>
+      </w:pPr>
+      <w:r>
+        <w:rPr/>
+        <w:br/>
+        <w:t>BL-ENTREGA (v1.1) es la línea base final, prevista para el cierre del proyecto. Incluirá la totalidad de los ECs — código fuente completo con todos los casos de uso implementados, revisión de SQA e informe final — en condiciones de ser empaquetada y entregada.</w:t>
+      </w:r>
+    </w:p>
+    <w:p>
+      <w:pPr>
+        <w:pStyle w:val="Normal"/>
+        <w:jc w:val="both"/>
+        <w:rPr/>
+      </w:pPr>
+      <w:r>
+        <w:rPr/>
+      </w:r>
+    </w:p>
+    <w:p>
+      <w:pPr>
+        <w:pStyle w:val="Normal"/>
+        <w:jc w:val="both"/>
+        <w:rPr/>
+      </w:pPr>
+      <w:r>
+        <w:rPr/>
+      </w:r>
+    </w:p>
+    <w:p>
+      <w:pPr>
+        <w:pStyle w:val="Normal"/>
+        <w:jc w:val="both"/>
+        <w:rPr/>
+      </w:pPr>
+      <w:r>
+        <w:rPr/>
+      </w:r>
+    </w:p>
+    <w:p>
+      <w:pPr>
+        <w:pStyle w:val="Normal"/>
+        <w:jc w:val="both"/>
+        <w:rPr/>
+      </w:pPr>
+      <w:r>
+        <w:rPr/>
+      </w:r>
+    </w:p>
+    <w:p>
+      <w:pPr>
+        <w:pStyle w:val="Normal"/>
+        <w:jc w:val="both"/>
+        <w:rPr/>
+      </w:pPr>
+      <w:r>
+        <w:rPr/>
+      </w:r>
+    </w:p>
+    <w:p>
+      <w:pPr>
+        <w:pStyle w:val="Contenidodelatabla"/>
+        <w:jc w:val="left"/>
+        <w:rPr/>
+      </w:pPr>
+      <w:r>
+        <w:rPr>
+          <w:caps w:val="false"/>
+          <w:smallCaps w:val="false"/>
+          <w:color w:val="0F6E56"/>
+          <w:spacing w:val="0"/>
+        </w:rPr>
+        <w:t>✓</w:t>
+      </w:r>
+      <w:r>
+        <w:rPr/>
+        <w:t xml:space="preserve"> </w:t>
+      </w:r>
+      <w:r>
+        <w:rPr/>
+        <w:t xml:space="preserve">: </w:t>
+      </w:r>
+      <w:r>
+        <w:rPr/>
+        <w:t>Incorporado en esta línea base</w:t>
+        <w:br/>
+      </w:r>
+      <w:r>
+        <w:rPr>
+          <w:b w:val="false"/>
+          <w:bCs w:val="false"/>
+          <w:color w:val="008AFF"/>
+        </w:rPr>
+        <w:t>○</w:t>
+      </w:r>
+      <w:r>
+        <w:rPr>
+          <w:b/>
+          <w:bCs/>
+          <w:color w:val="008AFF"/>
+        </w:rPr>
+        <w:t xml:space="preserve"> </w:t>
+      </w:r>
+      <w:r>
+        <w:rPr/>
+        <w:t xml:space="preserve">  : Presente desde la línea base anterior</w:t>
+      </w:r>
+    </w:p>
+    <w:p>
+      <w:pPr>
+        <w:pStyle w:val="Contenidodelatabla"/>
+        <w:jc w:val="left"/>
+        <w:rPr/>
+      </w:pPr>
+      <w:r>
+        <w:rPr>
+          <w:b/>
+          <w:bCs/>
+          <w:caps w:val="false"/>
+          <w:smallCaps w:val="false"/>
+          <w:color w:val="auto"/>
+          <w:spacing w:val="0"/>
+        </w:rPr>
+        <w:t>—</w:t>
+      </w:r>
+      <w:r>
+        <w:rPr/>
+        <w:t xml:space="preserve">  </w:t>
+      </w:r>
+      <w:r>
+        <w:rPr/>
+        <w:t xml:space="preserve">: </w:t>
+      </w:r>
+      <w:r>
+        <w:rPr/>
+        <w:t>No incluido</w:t>
+      </w:r>
+    </w:p>
+    <w:p>
+      <w:pPr>
+        <w:pStyle w:val="Normal"/>
+        <w:jc w:val="both"/>
+        <w:rPr/>
+      </w:pPr>
+      <w:r>
+        <w:rPr/>
+      </w:r>
+    </w:p>
+    <w:tbl>
+      <w:tblPr>
+        <w:tblW w:w="5000" w:type="pct"/>
+        <w:jc w:val="left"/>
+        <w:tblInd w:w="-5" w:type="dxa"/>
+        <w:tblLayout w:type="fixed"/>
+        <w:tblCellMar>
+          <w:top w:w="55" w:type="dxa"/>
+          <w:left w:w="55" w:type="dxa"/>
+          <w:bottom w:w="55" w:type="dxa"/>
+          <w:right w:w="55" w:type="dxa"/>
+        </w:tblCellMar>
+      </w:tblPr>
+      <w:tblGrid>
+        <w:gridCol w:w="4991"/>
+        <w:gridCol w:w="1473"/>
+        <w:gridCol w:w="1472"/>
+        <w:gridCol w:w="1424"/>
+      </w:tblGrid>
+      <w:tr>
+        <w:trPr/>
+        <w:tc>
+          <w:tcPr>
+            <w:tcW w:w="4991" w:type="dxa"/>
+            <w:tcBorders>
+              <w:top w:val="single" w:sz="4" w:space="0" w:color="000000"/>
+              <w:left w:val="single" w:sz="4" w:space="0" w:color="000000"/>
+              <w:bottom w:val="single" w:sz="4" w:space="0" w:color="000000"/>
+            </w:tcBorders>
+          </w:tcPr>
+          <w:p>
+            <w:pPr>
+              <w:pStyle w:val="Contenidodelatabla"/>
+              <w:spacing w:lineRule="auto" w:line="240"/>
+              <w:rPr/>
+            </w:pPr>
+            <w:r>
+              <w:rPr/>
+              <w:t>Elemento de configuración</w:t>
+            </w:r>
+          </w:p>
+        </w:tc>
+        <w:tc>
+          <w:tcPr>
+            <w:tcW w:w="1473" w:type="dxa"/>
+            <w:tcBorders>
+              <w:top w:val="single" w:sz="4" w:space="0" w:color="000000"/>
+              <w:left w:val="single" w:sz="4" w:space="0" w:color="000000"/>
+              <w:bottom w:val="single" w:sz="4" w:space="0" w:color="000000"/>
+            </w:tcBorders>
+          </w:tcPr>
+          <w:p>
+            <w:pPr>
+              <w:pStyle w:val="Contenidodelatabla"/>
+              <w:spacing w:lineRule="auto" w:line="240"/>
+              <w:jc w:val="center"/>
+              <w:rPr/>
+            </w:pPr>
+            <w:r>
+              <w:rPr/>
+              <w:t>BL-DOC-01</w:t>
+            </w:r>
+          </w:p>
+        </w:tc>
+        <w:tc>
+          <w:tcPr>
+            <w:tcW w:w="1472" w:type="dxa"/>
+            <w:tcBorders>
+              <w:top w:val="single" w:sz="4" w:space="0" w:color="000000"/>
+              <w:left w:val="single" w:sz="4" w:space="0" w:color="000000"/>
+              <w:bottom w:val="single" w:sz="4" w:space="0" w:color="000000"/>
+            </w:tcBorders>
+          </w:tcPr>
+          <w:p>
+            <w:pPr>
+              <w:pStyle w:val="Contenidodelatabla"/>
+              <w:spacing w:lineRule="auto" w:line="240"/>
+              <w:jc w:val="center"/>
+              <w:rPr/>
+            </w:pPr>
+            <w:r>
+              <w:rPr/>
+              <w:t>BL-DOC-02</w:t>
+            </w:r>
+          </w:p>
+        </w:tc>
+        <w:tc>
+          <w:tcPr>
+            <w:tcW w:w="1424" w:type="dxa"/>
+            <w:tcBorders>
+              <w:top w:val="single" w:sz="4" w:space="0" w:color="000000"/>
+              <w:left w:val="single" w:sz="4" w:space="0" w:color="000000"/>
+              <w:bottom w:val="single" w:sz="4" w:space="0" w:color="000000"/>
+              <w:right w:val="single" w:sz="4" w:space="0" w:color="000000"/>
+            </w:tcBorders>
+          </w:tcPr>
+          <w:p>
+            <w:pPr>
+              <w:pStyle w:val="Contenidodelatabla"/>
+              <w:spacing w:lineRule="auto" w:line="240"/>
+              <w:jc w:val="center"/>
+              <w:rPr/>
+            </w:pPr>
+            <w:r>
+              <w:rPr/>
+              <w:t>BL-CODE</w:t>
+            </w:r>
+          </w:p>
+        </w:tc>
+      </w:tr>
+      <w:tr>
+        <w:trPr/>
+        <w:tc>
+          <w:tcPr>
+            <w:tcW w:w="9360" w:type="dxa"/>
+            <w:gridSpan w:val="4"/>
+            <w:tcBorders>
+              <w:left w:val="single" w:sz="4" w:space="0" w:color="000000"/>
+              <w:bottom w:val="single" w:sz="4" w:space="0" w:color="000000"/>
+              <w:right w:val="single" w:sz="4" w:space="0" w:color="000000"/>
+            </w:tcBorders>
+            <w:shd w:fill="D3D3D3" w:val="clear"/>
+          </w:tcPr>
+          <w:p>
+            <w:pPr>
+              <w:pStyle w:val="Contenidodelatabla"/>
+              <w:spacing w:lineRule="auto" w:line="240"/>
+              <w:rPr>
+                <w:b/>
+                <w:bCs/>
+                <w:sz w:val="20"/>
+                <w:szCs w:val="20"/>
+              </w:rPr>
+            </w:pPr>
+            <w:r>
+              <w:rPr>
+                <w:b/>
+                <w:bCs/>
+                <w:sz w:val="20"/>
+                <w:szCs w:val="20"/>
+              </w:rPr>
+              <w:t>ANÁLISIS</w:t>
+            </w:r>
+          </w:p>
+        </w:tc>
+      </w:tr>
+      <w:tr>
+        <w:trPr/>
+        <w:tc>
+          <w:tcPr>
+            <w:tcW w:w="4991" w:type="dxa"/>
+            <w:tcBorders>
+              <w:left w:val="single" w:sz="4" w:space="0" w:color="000000"/>
+              <w:bottom w:val="single" w:sz="4" w:space="0" w:color="000000"/>
+            </w:tcBorders>
+          </w:tcPr>
+          <w:p>
+            <w:pPr>
+              <w:pStyle w:val="Contenidodelatabla"/>
+              <w:spacing w:lineRule="auto" w:line="240"/>
+              <w:rPr/>
+            </w:pPr>
+            <w:r>
+              <w:rPr/>
+              <w:t>EC-VIS (Visión y alcance)</w:t>
+            </w:r>
+          </w:p>
+        </w:tc>
+        <w:tc>
+          <w:tcPr>
+            <w:tcW w:w="1473" w:type="dxa"/>
+            <w:tcBorders>
+              <w:left w:val="single" w:sz="4" w:space="0" w:color="000000"/>
+              <w:bottom w:val="single" w:sz="4" w:space="0" w:color="000000"/>
+            </w:tcBorders>
+            <w:shd w:fill="98FB98" w:val="clear"/>
+          </w:tcPr>
+          <w:p>
+            <w:pPr>
+              <w:pStyle w:val="Contenidodelatabla"/>
+              <w:spacing w:lineRule="auto" w:line="240"/>
+              <w:jc w:val="center"/>
+              <w:rPr>
+                <w:b/>
+                <w:bCs/>
+              </w:rPr>
+            </w:pPr>
+            <w:r>
+              <w:rPr>
+                <w:b/>
+                <w:bCs/>
+                <w:caps w:val="false"/>
+                <w:smallCaps w:val="false"/>
+                <w:color w:val="0F6E56"/>
+                <w:spacing w:val="0"/>
+              </w:rPr>
+              <w:t>✓</w:t>
+            </w:r>
+            <w:r>
+              <w:rPr>
+                <w:b/>
+                <w:bCs/>
+              </w:rPr>
+              <w:t xml:space="preserve"> </w:t>
+            </w:r>
+          </w:p>
+        </w:tc>
+        <w:tc>
+          <w:tcPr>
+            <w:tcW w:w="1472" w:type="dxa"/>
+            <w:tcBorders>
+              <w:left w:val="single" w:sz="4" w:space="0" w:color="000000"/>
+              <w:bottom w:val="single" w:sz="4" w:space="0" w:color="000000"/>
+            </w:tcBorders>
+            <w:shd w:fill="B0E0E6" w:val="clear"/>
+          </w:tcPr>
+          <w:p>
+            <w:pPr>
+              <w:pStyle w:val="Contenidodelatabla"/>
+              <w:spacing w:lineRule="auto" w:line="240"/>
+              <w:jc w:val="center"/>
+              <w:rPr/>
+            </w:pPr>
+            <w:r>
+              <w:rPr>
+                <w:b/>
+                <w:bCs/>
+                <w:color w:val="008AFF"/>
+              </w:rPr>
+              <w:t xml:space="preserve">○ </w:t>
+            </w:r>
+          </w:p>
+        </w:tc>
+        <w:tc>
+          <w:tcPr>
+            <w:tcW w:w="1424" w:type="dxa"/>
+            <w:tcBorders>
+              <w:left w:val="single" w:sz="4" w:space="0" w:color="000000"/>
+              <w:bottom w:val="single" w:sz="4" w:space="0" w:color="000000"/>
+              <w:right w:val="single" w:sz="4" w:space="0" w:color="000000"/>
+            </w:tcBorders>
+            <w:shd w:fill="B0E0E6" w:val="clear"/>
+          </w:tcPr>
+          <w:p>
+            <w:pPr>
+              <w:pStyle w:val="Contenidodelatabla"/>
+              <w:spacing w:lineRule="auto" w:line="240"/>
+              <w:jc w:val="center"/>
+              <w:rPr/>
+            </w:pPr>
+            <w:r>
+              <w:rPr>
+                <w:b/>
+                <w:bCs/>
+                <w:color w:val="008AFF"/>
+              </w:rPr>
+              <w:t xml:space="preserve">○ </w:t>
+            </w:r>
+          </w:p>
+        </w:tc>
+      </w:tr>
+      <w:tr>
+        <w:trPr/>
+        <w:tc>
+          <w:tcPr>
+            <w:tcW w:w="4991" w:type="dxa"/>
+            <w:tcBorders>
+              <w:left w:val="single" w:sz="4" w:space="0" w:color="000000"/>
+              <w:bottom w:val="single" w:sz="4" w:space="0" w:color="000000"/>
+            </w:tcBorders>
+          </w:tcPr>
+          <w:p>
+            <w:pPr>
+              <w:pStyle w:val="Contenidodelatabla"/>
+              <w:spacing w:lineRule="auto" w:line="240"/>
+              <w:rPr/>
+            </w:pPr>
+            <w:r>
+              <w:rPr/>
+              <w:t>EC-REQ (Requerimientos)</w:t>
+            </w:r>
+          </w:p>
+        </w:tc>
+        <w:tc>
+          <w:tcPr>
+            <w:tcW w:w="1473" w:type="dxa"/>
+            <w:tcBorders>
+              <w:left w:val="single" w:sz="4" w:space="0" w:color="000000"/>
+              <w:bottom w:val="single" w:sz="4" w:space="0" w:color="000000"/>
+            </w:tcBorders>
+            <w:shd w:fill="98FB98" w:val="clear"/>
+          </w:tcPr>
+          <w:p>
+            <w:pPr>
+              <w:pStyle w:val="Contenidodelatabla"/>
+              <w:spacing w:lineRule="auto" w:line="240"/>
+              <w:jc w:val="center"/>
+              <w:rPr>
+                <w:b/>
+                <w:bCs/>
+              </w:rPr>
+            </w:pPr>
+            <w:r>
+              <w:rPr>
+                <w:b/>
+                <w:bCs/>
+                <w:caps w:val="false"/>
+                <w:smallCaps w:val="false"/>
+                <w:color w:val="0F6E56"/>
+                <w:spacing w:val="0"/>
+              </w:rPr>
+              <w:t>✓</w:t>
+            </w:r>
+            <w:r>
+              <w:rPr>
+                <w:b/>
+                <w:bCs/>
+              </w:rPr>
+              <w:t xml:space="preserve"> </w:t>
+            </w:r>
+          </w:p>
+        </w:tc>
+        <w:tc>
+          <w:tcPr>
+            <w:tcW w:w="1472" w:type="dxa"/>
+            <w:tcBorders>
+              <w:left w:val="single" w:sz="4" w:space="0" w:color="000000"/>
+              <w:bottom w:val="single" w:sz="4" w:space="0" w:color="000000"/>
+            </w:tcBorders>
+            <w:shd w:fill="B0E0E6" w:val="clear"/>
+          </w:tcPr>
+          <w:p>
+            <w:pPr>
+              <w:pStyle w:val="Contenidodelatabla"/>
+              <w:spacing w:lineRule="auto" w:line="240"/>
+              <w:jc w:val="center"/>
+              <w:rPr/>
+            </w:pPr>
+            <w:r>
+              <w:rPr>
+                <w:b/>
+                <w:bCs/>
+                <w:color w:val="008AFF"/>
+              </w:rPr>
+              <w:t xml:space="preserve">○ </w:t>
+            </w:r>
+          </w:p>
+        </w:tc>
+        <w:tc>
+          <w:tcPr>
+            <w:tcW w:w="1424" w:type="dxa"/>
+            <w:tcBorders>
+              <w:left w:val="single" w:sz="4" w:space="0" w:color="000000"/>
+              <w:bottom w:val="single" w:sz="4" w:space="0" w:color="000000"/>
+              <w:right w:val="single" w:sz="4" w:space="0" w:color="000000"/>
+            </w:tcBorders>
+            <w:shd w:fill="B0E0E6" w:val="clear"/>
+          </w:tcPr>
+          <w:p>
+            <w:pPr>
+              <w:pStyle w:val="Contenidodelatabla"/>
+              <w:spacing w:lineRule="auto" w:line="240"/>
+              <w:jc w:val="center"/>
+              <w:rPr/>
+            </w:pPr>
+            <w:r>
+              <w:rPr>
+                <w:b/>
+                <w:bCs/>
+                <w:color w:val="008AFF"/>
+              </w:rPr>
+              <w:t xml:space="preserve">○ </w:t>
+            </w:r>
+          </w:p>
+        </w:tc>
+      </w:tr>
+      <w:tr>
+        <w:trPr/>
+        <w:tc>
+          <w:tcPr>
+            <w:tcW w:w="9360" w:type="dxa"/>
+            <w:gridSpan w:val="4"/>
+            <w:tcBorders>
+              <w:left w:val="single" w:sz="4" w:space="0" w:color="000000"/>
+              <w:bottom w:val="single" w:sz="4" w:space="0" w:color="000000"/>
+              <w:right w:val="single" w:sz="4" w:space="0" w:color="000000"/>
+            </w:tcBorders>
+            <w:shd w:fill="D3D3D3" w:val="clear"/>
+          </w:tcPr>
+          <w:p>
+            <w:pPr>
+              <w:pStyle w:val="Contenidodelatabla"/>
+              <w:spacing w:lineRule="auto" w:line="240"/>
+              <w:rPr>
+                <w:b/>
+                <w:bCs/>
+                <w:sz w:val="20"/>
+                <w:szCs w:val="20"/>
+              </w:rPr>
+            </w:pPr>
+            <w:r>
+              <w:rPr>
+                <w:b/>
+                <w:bCs/>
+                <w:sz w:val="20"/>
+                <w:szCs w:val="20"/>
+              </w:rPr>
+              <w:t>DISEÑO</w:t>
+            </w:r>
+          </w:p>
+        </w:tc>
+      </w:tr>
+      <w:tr>
+        <w:trPr/>
+        <w:tc>
+          <w:tcPr>
+            <w:tcW w:w="4991" w:type="dxa"/>
+            <w:tcBorders>
+              <w:left w:val="single" w:sz="4" w:space="0" w:color="000000"/>
+              <w:bottom w:val="single" w:sz="4" w:space="0" w:color="000000"/>
+            </w:tcBorders>
+          </w:tcPr>
+          <w:p>
+            <w:pPr>
+              <w:pStyle w:val="Contenidodelatabla"/>
+              <w:spacing w:lineRule="auto" w:line="240"/>
+              <w:rPr/>
+            </w:pPr>
+            <w:r>
+              <w:rPr/>
+              <w:t>EC-DAT (Modelo de datos)</w:t>
+            </w:r>
+          </w:p>
+        </w:tc>
+        <w:tc>
+          <w:tcPr>
+            <w:tcW w:w="1473" w:type="dxa"/>
+            <w:tcBorders>
+              <w:left w:val="single" w:sz="4" w:space="0" w:color="000000"/>
+              <w:bottom w:val="single" w:sz="4" w:space="0" w:color="000000"/>
+            </w:tcBorders>
+            <w:shd w:fill="98FB98" w:val="clear"/>
+          </w:tcPr>
+          <w:p>
+            <w:pPr>
+              <w:pStyle w:val="Contenidodelatabla"/>
+              <w:spacing w:lineRule="auto" w:line="240"/>
+              <w:jc w:val="center"/>
+              <w:rPr>
+                <w:b/>
+                <w:bCs/>
+              </w:rPr>
+            </w:pPr>
+            <w:r>
+              <w:rPr>
+                <w:b/>
+                <w:bCs/>
+                <w:caps w:val="false"/>
+                <w:smallCaps w:val="false"/>
+                <w:color w:val="0F6E56"/>
+                <w:spacing w:val="0"/>
+              </w:rPr>
+              <w:t>✓</w:t>
+            </w:r>
+          </w:p>
+        </w:tc>
+        <w:tc>
+          <w:tcPr>
+            <w:tcW w:w="1472" w:type="dxa"/>
+            <w:tcBorders>
+              <w:left w:val="single" w:sz="4" w:space="0" w:color="000000"/>
+              <w:bottom w:val="single" w:sz="4" w:space="0" w:color="000000"/>
+            </w:tcBorders>
+            <w:shd w:fill="B0E0E6" w:val="clear"/>
+          </w:tcPr>
+          <w:p>
+            <w:pPr>
+              <w:pStyle w:val="Contenidodelatabla"/>
+              <w:spacing w:lineRule="auto" w:line="240"/>
+              <w:jc w:val="center"/>
+              <w:rPr/>
+            </w:pPr>
+            <w:r>
+              <w:rPr>
+                <w:b/>
+                <w:bCs/>
+                <w:color w:val="008AFF"/>
+              </w:rPr>
+              <w:t xml:space="preserve">○ </w:t>
+            </w:r>
+          </w:p>
+        </w:tc>
+        <w:tc>
+          <w:tcPr>
+            <w:tcW w:w="1424" w:type="dxa"/>
+            <w:tcBorders>
+              <w:left w:val="single" w:sz="4" w:space="0" w:color="000000"/>
+              <w:bottom w:val="single" w:sz="4" w:space="0" w:color="000000"/>
+              <w:right w:val="single" w:sz="4" w:space="0" w:color="000000"/>
+            </w:tcBorders>
+            <w:shd w:fill="B0E0E6" w:val="clear"/>
+          </w:tcPr>
+          <w:p>
+            <w:pPr>
+              <w:pStyle w:val="Contenidodelatabla"/>
+              <w:spacing w:lineRule="auto" w:line="240"/>
+              <w:jc w:val="center"/>
+              <w:rPr/>
+            </w:pPr>
+            <w:r>
+              <w:rPr>
+                <w:b/>
+                <w:bCs/>
+                <w:color w:val="008AFF"/>
+              </w:rPr>
+              <w:t xml:space="preserve">○ </w:t>
+            </w:r>
+          </w:p>
+        </w:tc>
+      </w:tr>
+      <w:tr>
+        <w:trPr/>
+        <w:tc>
+          <w:tcPr>
+            <w:tcW w:w="4991" w:type="dxa"/>
+            <w:tcBorders>
+              <w:left w:val="single" w:sz="4" w:space="0" w:color="000000"/>
+              <w:bottom w:val="single" w:sz="4" w:space="0" w:color="000000"/>
+            </w:tcBorders>
+          </w:tcPr>
+          <w:p>
+            <w:pPr>
+              <w:pStyle w:val="Contenidodelatabla"/>
+              <w:spacing w:lineRule="auto" w:line="240"/>
+              <w:rPr/>
+            </w:pPr>
+            <w:r>
+              <w:rPr/>
+              <w:t>EC-DIS (Documento de diseño – Arq. del Sistema)</w:t>
+            </w:r>
+          </w:p>
+        </w:tc>
+        <w:tc>
+          <w:tcPr>
+            <w:tcW w:w="1473" w:type="dxa"/>
+            <w:tcBorders>
+              <w:left w:val="single" w:sz="4" w:space="0" w:color="000000"/>
+              <w:bottom w:val="single" w:sz="4" w:space="0" w:color="000000"/>
+            </w:tcBorders>
+            <w:shd w:fill="FFFFFF" w:val="clear"/>
+          </w:tcPr>
+          <w:p>
+            <w:pPr>
+              <w:pStyle w:val="Contenidodelatabla"/>
+              <w:spacing w:lineRule="auto" w:line="240"/>
+              <w:jc w:val="center"/>
+              <w:rPr>
+                <w:b/>
+                <w:bCs/>
+              </w:rPr>
+            </w:pPr>
+            <w:r>
+              <w:rPr>
+                <w:b/>
+                <w:bCs/>
+                <w:caps w:val="false"/>
+                <w:smallCaps w:val="false"/>
+                <w:color w:val="auto"/>
+                <w:spacing w:val="0"/>
+              </w:rPr>
+              <w:t>—</w:t>
+            </w:r>
+          </w:p>
+        </w:tc>
+        <w:tc>
+          <w:tcPr>
+            <w:tcW w:w="1472" w:type="dxa"/>
+            <w:tcBorders>
+              <w:left w:val="single" w:sz="4" w:space="0" w:color="000000"/>
+              <w:bottom w:val="single" w:sz="4" w:space="0" w:color="000000"/>
+            </w:tcBorders>
+            <w:shd w:fill="FFFFFF" w:val="clear"/>
+          </w:tcPr>
+          <w:p>
+            <w:pPr>
+              <w:pStyle w:val="Contenidodelatabla"/>
+              <w:spacing w:lineRule="auto" w:line="240"/>
+              <w:jc w:val="center"/>
+              <w:rPr/>
+            </w:pPr>
+            <w:r>
+              <w:rPr>
+                <w:b/>
+                <w:bCs/>
+                <w:caps w:val="false"/>
+                <w:smallCaps w:val="false"/>
+                <w:color w:val="auto"/>
+                <w:spacing w:val="0"/>
+              </w:rPr>
+              <w:t>—</w:t>
+            </w:r>
+          </w:p>
+        </w:tc>
+        <w:tc>
+          <w:tcPr>
+            <w:tcW w:w="1424" w:type="dxa"/>
+            <w:tcBorders>
+              <w:left w:val="single" w:sz="4" w:space="0" w:color="000000"/>
+              <w:bottom w:val="single" w:sz="4" w:space="0" w:color="000000"/>
+              <w:right w:val="single" w:sz="4" w:space="0" w:color="000000"/>
+            </w:tcBorders>
+            <w:shd w:fill="98FB98" w:val="clear"/>
+          </w:tcPr>
+          <w:p>
+            <w:pPr>
+              <w:pStyle w:val="Contenidodelatabla"/>
+              <w:spacing w:lineRule="auto" w:line="240"/>
+              <w:jc w:val="center"/>
+              <w:rPr>
+                <w:b/>
+                <w:bCs/>
+              </w:rPr>
+            </w:pPr>
+            <w:r>
+              <w:rPr>
+                <w:b/>
+                <w:bCs/>
+                <w:caps w:val="false"/>
+                <w:smallCaps w:val="false"/>
+                <w:color w:val="0F6E56"/>
+                <w:spacing w:val="0"/>
+              </w:rPr>
+              <w:t>✓</w:t>
+            </w:r>
+          </w:p>
+        </w:tc>
+      </w:tr>
+      <w:tr>
+        <w:trPr/>
+        <w:tc>
+          <w:tcPr>
+            <w:tcW w:w="9360" w:type="dxa"/>
+            <w:gridSpan w:val="4"/>
+            <w:tcBorders>
+              <w:left w:val="single" w:sz="4" w:space="0" w:color="000000"/>
+              <w:bottom w:val="single" w:sz="4" w:space="0" w:color="000000"/>
+              <w:right w:val="single" w:sz="4" w:space="0" w:color="000000"/>
+            </w:tcBorders>
+            <w:shd w:fill="D3D3D3" w:val="clear"/>
+          </w:tcPr>
+          <w:p>
+            <w:pPr>
+              <w:pStyle w:val="Contenidodelatabla"/>
+              <w:spacing w:lineRule="auto" w:line="240"/>
+              <w:rPr>
+                <w:b/>
+                <w:bCs/>
+                <w:sz w:val="20"/>
+                <w:szCs w:val="20"/>
+              </w:rPr>
+            </w:pPr>
+            <w:r>
+              <w:rPr>
+                <w:b/>
+                <w:bCs/>
+                <w:sz w:val="20"/>
+                <w:szCs w:val="20"/>
+              </w:rPr>
+              <w:t>PLANIFICACIÓN Y GESTIÓN</w:t>
+            </w:r>
+          </w:p>
+        </w:tc>
+      </w:tr>
+      <w:tr>
+        <w:trPr/>
+        <w:tc>
+          <w:tcPr>
+            <w:tcW w:w="4991" w:type="dxa"/>
+            <w:tcBorders>
+              <w:left w:val="single" w:sz="4" w:space="0" w:color="000000"/>
+              <w:bottom w:val="single" w:sz="4" w:space="0" w:color="000000"/>
+            </w:tcBorders>
+          </w:tcPr>
+          <w:p>
+            <w:pPr>
+              <w:pStyle w:val="Contenidodelatabla"/>
+              <w:spacing w:lineRule="auto" w:line="240"/>
+              <w:rPr/>
+            </w:pPr>
+            <w:r>
+              <w:rPr/>
+              <w:t>EC-PLN (Plan de proyecto)</w:t>
+            </w:r>
+          </w:p>
+        </w:tc>
+        <w:tc>
+          <w:tcPr>
+            <w:tcW w:w="1473" w:type="dxa"/>
+            <w:tcBorders>
+              <w:left w:val="single" w:sz="4" w:space="0" w:color="000000"/>
+              <w:bottom w:val="single" w:sz="4" w:space="0" w:color="000000"/>
+            </w:tcBorders>
+            <w:shd w:fill="98FB98" w:val="clear"/>
+          </w:tcPr>
+          <w:p>
+            <w:pPr>
+              <w:pStyle w:val="Contenidodelatabla"/>
+              <w:spacing w:lineRule="auto" w:line="240"/>
+              <w:jc w:val="center"/>
+              <w:rPr>
+                <w:b/>
+                <w:bCs/>
+              </w:rPr>
+            </w:pPr>
+            <w:r>
+              <w:rPr>
+                <w:b/>
+                <w:bCs/>
+                <w:caps w:val="false"/>
+                <w:smallCaps w:val="false"/>
+                <w:color w:val="0F6E56"/>
+                <w:spacing w:val="0"/>
+              </w:rPr>
+              <w:t>✓</w:t>
+            </w:r>
+          </w:p>
+        </w:tc>
+        <w:tc>
+          <w:tcPr>
+            <w:tcW w:w="1472" w:type="dxa"/>
+            <w:tcBorders>
+              <w:left w:val="single" w:sz="4" w:space="0" w:color="000000"/>
+              <w:bottom w:val="single" w:sz="4" w:space="0" w:color="000000"/>
+            </w:tcBorders>
+            <w:shd w:fill="B0E0E6" w:val="clear"/>
+          </w:tcPr>
+          <w:p>
+            <w:pPr>
+              <w:pStyle w:val="Contenidodelatabla"/>
+              <w:spacing w:lineRule="auto" w:line="240"/>
+              <w:jc w:val="center"/>
+              <w:rPr/>
+            </w:pPr>
+            <w:r>
+              <w:rPr>
+                <w:b/>
+                <w:bCs/>
+                <w:color w:val="008AFF"/>
+              </w:rPr>
+              <w:t xml:space="preserve">○ </w:t>
+            </w:r>
+          </w:p>
+        </w:tc>
+        <w:tc>
+          <w:tcPr>
+            <w:tcW w:w="1424" w:type="dxa"/>
+            <w:tcBorders>
+              <w:left w:val="single" w:sz="4" w:space="0" w:color="000000"/>
+              <w:bottom w:val="single" w:sz="4" w:space="0" w:color="000000"/>
+              <w:right w:val="single" w:sz="4" w:space="0" w:color="000000"/>
+            </w:tcBorders>
+            <w:shd w:fill="B0E0E6" w:val="clear"/>
+          </w:tcPr>
+          <w:p>
+            <w:pPr>
+              <w:pStyle w:val="Contenidodelatabla"/>
+              <w:spacing w:lineRule="auto" w:line="240"/>
+              <w:jc w:val="center"/>
+              <w:rPr/>
+            </w:pPr>
+            <w:r>
+              <w:rPr>
+                <w:b/>
+                <w:bCs/>
+                <w:color w:val="008AFF"/>
+              </w:rPr>
+              <w:t xml:space="preserve">○ </w:t>
+            </w:r>
+          </w:p>
+        </w:tc>
+      </w:tr>
+      <w:tr>
+        <w:trPr/>
+        <w:tc>
+          <w:tcPr>
+            <w:tcW w:w="4991" w:type="dxa"/>
+            <w:tcBorders>
+              <w:left w:val="single" w:sz="4" w:space="0" w:color="000000"/>
+              <w:bottom w:val="single" w:sz="4" w:space="0" w:color="000000"/>
+            </w:tcBorders>
+          </w:tcPr>
+          <w:p>
+            <w:pPr>
+              <w:pStyle w:val="Contenidodelatabla"/>
+              <w:spacing w:lineRule="auto" w:line="240"/>
+              <w:rPr/>
+            </w:pPr>
+            <w:r>
+              <w:rPr/>
+              <w:t>EC-SCM (Plan de configuración)</w:t>
+            </w:r>
+          </w:p>
+        </w:tc>
+        <w:tc>
+          <w:tcPr>
+            <w:tcW w:w="1473" w:type="dxa"/>
+            <w:tcBorders>
+              <w:left w:val="single" w:sz="4" w:space="0" w:color="000000"/>
+              <w:bottom w:val="single" w:sz="4" w:space="0" w:color="000000"/>
+            </w:tcBorders>
+            <w:shd w:fill="98FB98" w:val="clear"/>
+          </w:tcPr>
+          <w:p>
+            <w:pPr>
+              <w:pStyle w:val="Contenidodelatabla"/>
+              <w:spacing w:lineRule="auto" w:line="240"/>
+              <w:jc w:val="center"/>
+              <w:rPr>
+                <w:b/>
+                <w:bCs/>
+              </w:rPr>
+            </w:pPr>
+            <w:r>
+              <w:rPr>
+                <w:b/>
+                <w:bCs/>
+                <w:caps w:val="false"/>
+                <w:smallCaps w:val="false"/>
+                <w:color w:val="0F6E56"/>
+                <w:spacing w:val="0"/>
+              </w:rPr>
+              <w:t>✓</w:t>
+            </w:r>
+          </w:p>
+        </w:tc>
+        <w:tc>
+          <w:tcPr>
+            <w:tcW w:w="1472" w:type="dxa"/>
+            <w:tcBorders>
+              <w:left w:val="single" w:sz="4" w:space="0" w:color="000000"/>
+              <w:bottom w:val="single" w:sz="4" w:space="0" w:color="000000"/>
+            </w:tcBorders>
+            <w:shd w:fill="B0E0E6" w:val="clear"/>
+          </w:tcPr>
+          <w:p>
+            <w:pPr>
+              <w:pStyle w:val="Contenidodelatabla"/>
+              <w:spacing w:lineRule="auto" w:line="240"/>
+              <w:jc w:val="center"/>
+              <w:rPr/>
+            </w:pPr>
+            <w:r>
+              <w:rPr>
+                <w:b/>
+                <w:bCs/>
+                <w:color w:val="008AFF"/>
+              </w:rPr>
+              <w:t xml:space="preserve">○ </w:t>
+            </w:r>
+          </w:p>
+        </w:tc>
+        <w:tc>
+          <w:tcPr>
+            <w:tcW w:w="1424" w:type="dxa"/>
+            <w:tcBorders>
+              <w:left w:val="single" w:sz="4" w:space="0" w:color="000000"/>
+              <w:bottom w:val="single" w:sz="4" w:space="0" w:color="000000"/>
+              <w:right w:val="single" w:sz="4" w:space="0" w:color="000000"/>
+            </w:tcBorders>
+            <w:shd w:fill="B0E0E6" w:val="clear"/>
+          </w:tcPr>
+          <w:p>
+            <w:pPr>
+              <w:pStyle w:val="Contenidodelatabla"/>
+              <w:spacing w:lineRule="auto" w:line="240"/>
+              <w:jc w:val="center"/>
+              <w:rPr/>
+            </w:pPr>
+            <w:r>
+              <w:rPr>
+                <w:b/>
+                <w:bCs/>
+                <w:color w:val="008AFF"/>
+              </w:rPr>
+              <w:t xml:space="preserve">○ </w:t>
+            </w:r>
+          </w:p>
+        </w:tc>
+      </w:tr>
+      <w:tr>
+        <w:trPr/>
+        <w:tc>
+          <w:tcPr>
+            <w:tcW w:w="4991" w:type="dxa"/>
+            <w:tcBorders>
+              <w:left w:val="single" w:sz="4" w:space="0" w:color="000000"/>
+              <w:bottom w:val="single" w:sz="4" w:space="0" w:color="000000"/>
+            </w:tcBorders>
+          </w:tcPr>
+          <w:p>
+            <w:pPr>
+              <w:pStyle w:val="Contenidodelatabla"/>
+              <w:spacing w:lineRule="auto" w:line="240"/>
+              <w:rPr/>
+            </w:pPr>
+            <w:r>
+              <w:rPr/>
+              <w:t>EC-RSG (Plan de riesgos)</w:t>
+            </w:r>
+          </w:p>
+        </w:tc>
+        <w:tc>
+          <w:tcPr>
+            <w:tcW w:w="1473" w:type="dxa"/>
+            <w:tcBorders>
+              <w:left w:val="single" w:sz="4" w:space="0" w:color="000000"/>
+              <w:bottom w:val="single" w:sz="4" w:space="0" w:color="000000"/>
+            </w:tcBorders>
+          </w:tcPr>
+          <w:p>
+            <w:pPr>
+              <w:pStyle w:val="Contenidodelatabla"/>
+              <w:spacing w:lineRule="auto" w:line="240"/>
+              <w:jc w:val="center"/>
+              <w:rPr/>
+            </w:pPr>
+            <w:r>
+              <w:rPr>
+                <w:b/>
+                <w:bCs/>
+                <w:caps w:val="false"/>
+                <w:smallCaps w:val="false"/>
+                <w:color w:val="auto"/>
+                <w:spacing w:val="0"/>
+              </w:rPr>
+              <w:t>—</w:t>
+            </w:r>
+          </w:p>
+        </w:tc>
+        <w:tc>
+          <w:tcPr>
+            <w:tcW w:w="1472" w:type="dxa"/>
+            <w:tcBorders>
+              <w:left w:val="single" w:sz="4" w:space="0" w:color="000000"/>
+              <w:bottom w:val="single" w:sz="4" w:space="0" w:color="000000"/>
+            </w:tcBorders>
+            <w:shd w:fill="98FB98" w:val="clear"/>
+          </w:tcPr>
+          <w:p>
+            <w:pPr>
+              <w:pStyle w:val="Contenidodelatabla"/>
+              <w:spacing w:lineRule="auto" w:line="240"/>
+              <w:jc w:val="center"/>
+              <w:rPr>
+                <w:b/>
+                <w:bCs/>
+              </w:rPr>
+            </w:pPr>
+            <w:r>
+              <w:rPr>
+                <w:b/>
+                <w:bCs/>
+                <w:caps w:val="false"/>
+                <w:smallCaps w:val="false"/>
+                <w:color w:val="0F6E56"/>
+                <w:spacing w:val="0"/>
+              </w:rPr>
+              <w:t>✓</w:t>
+            </w:r>
+          </w:p>
+        </w:tc>
+        <w:tc>
+          <w:tcPr>
+            <w:tcW w:w="1424" w:type="dxa"/>
+            <w:tcBorders>
+              <w:left w:val="single" w:sz="4" w:space="0" w:color="000000"/>
+              <w:bottom w:val="single" w:sz="4" w:space="0" w:color="000000"/>
+              <w:right w:val="single" w:sz="4" w:space="0" w:color="000000"/>
+            </w:tcBorders>
+            <w:shd w:fill="B0E0E6" w:val="clear"/>
+          </w:tcPr>
+          <w:p>
+            <w:pPr>
+              <w:pStyle w:val="Contenidodelatabla"/>
+              <w:spacing w:lineRule="auto" w:line="240"/>
+              <w:jc w:val="center"/>
+              <w:rPr/>
+            </w:pPr>
+            <w:r>
+              <w:rPr>
+                <w:b/>
+                <w:bCs/>
+                <w:color w:val="008AFF"/>
+              </w:rPr>
+              <w:t xml:space="preserve">○ </w:t>
+            </w:r>
+          </w:p>
+        </w:tc>
+      </w:tr>
+      <w:tr>
+        <w:trPr/>
+        <w:tc>
+          <w:tcPr>
+            <w:tcW w:w="4991" w:type="dxa"/>
+            <w:tcBorders>
+              <w:left w:val="single" w:sz="4" w:space="0" w:color="000000"/>
+              <w:bottom w:val="single" w:sz="4" w:space="0" w:color="000000"/>
+            </w:tcBorders>
+          </w:tcPr>
+          <w:p>
+            <w:pPr>
+              <w:pStyle w:val="Contenidodelatabla"/>
+              <w:spacing w:lineRule="auto" w:line="240"/>
+              <w:rPr/>
+            </w:pPr>
+            <w:r>
+              <w:rPr/>
+              <w:t>EC-RSG-ANL (Identificación y análisis de riesgos)</w:t>
+            </w:r>
+          </w:p>
+        </w:tc>
+        <w:tc>
+          <w:tcPr>
+            <w:tcW w:w="1473" w:type="dxa"/>
+            <w:tcBorders>
+              <w:left w:val="single" w:sz="4" w:space="0" w:color="000000"/>
+              <w:bottom w:val="single" w:sz="4" w:space="0" w:color="000000"/>
+            </w:tcBorders>
+          </w:tcPr>
+          <w:p>
+            <w:pPr>
+              <w:pStyle w:val="Contenidodelatabla"/>
+              <w:spacing w:lineRule="auto" w:line="240"/>
+              <w:jc w:val="center"/>
+              <w:rPr/>
+            </w:pPr>
+            <w:r>
+              <w:rPr>
+                <w:b/>
+                <w:bCs/>
+                <w:caps w:val="false"/>
+                <w:smallCaps w:val="false"/>
+                <w:color w:val="auto"/>
+                <w:spacing w:val="0"/>
+              </w:rPr>
+              <w:t>—</w:t>
+            </w:r>
+          </w:p>
+        </w:tc>
+        <w:tc>
+          <w:tcPr>
+            <w:tcW w:w="1472" w:type="dxa"/>
+            <w:tcBorders>
+              <w:left w:val="single" w:sz="4" w:space="0" w:color="000000"/>
+              <w:bottom w:val="single" w:sz="4" w:space="0" w:color="000000"/>
+            </w:tcBorders>
+            <w:shd w:fill="98FB98" w:val="clear"/>
+          </w:tcPr>
+          <w:p>
+            <w:pPr>
+              <w:pStyle w:val="Contenidodelatabla"/>
+              <w:spacing w:lineRule="auto" w:line="240"/>
+              <w:jc w:val="center"/>
+              <w:rPr>
+                <w:b/>
+                <w:bCs/>
+              </w:rPr>
+            </w:pPr>
+            <w:r>
+              <w:rPr>
+                <w:b/>
+                <w:bCs/>
+                <w:caps w:val="false"/>
+                <w:smallCaps w:val="false"/>
+                <w:color w:val="0F6E56"/>
+                <w:spacing w:val="0"/>
+              </w:rPr>
+              <w:t>✓</w:t>
+            </w:r>
+          </w:p>
+        </w:tc>
+        <w:tc>
+          <w:tcPr>
+            <w:tcW w:w="1424" w:type="dxa"/>
+            <w:tcBorders>
+              <w:left w:val="single" w:sz="4" w:space="0" w:color="000000"/>
+              <w:bottom w:val="single" w:sz="4" w:space="0" w:color="000000"/>
+              <w:right w:val="single" w:sz="4" w:space="0" w:color="000000"/>
+            </w:tcBorders>
+            <w:shd w:fill="B0E0E6" w:val="clear"/>
+          </w:tcPr>
+          <w:p>
+            <w:pPr>
+              <w:pStyle w:val="Contenidodelatabla"/>
+              <w:spacing w:lineRule="auto" w:line="240"/>
+              <w:jc w:val="center"/>
+              <w:rPr/>
+            </w:pPr>
+            <w:r>
+              <w:rPr>
+                <w:b/>
+                <w:bCs/>
+                <w:color w:val="008AFF"/>
+              </w:rPr>
+              <w:t xml:space="preserve">○ </w:t>
+            </w:r>
+          </w:p>
+        </w:tc>
+      </w:tr>
+      <w:tr>
+        <w:trPr/>
+        <w:tc>
+          <w:tcPr>
+            <w:tcW w:w="9360" w:type="dxa"/>
+            <w:gridSpan w:val="4"/>
+            <w:tcBorders>
+              <w:left w:val="single" w:sz="4" w:space="0" w:color="000000"/>
+              <w:bottom w:val="single" w:sz="4" w:space="0" w:color="000000"/>
+              <w:right w:val="single" w:sz="4" w:space="0" w:color="000000"/>
+            </w:tcBorders>
+            <w:shd w:fill="D3D3D3" w:val="clear"/>
+          </w:tcPr>
+          <w:p>
+            <w:pPr>
+              <w:pStyle w:val="Contenidodelatabla"/>
+              <w:spacing w:lineRule="auto" w:line="240"/>
+              <w:rPr>
+                <w:b/>
+                <w:bCs/>
+                <w:sz w:val="20"/>
+                <w:szCs w:val="20"/>
+              </w:rPr>
+            </w:pPr>
+            <w:r>
+              <w:rPr>
+                <w:b/>
+                <w:bCs/>
+                <w:sz w:val="20"/>
+                <w:szCs w:val="20"/>
+              </w:rPr>
+              <w:t>ESTÁNDARES</w:t>
+            </w:r>
+          </w:p>
+        </w:tc>
+      </w:tr>
+      <w:tr>
+        <w:trPr/>
+        <w:tc>
+          <w:tcPr>
+            <w:tcW w:w="4991" w:type="dxa"/>
+            <w:tcBorders>
+              <w:left w:val="single" w:sz="4" w:space="0" w:color="000000"/>
+              <w:bottom w:val="single" w:sz="4" w:space="0" w:color="000000"/>
+            </w:tcBorders>
+          </w:tcPr>
+          <w:p>
+            <w:pPr>
+              <w:pStyle w:val="Contenidodelatabla"/>
+              <w:spacing w:lineRule="auto" w:line="240"/>
+              <w:rPr/>
+            </w:pPr>
+            <w:r>
+              <w:rPr/>
+              <w:t xml:space="preserve">EC-STD-DOC </w:t>
+            </w:r>
+            <w:r>
+              <w:rPr/>
+              <w:t>(</w:t>
+            </w:r>
+            <w:r>
+              <w:rPr/>
+              <w:t>Estándar de documentación</w:t>
+            </w:r>
+            <w:r>
+              <w:rPr/>
+              <w:t>)</w:t>
+            </w:r>
+          </w:p>
+        </w:tc>
+        <w:tc>
+          <w:tcPr>
+            <w:tcW w:w="1473" w:type="dxa"/>
+            <w:tcBorders>
+              <w:left w:val="single" w:sz="4" w:space="0" w:color="000000"/>
+              <w:bottom w:val="single" w:sz="4" w:space="0" w:color="000000"/>
+            </w:tcBorders>
+          </w:tcPr>
+          <w:p>
+            <w:pPr>
+              <w:pStyle w:val="Contenidodelatabla"/>
+              <w:spacing w:lineRule="auto" w:line="240"/>
+              <w:jc w:val="center"/>
+              <w:rPr/>
+            </w:pPr>
+            <w:r>
+              <w:rPr>
+                <w:b/>
+                <w:bCs/>
+                <w:caps w:val="false"/>
+                <w:smallCaps w:val="false"/>
+                <w:color w:val="auto"/>
+                <w:spacing w:val="0"/>
+              </w:rPr>
+              <w:t>—</w:t>
+            </w:r>
+          </w:p>
+        </w:tc>
+        <w:tc>
+          <w:tcPr>
+            <w:tcW w:w="1472" w:type="dxa"/>
+            <w:tcBorders>
+              <w:left w:val="single" w:sz="4" w:space="0" w:color="000000"/>
+              <w:bottom w:val="single" w:sz="4" w:space="0" w:color="000000"/>
+            </w:tcBorders>
+            <w:shd w:fill="98FB98" w:val="clear"/>
+          </w:tcPr>
+          <w:p>
+            <w:pPr>
+              <w:pStyle w:val="Contenidodelatabla"/>
+              <w:spacing w:lineRule="auto" w:line="240"/>
+              <w:jc w:val="center"/>
+              <w:rPr>
+                <w:b/>
+                <w:bCs/>
+              </w:rPr>
+            </w:pPr>
+            <w:r>
+              <w:rPr>
+                <w:b/>
+                <w:bCs/>
+                <w:caps w:val="false"/>
+                <w:smallCaps w:val="false"/>
+                <w:color w:val="0F6E56"/>
+                <w:spacing w:val="0"/>
+              </w:rPr>
+              <w:t>✓</w:t>
+            </w:r>
+          </w:p>
+        </w:tc>
+        <w:tc>
+          <w:tcPr>
+            <w:tcW w:w="1424" w:type="dxa"/>
+            <w:tcBorders>
+              <w:left w:val="single" w:sz="4" w:space="0" w:color="000000"/>
+              <w:bottom w:val="single" w:sz="4" w:space="0" w:color="000000"/>
+              <w:right w:val="single" w:sz="4" w:space="0" w:color="000000"/>
+            </w:tcBorders>
+            <w:shd w:fill="B0E0E6" w:val="clear"/>
+          </w:tcPr>
+          <w:p>
+            <w:pPr>
+              <w:pStyle w:val="Contenidodelatabla"/>
+              <w:spacing w:lineRule="auto" w:line="240"/>
+              <w:jc w:val="center"/>
+              <w:rPr/>
+            </w:pPr>
+            <w:r>
+              <w:rPr>
+                <w:b/>
+                <w:bCs/>
+                <w:color w:val="008AFF"/>
+              </w:rPr>
+              <w:t xml:space="preserve">○ </w:t>
+            </w:r>
+          </w:p>
+        </w:tc>
+      </w:tr>
+      <w:tr>
+        <w:trPr/>
+        <w:tc>
+          <w:tcPr>
+            <w:tcW w:w="4991" w:type="dxa"/>
+            <w:tcBorders>
+              <w:left w:val="single" w:sz="4" w:space="0" w:color="000000"/>
+              <w:bottom w:val="single" w:sz="4" w:space="0" w:color="000000"/>
+            </w:tcBorders>
+          </w:tcPr>
+          <w:p>
+            <w:pPr>
+              <w:pStyle w:val="Contenidodelatabla"/>
+              <w:spacing w:lineRule="auto" w:line="240"/>
+              <w:rPr/>
+            </w:pPr>
+            <w:r>
+              <w:rPr/>
+              <w:t xml:space="preserve">EC-STD-PHP </w:t>
+            </w:r>
+            <w:r>
+              <w:rPr/>
+              <w:t>(</w:t>
+            </w:r>
+            <w:r>
+              <w:rPr/>
+              <w:t>Estándar PHP</w:t>
+            </w:r>
+            <w:r>
+              <w:rPr/>
+              <w:t>)</w:t>
+            </w:r>
+          </w:p>
+        </w:tc>
+        <w:tc>
+          <w:tcPr>
+            <w:tcW w:w="1473" w:type="dxa"/>
+            <w:tcBorders>
+              <w:left w:val="single" w:sz="4" w:space="0" w:color="000000"/>
+              <w:bottom w:val="single" w:sz="4" w:space="0" w:color="000000"/>
+            </w:tcBorders>
+          </w:tcPr>
+          <w:p>
+            <w:pPr>
+              <w:pStyle w:val="Contenidodelatabla"/>
+              <w:spacing w:lineRule="auto" w:line="240"/>
+              <w:jc w:val="center"/>
+              <w:rPr/>
+            </w:pPr>
+            <w:r>
+              <w:rPr>
+                <w:b/>
+                <w:bCs/>
+                <w:caps w:val="false"/>
+                <w:smallCaps w:val="false"/>
+                <w:color w:val="auto"/>
+                <w:spacing w:val="0"/>
+              </w:rPr>
+              <w:t>—</w:t>
+            </w:r>
+          </w:p>
+        </w:tc>
+        <w:tc>
+          <w:tcPr>
+            <w:tcW w:w="1472" w:type="dxa"/>
+            <w:tcBorders>
+              <w:left w:val="single" w:sz="4" w:space="0" w:color="000000"/>
+              <w:bottom w:val="single" w:sz="4" w:space="0" w:color="000000"/>
+            </w:tcBorders>
+            <w:shd w:fill="98FB98" w:val="clear"/>
+          </w:tcPr>
+          <w:p>
+            <w:pPr>
+              <w:pStyle w:val="Contenidodelatabla"/>
+              <w:spacing w:lineRule="auto" w:line="240"/>
+              <w:jc w:val="center"/>
+              <w:rPr>
+                <w:b/>
+                <w:bCs/>
+              </w:rPr>
+            </w:pPr>
+            <w:r>
+              <w:rPr>
+                <w:b/>
+                <w:bCs/>
+                <w:caps w:val="false"/>
+                <w:smallCaps w:val="false"/>
+                <w:color w:val="0F6E56"/>
+                <w:spacing w:val="0"/>
+              </w:rPr>
+              <w:t>✓</w:t>
+            </w:r>
+          </w:p>
+        </w:tc>
+        <w:tc>
+          <w:tcPr>
+            <w:tcW w:w="1424" w:type="dxa"/>
+            <w:tcBorders>
+              <w:left w:val="single" w:sz="4" w:space="0" w:color="000000"/>
+              <w:bottom w:val="single" w:sz="4" w:space="0" w:color="000000"/>
+              <w:right w:val="single" w:sz="4" w:space="0" w:color="000000"/>
+            </w:tcBorders>
+            <w:shd w:fill="B0E0E6" w:val="clear"/>
+          </w:tcPr>
+          <w:p>
+            <w:pPr>
+              <w:pStyle w:val="Contenidodelatabla"/>
+              <w:spacing w:lineRule="auto" w:line="240"/>
+              <w:jc w:val="center"/>
+              <w:rPr/>
+            </w:pPr>
+            <w:r>
+              <w:rPr>
+                <w:b/>
+                <w:bCs/>
+                <w:color w:val="008AFF"/>
+              </w:rPr>
+              <w:t xml:space="preserve">○ </w:t>
+            </w:r>
+          </w:p>
+        </w:tc>
+      </w:tr>
+      <w:tr>
+        <w:trPr/>
+        <w:tc>
+          <w:tcPr>
+            <w:tcW w:w="9360" w:type="dxa"/>
+            <w:gridSpan w:val="4"/>
+            <w:tcBorders>
+              <w:left w:val="single" w:sz="4" w:space="0" w:color="000000"/>
+              <w:bottom w:val="single" w:sz="4" w:space="0" w:color="000000"/>
+              <w:right w:val="single" w:sz="4" w:space="0" w:color="000000"/>
+            </w:tcBorders>
+            <w:shd w:fill="D3D3D3" w:val="clear"/>
+          </w:tcPr>
+          <w:p>
+            <w:pPr>
+              <w:pStyle w:val="Contenidodelatabla"/>
+              <w:spacing w:lineRule="auto" w:line="240"/>
+              <w:rPr>
+                <w:b/>
+                <w:bCs/>
+                <w:sz w:val="20"/>
+                <w:szCs w:val="20"/>
+              </w:rPr>
+            </w:pPr>
+            <w:r>
+              <w:rPr>
+                <w:b/>
+                <w:bCs/>
+                <w:sz w:val="20"/>
+                <w:szCs w:val="20"/>
+              </w:rPr>
+              <w:t>CALIDAD</w:t>
+            </w:r>
+          </w:p>
+        </w:tc>
+      </w:tr>
+      <w:tr>
+        <w:trPr/>
+        <w:tc>
+          <w:tcPr>
+            <w:tcW w:w="4991" w:type="dxa"/>
+            <w:tcBorders>
+              <w:left w:val="single" w:sz="4" w:space="0" w:color="000000"/>
+              <w:bottom w:val="single" w:sz="4" w:space="0" w:color="000000"/>
+            </w:tcBorders>
+          </w:tcPr>
+          <w:p>
+            <w:pPr>
+              <w:pStyle w:val="Contenidodelatabla"/>
+              <w:spacing w:lineRule="auto" w:line="240"/>
+              <w:rPr/>
+            </w:pPr>
+            <w:r>
+              <w:rPr/>
+              <w:t>EC-SQA-PLN (Plan de SQA)</w:t>
+            </w:r>
+          </w:p>
+        </w:tc>
+        <w:tc>
+          <w:tcPr>
+            <w:tcW w:w="1473" w:type="dxa"/>
+            <w:tcBorders>
+              <w:left w:val="single" w:sz="4" w:space="0" w:color="000000"/>
+              <w:bottom w:val="single" w:sz="4" w:space="0" w:color="000000"/>
+            </w:tcBorders>
+          </w:tcPr>
+          <w:p>
+            <w:pPr>
+              <w:pStyle w:val="Contenidodelatabla"/>
+              <w:spacing w:lineRule="auto" w:line="240"/>
+              <w:jc w:val="center"/>
+              <w:rPr/>
+            </w:pPr>
+            <w:r>
+              <w:rPr>
+                <w:b/>
+                <w:bCs/>
+                <w:caps w:val="false"/>
+                <w:smallCaps w:val="false"/>
+                <w:color w:val="auto"/>
+                <w:spacing w:val="0"/>
+              </w:rPr>
+              <w:t>—</w:t>
+            </w:r>
+          </w:p>
+        </w:tc>
+        <w:tc>
+          <w:tcPr>
+            <w:tcW w:w="1472" w:type="dxa"/>
+            <w:tcBorders>
+              <w:left w:val="single" w:sz="4" w:space="0" w:color="000000"/>
+              <w:bottom w:val="single" w:sz="4" w:space="0" w:color="000000"/>
+            </w:tcBorders>
+            <w:shd w:fill="98FB98" w:val="clear"/>
+          </w:tcPr>
+          <w:p>
+            <w:pPr>
+              <w:pStyle w:val="Contenidodelatabla"/>
+              <w:spacing w:lineRule="auto" w:line="240"/>
+              <w:jc w:val="center"/>
+              <w:rPr>
+                <w:b/>
+                <w:bCs/>
+              </w:rPr>
+            </w:pPr>
+            <w:r>
+              <w:rPr>
+                <w:b/>
+                <w:bCs/>
+                <w:caps w:val="false"/>
+                <w:smallCaps w:val="false"/>
+                <w:color w:val="0F6E56"/>
+                <w:spacing w:val="0"/>
+              </w:rPr>
+              <w:t>✓</w:t>
+            </w:r>
+          </w:p>
+        </w:tc>
+        <w:tc>
+          <w:tcPr>
+            <w:tcW w:w="1424" w:type="dxa"/>
+            <w:tcBorders>
+              <w:left w:val="single" w:sz="4" w:space="0" w:color="000000"/>
+              <w:bottom w:val="single" w:sz="4" w:space="0" w:color="000000"/>
+              <w:right w:val="single" w:sz="4" w:space="0" w:color="000000"/>
+            </w:tcBorders>
+            <w:shd w:fill="B0E0E6" w:val="clear"/>
+          </w:tcPr>
+          <w:p>
+            <w:pPr>
+              <w:pStyle w:val="Contenidodelatabla"/>
+              <w:spacing w:lineRule="auto" w:line="240"/>
+              <w:jc w:val="center"/>
+              <w:rPr/>
+            </w:pPr>
+            <w:r>
+              <w:rPr>
+                <w:b/>
+                <w:bCs/>
+                <w:color w:val="008AFF"/>
+              </w:rPr>
+              <w:t xml:space="preserve">○ </w:t>
+            </w:r>
+          </w:p>
+        </w:tc>
+      </w:tr>
+      <w:tr>
+        <w:trPr/>
+        <w:tc>
+          <w:tcPr>
+            <w:tcW w:w="4991" w:type="dxa"/>
+            <w:tcBorders>
+              <w:left w:val="single" w:sz="4" w:space="0" w:color="000000"/>
+              <w:bottom w:val="single" w:sz="4" w:space="0" w:color="000000"/>
+            </w:tcBorders>
+          </w:tcPr>
+          <w:p>
+            <w:pPr>
+              <w:pStyle w:val="Contenidodelatabla"/>
+              <w:spacing w:lineRule="auto" w:line="240"/>
+              <w:rPr/>
+            </w:pPr>
+            <w:r>
+              <w:rPr/>
+              <w:t>EC-SQA-INF (Informe de SQA)</w:t>
+            </w:r>
+          </w:p>
+        </w:tc>
+        <w:tc>
+          <w:tcPr>
+            <w:tcW w:w="1473" w:type="dxa"/>
+            <w:tcBorders>
+              <w:left w:val="single" w:sz="4" w:space="0" w:color="000000"/>
+              <w:bottom w:val="single" w:sz="4" w:space="0" w:color="000000"/>
+            </w:tcBorders>
+          </w:tcPr>
+          <w:p>
+            <w:pPr>
+              <w:pStyle w:val="Contenidodelatabla"/>
+              <w:spacing w:lineRule="auto" w:line="240"/>
+              <w:jc w:val="center"/>
+              <w:rPr/>
+            </w:pPr>
+            <w:r>
+              <w:rPr>
+                <w:b/>
+                <w:bCs/>
+                <w:caps w:val="false"/>
+                <w:smallCaps w:val="false"/>
+                <w:color w:val="auto"/>
+                <w:spacing w:val="0"/>
+              </w:rPr>
+              <w:t>—</w:t>
+            </w:r>
+          </w:p>
+        </w:tc>
+        <w:tc>
+          <w:tcPr>
+            <w:tcW w:w="1472" w:type="dxa"/>
+            <w:tcBorders>
+              <w:left w:val="single" w:sz="4" w:space="0" w:color="000000"/>
+              <w:bottom w:val="single" w:sz="4" w:space="0" w:color="000000"/>
+            </w:tcBorders>
+          </w:tcPr>
+          <w:p>
+            <w:pPr>
+              <w:pStyle w:val="Contenidodelatabla"/>
+              <w:spacing w:lineRule="auto" w:line="240"/>
+              <w:jc w:val="center"/>
+              <w:rPr/>
+            </w:pPr>
+            <w:r>
+              <w:rPr>
+                <w:b/>
+                <w:bCs/>
+                <w:caps w:val="false"/>
+                <w:smallCaps w:val="false"/>
+                <w:color w:val="auto"/>
+                <w:spacing w:val="0"/>
+              </w:rPr>
+              <w:t>—</w:t>
+            </w:r>
+          </w:p>
+        </w:tc>
+        <w:tc>
+          <w:tcPr>
+            <w:tcW w:w="1424" w:type="dxa"/>
+            <w:tcBorders>
+              <w:left w:val="single" w:sz="4" w:space="0" w:color="000000"/>
+              <w:bottom w:val="single" w:sz="4" w:space="0" w:color="000000"/>
+              <w:right w:val="single" w:sz="4" w:space="0" w:color="000000"/>
+            </w:tcBorders>
+          </w:tcPr>
+          <w:p>
+            <w:pPr>
+              <w:pStyle w:val="Contenidodelatabla"/>
+              <w:spacing w:lineRule="auto" w:line="240"/>
+              <w:jc w:val="center"/>
+              <w:rPr/>
+            </w:pPr>
+            <w:r>
+              <w:rPr>
+                <w:b/>
+                <w:bCs/>
+                <w:caps w:val="false"/>
+                <w:smallCaps w:val="false"/>
+                <w:color w:val="auto"/>
+                <w:spacing w:val="0"/>
+              </w:rPr>
+              <w:t>—</w:t>
+            </w:r>
+          </w:p>
+        </w:tc>
+      </w:tr>
+      <w:tr>
+        <w:trPr/>
+        <w:tc>
+          <w:tcPr>
+            <w:tcW w:w="4991" w:type="dxa"/>
+            <w:tcBorders>
+              <w:left w:val="single" w:sz="4" w:space="0" w:color="000000"/>
+              <w:bottom w:val="single" w:sz="4" w:space="0" w:color="000000"/>
+            </w:tcBorders>
+          </w:tcPr>
+          <w:p>
+            <w:pPr>
+              <w:pStyle w:val="Contenidodelatabla"/>
+              <w:spacing w:lineRule="auto" w:line="240"/>
+              <w:rPr/>
+            </w:pPr>
+            <w:r>
+              <w:rPr/>
+              <w:t>EC-SQA-REV (Revisión de SQA)</w:t>
+            </w:r>
+          </w:p>
+        </w:tc>
+        <w:tc>
+          <w:tcPr>
+            <w:tcW w:w="1473" w:type="dxa"/>
+            <w:tcBorders>
+              <w:left w:val="single" w:sz="4" w:space="0" w:color="000000"/>
+              <w:bottom w:val="single" w:sz="4" w:space="0" w:color="000000"/>
+            </w:tcBorders>
+          </w:tcPr>
+          <w:p>
+            <w:pPr>
+              <w:pStyle w:val="Contenidodelatabla"/>
+              <w:spacing w:lineRule="auto" w:line="240"/>
+              <w:jc w:val="center"/>
+              <w:rPr/>
+            </w:pPr>
+            <w:r>
+              <w:rPr>
+                <w:b/>
+                <w:bCs/>
+                <w:caps w:val="false"/>
+                <w:smallCaps w:val="false"/>
+                <w:color w:val="auto"/>
+                <w:spacing w:val="0"/>
+              </w:rPr>
+              <w:t>—</w:t>
+            </w:r>
+          </w:p>
+        </w:tc>
+        <w:tc>
+          <w:tcPr>
+            <w:tcW w:w="1472" w:type="dxa"/>
+            <w:tcBorders>
+              <w:left w:val="single" w:sz="4" w:space="0" w:color="000000"/>
+              <w:bottom w:val="single" w:sz="4" w:space="0" w:color="000000"/>
+            </w:tcBorders>
+          </w:tcPr>
+          <w:p>
+            <w:pPr>
+              <w:pStyle w:val="Contenidodelatabla"/>
+              <w:spacing w:lineRule="auto" w:line="240"/>
+              <w:jc w:val="center"/>
+              <w:rPr/>
+            </w:pPr>
+            <w:r>
+              <w:rPr>
+                <w:b/>
+                <w:bCs/>
+                <w:caps w:val="false"/>
+                <w:smallCaps w:val="false"/>
+                <w:color w:val="auto"/>
+                <w:spacing w:val="0"/>
+              </w:rPr>
+              <w:t>—</w:t>
+            </w:r>
+          </w:p>
+        </w:tc>
+        <w:tc>
+          <w:tcPr>
+            <w:tcW w:w="1424" w:type="dxa"/>
+            <w:tcBorders>
+              <w:left w:val="single" w:sz="4" w:space="0" w:color="000000"/>
+              <w:bottom w:val="single" w:sz="4" w:space="0" w:color="000000"/>
+              <w:right w:val="single" w:sz="4" w:space="0" w:color="000000"/>
+            </w:tcBorders>
+          </w:tcPr>
+          <w:p>
+            <w:pPr>
+              <w:pStyle w:val="Contenidodelatabla"/>
+              <w:spacing w:lineRule="auto" w:line="240"/>
+              <w:jc w:val="center"/>
+              <w:rPr/>
+            </w:pPr>
+            <w:r>
+              <w:rPr>
+                <w:b/>
+                <w:bCs/>
+                <w:caps w:val="false"/>
+                <w:smallCaps w:val="false"/>
+                <w:color w:val="auto"/>
+                <w:spacing w:val="0"/>
+              </w:rPr>
+              <w:t>—</w:t>
+            </w:r>
+          </w:p>
+        </w:tc>
+      </w:tr>
+      <w:tr>
+        <w:trPr/>
+        <w:tc>
+          <w:tcPr>
+            <w:tcW w:w="4991" w:type="dxa"/>
+            <w:tcBorders>
+              <w:left w:val="single" w:sz="4" w:space="0" w:color="000000"/>
+              <w:bottom w:val="single" w:sz="4" w:space="0" w:color="000000"/>
+            </w:tcBorders>
+          </w:tcPr>
+          <w:p>
+            <w:pPr>
+              <w:pStyle w:val="Contenidodelatabla"/>
+              <w:spacing w:lineRule="auto" w:line="240"/>
+              <w:rPr/>
+            </w:pPr>
+            <w:r>
+              <w:rPr/>
+              <w:t>EC-SQA-TST (Plan de pruebas)</w:t>
+            </w:r>
+          </w:p>
+        </w:tc>
+        <w:tc>
+          <w:tcPr>
+            <w:tcW w:w="1473" w:type="dxa"/>
+            <w:tcBorders>
+              <w:left w:val="single" w:sz="4" w:space="0" w:color="000000"/>
+              <w:bottom w:val="single" w:sz="4" w:space="0" w:color="000000"/>
+            </w:tcBorders>
+          </w:tcPr>
+          <w:p>
+            <w:pPr>
+              <w:pStyle w:val="Contenidodelatabla"/>
+              <w:spacing w:lineRule="auto" w:line="240"/>
+              <w:jc w:val="center"/>
+              <w:rPr/>
+            </w:pPr>
+            <w:r>
+              <w:rPr>
+                <w:b/>
+                <w:bCs/>
+                <w:caps w:val="false"/>
+                <w:smallCaps w:val="false"/>
+                <w:color w:val="auto"/>
+                <w:spacing w:val="0"/>
+              </w:rPr>
+              <w:t>—</w:t>
+            </w:r>
+          </w:p>
+        </w:tc>
+        <w:tc>
+          <w:tcPr>
+            <w:tcW w:w="1472" w:type="dxa"/>
+            <w:tcBorders>
+              <w:left w:val="single" w:sz="4" w:space="0" w:color="000000"/>
+              <w:bottom w:val="single" w:sz="4" w:space="0" w:color="000000"/>
+            </w:tcBorders>
+          </w:tcPr>
+          <w:p>
+            <w:pPr>
+              <w:pStyle w:val="Contenidodelatabla"/>
+              <w:spacing w:lineRule="auto" w:line="240"/>
+              <w:jc w:val="center"/>
+              <w:rPr/>
+            </w:pPr>
+            <w:r>
+              <w:rPr>
+                <w:b/>
+                <w:bCs/>
+                <w:caps w:val="false"/>
+                <w:smallCaps w:val="false"/>
+                <w:color w:val="auto"/>
+                <w:spacing w:val="0"/>
+              </w:rPr>
+              <w:t>—</w:t>
+            </w:r>
+          </w:p>
+        </w:tc>
+        <w:tc>
+          <w:tcPr>
+            <w:tcW w:w="1424" w:type="dxa"/>
+            <w:tcBorders>
+              <w:left w:val="single" w:sz="4" w:space="0" w:color="000000"/>
+              <w:bottom w:val="single" w:sz="4" w:space="0" w:color="000000"/>
+              <w:right w:val="single" w:sz="4" w:space="0" w:color="000000"/>
+            </w:tcBorders>
+          </w:tcPr>
+          <w:p>
+            <w:pPr>
+              <w:pStyle w:val="Contenidodelatabla"/>
+              <w:spacing w:lineRule="auto" w:line="240"/>
+              <w:jc w:val="center"/>
+              <w:rPr/>
+            </w:pPr>
+            <w:r>
+              <w:rPr>
+                <w:b/>
+                <w:bCs/>
+                <w:caps w:val="false"/>
+                <w:smallCaps w:val="false"/>
+                <w:color w:val="auto"/>
+                <w:spacing w:val="0"/>
+              </w:rPr>
+              <w:t>—</w:t>
+            </w:r>
+          </w:p>
+        </w:tc>
+      </w:tr>
+      <w:tr>
+        <w:trPr/>
+        <w:tc>
+          <w:tcPr>
+            <w:tcW w:w="4991" w:type="dxa"/>
+            <w:tcBorders>
+              <w:left w:val="single" w:sz="4" w:space="0" w:color="000000"/>
+              <w:bottom w:val="single" w:sz="4" w:space="0" w:color="000000"/>
+            </w:tcBorders>
+          </w:tcPr>
+          <w:p>
+            <w:pPr>
+              <w:pStyle w:val="Contenidodelatabla"/>
+              <w:spacing w:lineRule="auto" w:line="240"/>
+              <w:rPr/>
+            </w:pPr>
+            <w:r>
+              <w:rPr/>
+              <w:t>CP-MOD-N (Casos de prueba)</w:t>
+            </w:r>
+          </w:p>
+        </w:tc>
+        <w:tc>
+          <w:tcPr>
+            <w:tcW w:w="1473" w:type="dxa"/>
+            <w:tcBorders>
+              <w:left w:val="single" w:sz="4" w:space="0" w:color="000000"/>
+              <w:bottom w:val="single" w:sz="4" w:space="0" w:color="000000"/>
+            </w:tcBorders>
+          </w:tcPr>
+          <w:p>
+            <w:pPr>
+              <w:pStyle w:val="Contenidodelatabla"/>
+              <w:spacing w:lineRule="auto" w:line="240"/>
+              <w:jc w:val="center"/>
+              <w:rPr/>
+            </w:pPr>
+            <w:r>
+              <w:rPr>
+                <w:b/>
+                <w:bCs/>
+                <w:caps w:val="false"/>
+                <w:smallCaps w:val="false"/>
+                <w:color w:val="auto"/>
+                <w:spacing w:val="0"/>
+              </w:rPr>
+              <w:t>—</w:t>
+            </w:r>
+          </w:p>
+        </w:tc>
+        <w:tc>
+          <w:tcPr>
+            <w:tcW w:w="1472" w:type="dxa"/>
+            <w:tcBorders>
+              <w:left w:val="single" w:sz="4" w:space="0" w:color="000000"/>
+              <w:bottom w:val="single" w:sz="4" w:space="0" w:color="000000"/>
+            </w:tcBorders>
+          </w:tcPr>
+          <w:p>
+            <w:pPr>
+              <w:pStyle w:val="Contenidodelatabla"/>
+              <w:spacing w:lineRule="auto" w:line="240"/>
+              <w:jc w:val="center"/>
+              <w:rPr/>
+            </w:pPr>
+            <w:r>
+              <w:rPr>
+                <w:b/>
+                <w:bCs/>
+                <w:caps w:val="false"/>
+                <w:smallCaps w:val="false"/>
+                <w:color w:val="auto"/>
+                <w:spacing w:val="0"/>
+              </w:rPr>
+              <w:t>—</w:t>
+            </w:r>
+          </w:p>
+        </w:tc>
+        <w:tc>
+          <w:tcPr>
+            <w:tcW w:w="1424" w:type="dxa"/>
+            <w:tcBorders>
+              <w:left w:val="single" w:sz="4" w:space="0" w:color="000000"/>
+              <w:bottom w:val="single" w:sz="4" w:space="0" w:color="000000"/>
+              <w:right w:val="single" w:sz="4" w:space="0" w:color="000000"/>
+            </w:tcBorders>
+          </w:tcPr>
+          <w:p>
+            <w:pPr>
+              <w:pStyle w:val="Contenidodelatabla"/>
+              <w:spacing w:lineRule="auto" w:line="240"/>
+              <w:jc w:val="center"/>
+              <w:rPr/>
+            </w:pPr>
+            <w:r>
+              <w:rPr>
+                <w:b/>
+                <w:bCs/>
+                <w:caps w:val="false"/>
+                <w:smallCaps w:val="false"/>
+                <w:color w:val="auto"/>
+                <w:spacing w:val="0"/>
+              </w:rPr>
+              <w:t>—</w:t>
+            </w:r>
+          </w:p>
+        </w:tc>
+      </w:tr>
+      <w:tr>
+        <w:trPr/>
+        <w:tc>
+          <w:tcPr>
+            <w:tcW w:w="9360" w:type="dxa"/>
+            <w:gridSpan w:val="4"/>
+            <w:tcBorders>
+              <w:left w:val="single" w:sz="4" w:space="0" w:color="000000"/>
+              <w:bottom w:val="single" w:sz="4" w:space="0" w:color="000000"/>
+              <w:right w:val="single" w:sz="4" w:space="0" w:color="000000"/>
+            </w:tcBorders>
+            <w:shd w:fill="D3D3D3" w:val="clear"/>
+          </w:tcPr>
+          <w:p>
+            <w:pPr>
+              <w:pStyle w:val="Contenidodelatabla"/>
+              <w:spacing w:lineRule="auto" w:line="240"/>
+              <w:rPr>
+                <w:b/>
+                <w:bCs/>
+                <w:sz w:val="20"/>
+                <w:szCs w:val="20"/>
+              </w:rPr>
+            </w:pPr>
+            <w:r>
+              <w:rPr>
+                <w:b/>
+                <w:bCs/>
+                <w:sz w:val="20"/>
+                <w:szCs w:val="20"/>
+              </w:rPr>
+              <w:t>IMPLEMENTACIÓN</w:t>
+            </w:r>
+          </w:p>
+        </w:tc>
+      </w:tr>
+      <w:tr>
+        <w:trPr/>
+        <w:tc>
+          <w:tcPr>
+            <w:tcW w:w="4991" w:type="dxa"/>
+            <w:tcBorders>
+              <w:left w:val="single" w:sz="4" w:space="0" w:color="000000"/>
+              <w:bottom w:val="single" w:sz="4" w:space="0" w:color="000000"/>
+            </w:tcBorders>
+          </w:tcPr>
+          <w:p>
+            <w:pPr>
+              <w:pStyle w:val="Contenidodelatabla"/>
+              <w:spacing w:lineRule="auto" w:line="240"/>
+              <w:rPr/>
+            </w:pPr>
+            <w:r>
+              <w:rPr/>
+              <w:t>EC-SRC-SQL (Script SQL)</w:t>
+            </w:r>
+          </w:p>
+        </w:tc>
+        <w:tc>
+          <w:tcPr>
+            <w:tcW w:w="1473" w:type="dxa"/>
+            <w:tcBorders>
+              <w:left w:val="single" w:sz="4" w:space="0" w:color="000000"/>
+              <w:bottom w:val="single" w:sz="4" w:space="0" w:color="000000"/>
+            </w:tcBorders>
+          </w:tcPr>
+          <w:p>
+            <w:pPr>
+              <w:pStyle w:val="Contenidodelatabla"/>
+              <w:spacing w:lineRule="auto" w:line="240"/>
+              <w:jc w:val="center"/>
+              <w:rPr/>
+            </w:pPr>
+            <w:r>
+              <w:rPr>
+                <w:b/>
+                <w:bCs/>
+                <w:caps w:val="false"/>
+                <w:smallCaps w:val="false"/>
+                <w:color w:val="auto"/>
+                <w:spacing w:val="0"/>
+              </w:rPr>
+              <w:t>—</w:t>
+            </w:r>
+          </w:p>
+        </w:tc>
+        <w:tc>
+          <w:tcPr>
+            <w:tcW w:w="1472" w:type="dxa"/>
+            <w:tcBorders>
+              <w:left w:val="single" w:sz="4" w:space="0" w:color="000000"/>
+              <w:bottom w:val="single" w:sz="4" w:space="0" w:color="000000"/>
+            </w:tcBorders>
+          </w:tcPr>
+          <w:p>
+            <w:pPr>
+              <w:pStyle w:val="Contenidodelatabla"/>
+              <w:spacing w:lineRule="auto" w:line="240"/>
+              <w:jc w:val="center"/>
+              <w:rPr/>
+            </w:pPr>
+            <w:r>
+              <w:rPr>
+                <w:b/>
+                <w:bCs/>
+                <w:caps w:val="false"/>
+                <w:smallCaps w:val="false"/>
+                <w:color w:val="auto"/>
+                <w:spacing w:val="0"/>
+              </w:rPr>
+              <w:t>—</w:t>
+            </w:r>
+          </w:p>
+        </w:tc>
+        <w:tc>
+          <w:tcPr>
+            <w:tcW w:w="1424" w:type="dxa"/>
+            <w:tcBorders>
+              <w:left w:val="single" w:sz="4" w:space="0" w:color="000000"/>
+              <w:bottom w:val="single" w:sz="4" w:space="0" w:color="000000"/>
+              <w:right w:val="single" w:sz="4" w:space="0" w:color="000000"/>
+            </w:tcBorders>
+            <w:shd w:fill="98FB98" w:val="clear"/>
+          </w:tcPr>
+          <w:p>
+            <w:pPr>
+              <w:pStyle w:val="Contenidodelatabla"/>
+              <w:spacing w:lineRule="auto" w:line="240"/>
+              <w:jc w:val="center"/>
+              <w:rPr>
+                <w:b/>
+                <w:bCs/>
+              </w:rPr>
+            </w:pPr>
+            <w:r>
+              <w:rPr>
+                <w:b/>
+                <w:bCs/>
+                <w:caps w:val="false"/>
+                <w:smallCaps w:val="false"/>
+                <w:color w:val="0F6E56"/>
+                <w:spacing w:val="0"/>
+              </w:rPr>
+              <w:t>✓</w:t>
+            </w:r>
+          </w:p>
+        </w:tc>
+      </w:tr>
+      <w:tr>
+        <w:trPr/>
+        <w:tc>
+          <w:tcPr>
+            <w:tcW w:w="4991" w:type="dxa"/>
+            <w:tcBorders>
+              <w:left w:val="single" w:sz="4" w:space="0" w:color="000000"/>
+              <w:bottom w:val="single" w:sz="4" w:space="0" w:color="000000"/>
+            </w:tcBorders>
+          </w:tcPr>
+          <w:p>
+            <w:pPr>
+              <w:pStyle w:val="Contenidodelatabla"/>
+              <w:spacing w:lineRule="auto" w:line="240"/>
+              <w:rPr/>
+            </w:pPr>
+            <w:r>
+              <w:rPr/>
+              <w:t>EC-SRC-PHP (Código fuente PHP)</w:t>
+            </w:r>
+          </w:p>
+        </w:tc>
+        <w:tc>
+          <w:tcPr>
+            <w:tcW w:w="1473" w:type="dxa"/>
+            <w:tcBorders>
+              <w:left w:val="single" w:sz="4" w:space="0" w:color="000000"/>
+              <w:bottom w:val="single" w:sz="4" w:space="0" w:color="000000"/>
+            </w:tcBorders>
+          </w:tcPr>
+          <w:p>
+            <w:pPr>
+              <w:pStyle w:val="Contenidodelatabla"/>
+              <w:spacing w:lineRule="auto" w:line="240"/>
+              <w:jc w:val="center"/>
+              <w:rPr/>
+            </w:pPr>
+            <w:r>
+              <w:rPr>
+                <w:b/>
+                <w:bCs/>
+                <w:caps w:val="false"/>
+                <w:smallCaps w:val="false"/>
+                <w:color w:val="auto"/>
+                <w:spacing w:val="0"/>
+              </w:rPr>
+              <w:t>—</w:t>
+            </w:r>
+          </w:p>
+        </w:tc>
+        <w:tc>
+          <w:tcPr>
+            <w:tcW w:w="1472" w:type="dxa"/>
+            <w:tcBorders>
+              <w:left w:val="single" w:sz="4" w:space="0" w:color="000000"/>
+              <w:bottom w:val="single" w:sz="4" w:space="0" w:color="000000"/>
+            </w:tcBorders>
+          </w:tcPr>
+          <w:p>
+            <w:pPr>
+              <w:pStyle w:val="Contenidodelatabla"/>
+              <w:spacing w:lineRule="auto" w:line="240"/>
+              <w:jc w:val="center"/>
+              <w:rPr/>
+            </w:pPr>
+            <w:r>
+              <w:rPr>
+                <w:b/>
+                <w:bCs/>
+                <w:caps w:val="false"/>
+                <w:smallCaps w:val="false"/>
+                <w:color w:val="auto"/>
+                <w:spacing w:val="0"/>
+              </w:rPr>
+              <w:t>—</w:t>
+            </w:r>
+          </w:p>
+        </w:tc>
+        <w:tc>
+          <w:tcPr>
+            <w:tcW w:w="1424" w:type="dxa"/>
+            <w:tcBorders>
+              <w:left w:val="single" w:sz="4" w:space="0" w:color="000000"/>
+              <w:bottom w:val="single" w:sz="4" w:space="0" w:color="000000"/>
+              <w:right w:val="single" w:sz="4" w:space="0" w:color="000000"/>
+            </w:tcBorders>
+            <w:shd w:fill="98FB98" w:val="clear"/>
+          </w:tcPr>
+          <w:p>
+            <w:pPr>
+              <w:pStyle w:val="Contenidodelatabla"/>
+              <w:spacing w:lineRule="auto" w:line="240"/>
+              <w:jc w:val="center"/>
+              <w:rPr>
+                <w:b/>
+                <w:bCs/>
+              </w:rPr>
+            </w:pPr>
+            <w:r>
+              <w:rPr>
+                <w:b/>
+                <w:bCs/>
+                <w:caps w:val="false"/>
+                <w:smallCaps w:val="false"/>
+                <w:color w:val="0F6E56"/>
+                <w:spacing w:val="0"/>
+              </w:rPr>
+              <w:t>✓</w:t>
+            </w:r>
+          </w:p>
+        </w:tc>
+      </w:tr>
+    </w:tbl>
     <w:p>
       <w:pPr>
         <w:pStyle w:val="Normal"/>
@@ -7945,7 +10440,7 @@
     <w:r>
       <w:rPr/>
       <w:drawing>
-        <wp:anchor behindDoc="0" distT="0" distB="0" distL="0" distR="0" simplePos="0" locked="0" layoutInCell="0" allowOverlap="1" relativeHeight="3">
+        <wp:anchor behindDoc="1" distT="0" distB="0" distL="0" distR="0" simplePos="0" locked="0" layoutInCell="0" allowOverlap="1" relativeHeight="3">
           <wp:simplePos x="0" y="0"/>
           <wp:positionH relativeFrom="column">
             <wp:posOffset>-914400</wp:posOffset>
@@ -8004,7 +10499,7 @@
     <w:r>
       <w:rPr/>
       <w:drawing>
-        <wp:anchor behindDoc="0" distT="0" distB="0" distL="0" distR="0" simplePos="0" locked="0" layoutInCell="0" allowOverlap="1" relativeHeight="9">
+        <wp:anchor behindDoc="1" distT="0" distB="0" distL="0" distR="0" simplePos="0" locked="0" layoutInCell="0" allowOverlap="1" relativeHeight="9">
           <wp:simplePos x="0" y="0"/>
           <wp:positionH relativeFrom="column">
             <wp:posOffset>-914400</wp:posOffset>
@@ -8069,7 +10564,7 @@
     <w:r>
       <w:rPr/>
       <w:drawing>
-        <wp:anchor behindDoc="0" distT="0" distB="0" distL="0" distR="0" simplePos="0" locked="0" layoutInCell="0" allowOverlap="1" relativeHeight="33">
+        <wp:anchor behindDoc="1" distT="0" distB="0" distL="0" distR="0" simplePos="0" locked="0" layoutInCell="0" allowOverlap="1" relativeHeight="35">
           <wp:simplePos x="0" y="0"/>
           <wp:positionH relativeFrom="column">
             <wp:posOffset>-914400</wp:posOffset>
@@ -8134,7 +10629,7 @@
     <w:r>
       <w:rPr/>
       <w:drawing>
-        <wp:anchor behindDoc="0" distT="0" distB="0" distL="0" distR="0" simplePos="0" locked="0" layoutInCell="0" allowOverlap="1" relativeHeight="2">
+        <wp:anchor behindDoc="1" distT="0" distB="0" distL="0" distR="0" simplePos="0" locked="0" layoutInCell="0" allowOverlap="1" relativeHeight="2">
           <wp:simplePos x="0" y="0"/>
           <wp:positionH relativeFrom="column">
             <wp:posOffset>-918845</wp:posOffset>
@@ -8193,7 +10688,7 @@
     <w:r>
       <w:rPr/>
       <w:drawing>
-        <wp:anchor behindDoc="0" distT="0" distB="0" distL="0" distR="0" simplePos="0" locked="0" layoutInCell="0" allowOverlap="1" relativeHeight="6">
+        <wp:anchor behindDoc="1" distT="0" distB="0" distL="0" distR="0" simplePos="0" locked="0" layoutInCell="0" allowOverlap="1" relativeHeight="6">
           <wp:simplePos x="0" y="0"/>
           <wp:positionH relativeFrom="column">
             <wp:posOffset>-918845</wp:posOffset>
@@ -8258,7 +10753,7 @@
     <w:r>
       <w:rPr/>
       <w:drawing>
-        <wp:anchor behindDoc="0" distT="0" distB="0" distL="0" distR="0" simplePos="0" locked="0" layoutInCell="0" allowOverlap="1" relativeHeight="21">
+        <wp:anchor behindDoc="1" distT="0" distB="0" distL="0" distR="0" simplePos="0" locked="0" layoutInCell="0" allowOverlap="1" relativeHeight="22">
           <wp:simplePos x="0" y="0"/>
           <wp:positionH relativeFrom="column">
             <wp:posOffset>-918845</wp:posOffset>

</xml_diff>